<commit_message>
Update backtest data documentation and validation UI
</commit_message>
<xml_diff>
--- a/Abgabe-Files/Abgabedokumente/Modellannahmen.docx
+++ b/Abgabe-Files/Abgabedokumente/Modellannahmen.docx
@@ -2210,7 +2210,7 @@
           <w:i w:val="0"/>
           <w:sz w:val="21"/>
         </w:rPr>
-        <w:t>10 Banken × FY2021–FY2024, 252 Datenpunkte</w:t>
+        <w:t>10 Banken × FY2021–FY2024, 255 quellenbelegte Datenpunkte</w:t>
       </w:r>
       <w:r>
         <w:rPr>
@@ -2226,7 +2226,7 @@
           <w:i w:val="0"/>
           <w:sz w:val="21"/>
         </w:rPr>
-        <w:t>98 % Abdeckung relativ zum bank-eigenen Meldeumfang</w:t>
+        <w:t>99,6 % Abdeckung relativ zum bank-eigenen Meldeumfang</w:t>
       </w:r>
       <w:r>
         <w:rPr>
@@ -2234,7 +2234,7 @@
           <w:i w:val="0"/>
           <w:sz w:val="21"/>
         </w:rPr>
-        <w:t xml:space="preserve"> (252 von 256 gemeldeten Zellen) — Klassen, die eine Bank gar nicht im A-IRB führt, zählen nicht als Lücke. Geschlossen wurden die Lücken über die Vorjahres-Vergleichsspalten der Folgejahres-Berichte und über Block-Anker-Matching im Quell-PDF; jede Zelle ist wort-wörtlich mit Seitenbeleg erfasst. Die vier verbleibenden Zellen sind endgültige Quellgrenzen (z. B. druckt Société Générale für Sovereign 2022 wörtliche „0“-Platzhalter) und werden </w:t>
+        <w:t xml:space="preserve"> (255 von 256 gemeldeten Zellen) - Klassen, die eine Bank gar nicht im A-IRB führt, zählen nicht als Lücke. Davon sind </w:t>
       </w:r>
       <w:r>
         <w:rPr>
@@ -2242,7 +2242,7 @@
           <w:i w:val="0"/>
           <w:sz w:val="21"/>
         </w:rPr>
-        <w:t>nicht</w:t>
+        <w:t>253 Zeilen modellfähig</w:t>
       </w:r>
       <w:r>
         <w:rPr>
@@ -2250,7 +2250,7 @@
           <w:i w:val="0"/>
           <w:sz w:val="21"/>
         </w:rPr>
-        <w:t xml:space="preserve"> mit geschätzten Werten gefüllt.</w:t>
+        <w:t>; zwei quellenbelegte Sonderfälle bleiben für Audit und Abdeckung sichtbar, werden aber wegen Quellen-/Perimeterproblemen nicht in die Modellrechnung eingespeist (`include_in_backtest = 0`). Die einzige verbleibende Quellgrenze ist Credit Mutuel Corporate 2021: kein Wert wird aus RWA oder Nachbarjahren abgeleitet.</w:t>
       </w:r>
     </w:p>
     <w:p>
@@ -2714,7 +2714,7 @@
                 <w:b w:val="0"/>
                 <w:sz w:val="17"/>
               </w:rPr>
-              <w:t>eigene Pillar-3-Roh-Reihe, 10 Banken × FY2021–2024 (252 Punkte, 98 %), strikt no-look-ahead</w:t>
+              <w:t>eigene Pillar-3-Roh-Reihe, 10 Banken × FY2021–2024 (255 Quellenzeilen, 253 modellfähig), strikt no-look-ahead</w:t>
             </w:r>
           </w:p>
         </w:tc>
@@ -3559,7 +3559,7 @@
           <w:i w:val="0"/>
           <w:sz w:val="19"/>
         </w:rPr>
-        <w:t xml:space="preserve"> Eigene Roh-Reihe über 10 Banken × FY2021–FY2024 (252 Punkte); ein Quartal im Jahr Y nutzt ausschließlich den Stichtag 31.12.(Y−1) — den jüngsten, der damals publiziert war. </w:t>
+        <w:t xml:space="preserve"> Eigene Roh-Reihe über 10 Banken × FY2021–FY2024 (255 quellenbelegte Zeilen, davon 253 modellfähig); ein Quartal im Jahr Y nutzt ausschließlich den Stichtag 31.12.(Y−1) — den jüngsten, der damals publiziert war. </w:t>
       </w:r>
       <w:r>
         <w:rPr>

</xml_diff>

<commit_message>
Polish IRB terminology in reader-facing model
</commit_message>
<xml_diff>
--- a/Abgabe-Files/Abgabedokumente/Modellannahmen.docx
+++ b/Abgabe-Files/Abgabedokumente/Modellannahmen.docx
@@ -2058,7 +2058,7 @@
           <w:i w:val="0"/>
           <w:sz w:val="21"/>
         </w:rPr>
-        <w:t xml:space="preserve">Dabei ist ρ die Basel-Asset-Korrelation je Klasse (Corporates PD-abhängig 12–24 %, Hypotheken 15 %, QRRE 4 %), MA das Laufzeit-Adjustment und N die Standardnormalverteilung. Die theoretische Fundierung des ASRF-Rahmens liefern Vasicek (1991, 2002) und Gordy (2003). Der </w:t>
+        <w:t xml:space="preserve">Dabei ist ρ der regulatorische IRB-Klassenparameter nach CRR Art. 153/154, MA das Laufzeit-Adjustment und N die Standardnormalverteilung. Die theoretische Fundierung des ASRF-Rahmens liefern Vasicek (1991, 2002) und Gordy (2003). Der </w:t>
       </w:r>
       <w:r>
         <w:rPr>
@@ -2945,7 +2945,7 @@
                 <w:b w:val="0"/>
                 <w:sz w:val="17"/>
               </w:rPr>
-              <w:t>Basel-III-IRB (Vasicek/ASRF), α = 99,9 %, Basel-ρ je Klasse, Laufzeit-Adjustment</w:t>
+              <w:t>Basel-III-IRB (Vasicek/ASRF), α = 99,9 %, regulatorische Klassenparameter, Laufzeit-Adjustment</w:t>
             </w:r>
           </w:p>
         </w:tc>
@@ -3790,7 +3790,7 @@
           <w:i w:val="0"/>
           <w:sz w:val="19"/>
         </w:rPr>
-        <w:t xml:space="preserve"> Die unveränderte regulatorische Formel mit α = 99,9 %, Basel-Asset-Korrelationen je Klasse und Laufzeit-Adjustment. </w:t>
+        <w:t xml:space="preserve"> Die unveränderte regulatorische Formel mit α = 99,9 %, CRR-Klassenparametern und Laufzeit-Adjustment. </w:t>
       </w:r>
       <w:r>
         <w:rPr>
@@ -4906,7 +4906,7 @@
           <w:b w:val="0"/>
           <w:sz w:val="21"/>
         </w:rPr>
-        <w:t>BCBS (2017). Basel III: Finalising post-crisis reforms. Basel Committee on Banking Supervision, §272–284 (IRB-Kapitalformel, Asset-Korrelationen).</w:t>
+        <w:t>BCBS (2017). Basel III: Finalising post-crisis reforms. Basel Committee on Banking Supervision, §272–284 (IRB-Kapitalformel).</w:t>
       </w:r>
     </w:p>
     <w:p>

</xml_diff>

<commit_message>
Clarify IRB rho parameter in model assumptions
</commit_message>
<xml_diff>
--- a/Abgabe-Files/Abgabedokumente/Modellannahmen.docx
+++ b/Abgabe-Files/Abgabedokumente/Modellannahmen.docx
@@ -2045,6 +2045,20 @@
           <w:color w:val="034B6F"/>
           <w:sz w:val="20"/>
         </w:rPr>
+        <w:t>Öl-/Zinsschock → PD_stress, LGD_stress → Basel-IRB-K-Formel → RWA → CET1</w:t>
+      </w:r>
+    </w:p>
+    <w:p>
+      <w:pPr>
+        <w:spacing w:after="140"/>
+      </w:pPr>
+      <w:r>
+        <w:rPr>
+          <w:b w:val="0"/>
+          <w:i w:val="0"/>
+          <w:color w:val="034B6F"/>
+          <w:sz w:val="20"/>
+        </w:rPr>
         <w:t>K = [ LGD · N( (N⁻¹(PD) + √ρ · N⁻¹(0,999)) / √(1−ρ) ) − PD · LGD ] · MA      →      RWA = K · 12,5 · EAD</w:t>
       </w:r>
     </w:p>
@@ -3790,7 +3804,7 @@
           <w:i w:val="0"/>
           <w:sz w:val="19"/>
         </w:rPr>
-        <w:t xml:space="preserve"> Die unveränderte regulatorische Formel mit α = 99,9 %, CRR-Klassenparametern und Laufzeit-Adjustment. </w:t>
+        <w:t xml:space="preserve"> Die unveränderte regulatorische Formel mit α = 99,9 %, CRR-Klassenparametern und Laufzeit-Adjustment. Prozessual: Öl-/Zinsschock → PD_stress/LGD_stress → Basel-IRB-K-Formel → RWA → CET1. Der Parameter ρ ist dabei kein eigener Modellschritt und keine von uns geschätzte Annahme, sondern der durch CRR Art. 153/154 vorgegebene Klassenparameter innerhalb der Formel. </w:t>
       </w:r>
       <w:r>
         <w:rPr>

</xml_diff>

<commit_message>
Enhance model assumptions documentation
</commit_message>
<xml_diff>
--- a/Abgabe-Files/Abgabedokumente/Modellannahmen.docx
+++ b/Abgabe-Files/Abgabedokumente/Modellannahmen.docx
@@ -40,7 +40,7 @@
           <w:color w:val="6E6E6E"/>
           <w:sz w:val="19"/>
         </w:rPr>
-        <w:t>Kuratierte Abgabefassung · Stand 07.07.2026</w:t>
+        <w:t>Kuratierte Abgabefassung · Stand 08.07.2026</w:t>
         <w:br/>
         <w:t>Technische Referenz: Modellarchitektur/docs/MODEL_ASSUMPTIONS.md (V2.1)</w:t>
       </w:r>
@@ -63,9 +63,1692 @@
     <w:p>
       <w:fldSimple w:instr="TOC \o &quot;1-2&quot; \h \z \u">
         <w:r>
-          <w:t>Inhaltsverzeichnis: Rechtsklick → Felder aktualisieren (F9).</w:t>
+          <w:t>Das Inhaltsverzeichnis wird beim Öffnen in Word automatisch aufgebaut (Feld-Aktualisierung ist im Dokument hinterlegt).</w:t>
         </w:r>
       </w:fldSimple>
+    </w:p>
+    <w:p>
+      <w:r>
+        <w:br w:type="page"/>
+      </w:r>
+    </w:p>
+    <w:p>
+      <w:pPr>
+        <w:pStyle w:val="Heading1"/>
+      </w:pPr>
+      <w:r>
+        <w:t>Abkürzungen und Symbole</w:t>
+      </w:r>
+    </w:p>
+    <w:p>
+      <w:pPr>
+        <w:spacing w:after="140"/>
+      </w:pPr>
+      <w:r>
+        <w:rPr>
+          <w:b w:val="0"/>
+          <w:i w:val="0"/>
+          <w:sz w:val="21"/>
+        </w:rPr>
+        <w:t>Kurzreferenz für die kritische Durchsicht — jede Abkürzung wird zusätzlich bei ihrem ersten inhaltlichen Auftreten im Text erläutert.</w:t>
+      </w:r>
+    </w:p>
+    <w:p>
+      <w:pPr>
+        <w:pStyle w:val="Heading2"/>
+      </w:pPr>
+      <w:r>
+        <w:t>Abkürzungen</w:t>
+      </w:r>
+    </w:p>
+    <w:tbl>
+      <w:tblPr>
+        <w:tblStyle w:val="TableGrid"/>
+        <w:tblW w:type="auto" w:w="0"/>
+        <w:jc w:val="center"/>
+        <w:tblLook w:firstColumn="1" w:firstRow="1" w:lastColumn="0" w:lastRow="0" w:noHBand="0" w:noVBand="1" w:val="04A0"/>
+      </w:tblPr>
+      <w:tblGrid>
+        <w:gridCol w:w="4706"/>
+        <w:gridCol w:w="4706"/>
+      </w:tblGrid>
+      <w:tr>
+        <w:tc>
+          <w:tcPr>
+            <w:tcW w:type="dxa" w:w="1600"/>
+            <w:shd w:val="clear" w:fill="D9E4EC"/>
+          </w:tcPr>
+          <w:p>
+            <w:r/>
+            <w:r>
+              <w:rPr>
+                <w:b/>
+                <w:sz w:val="17"/>
+              </w:rPr>
+              <w:t>Abkürzung</w:t>
+            </w:r>
+          </w:p>
+        </w:tc>
+        <w:tc>
+          <w:tcPr>
+            <w:tcW w:type="dxa" w:w="7811"/>
+            <w:shd w:val="clear" w:fill="D9E4EC"/>
+          </w:tcPr>
+          <w:p>
+            <w:r/>
+            <w:r>
+              <w:rPr>
+                <w:b/>
+                <w:sz w:val="17"/>
+              </w:rPr>
+              <w:t>Bedeutung</w:t>
+            </w:r>
+          </w:p>
+        </w:tc>
+      </w:tr>
+      <w:tr>
+        <w:tc>
+          <w:tcPr>
+            <w:tcW w:type="dxa" w:w="1600"/>
+          </w:tcPr>
+          <w:p>
+            <w:r/>
+            <w:r>
+              <w:rPr>
+                <w:b w:val="0"/>
+                <w:sz w:val="17"/>
+              </w:rPr>
+              <w:t>A-IRB / F-IRB</w:t>
+            </w:r>
+          </w:p>
+        </w:tc>
+        <w:tc>
+          <w:tcPr>
+            <w:tcW w:type="dxa" w:w="7811"/>
+          </w:tcPr>
+          <w:p>
+            <w:r/>
+            <w:r>
+              <w:rPr>
+                <w:b w:val="0"/>
+                <w:sz w:val="17"/>
+              </w:rPr>
+              <w:t>Advanced / Foundation Internal Ratings-Based — im A-IRB schätzt die Bank PD und LGD selbst, im F-IRB nur die PD (LGD regulatorisch, z. B. 45 % für unbesicherte Senior-Forderungen)</w:t>
+            </w:r>
+          </w:p>
+        </w:tc>
+      </w:tr>
+      <w:tr>
+        <w:tc>
+          <w:tcPr>
+            <w:tcW w:type="dxa" w:w="1600"/>
+          </w:tcPr>
+          <w:p>
+            <w:r/>
+            <w:r>
+              <w:rPr>
+                <w:b w:val="0"/>
+                <w:sz w:val="17"/>
+              </w:rPr>
+              <w:t>AC</w:t>
+            </w:r>
+          </w:p>
+        </w:tc>
+        <w:tc>
+          <w:tcPr>
+            <w:tcW w:type="dxa" w:w="7811"/>
+          </w:tcPr>
+          <w:p>
+            <w:r/>
+            <w:r>
+              <w:rPr>
+                <w:b w:val="0"/>
+                <w:sz w:val="17"/>
+              </w:rPr>
+              <w:t>Amortised Cost — zu fortgeführten Anschaffungskosten bilanziert; kein laufender Marktwert-Effekt im Eigenkapital</w:t>
+            </w:r>
+          </w:p>
+        </w:tc>
+      </w:tr>
+      <w:tr>
+        <w:tc>
+          <w:tcPr>
+            <w:tcW w:type="dxa" w:w="1600"/>
+          </w:tcPr>
+          <w:p>
+            <w:r/>
+            <w:r>
+              <w:rPr>
+                <w:b w:val="0"/>
+                <w:sz w:val="17"/>
+              </w:rPr>
+              <w:t>ASRF</w:t>
+            </w:r>
+          </w:p>
+        </w:tc>
+        <w:tc>
+          <w:tcPr>
+            <w:tcW w:type="dxa" w:w="7811"/>
+          </w:tcPr>
+          <w:p>
+            <w:r/>
+            <w:r>
+              <w:rPr>
+                <w:b w:val="0"/>
+                <w:sz w:val="17"/>
+              </w:rPr>
+              <w:t>Asymptotic Single Risk Factor — Portfoliomodell hinter der Basel-IRB-Formel (Vasicek/Gordy)</w:t>
+            </w:r>
+          </w:p>
+        </w:tc>
+      </w:tr>
+      <w:tr>
+        <w:tc>
+          <w:tcPr>
+            <w:tcW w:type="dxa" w:w="1600"/>
+          </w:tcPr>
+          <w:p>
+            <w:r/>
+            <w:r>
+              <w:rPr>
+                <w:b w:val="0"/>
+                <w:sz w:val="17"/>
+              </w:rPr>
+              <w:t>bp</w:t>
+            </w:r>
+          </w:p>
+        </w:tc>
+        <w:tc>
+          <w:tcPr>
+            <w:tcW w:type="dxa" w:w="7811"/>
+          </w:tcPr>
+          <w:p>
+            <w:r/>
+            <w:r>
+              <w:rPr>
+                <w:b w:val="0"/>
+                <w:sz w:val="17"/>
+              </w:rPr>
+              <w:t>Basispunkt = 0,01 Prozentpunkte</w:t>
+            </w:r>
+          </w:p>
+        </w:tc>
+      </w:tr>
+      <w:tr>
+        <w:tc>
+          <w:tcPr>
+            <w:tcW w:type="dxa" w:w="1600"/>
+          </w:tcPr>
+          <w:p>
+            <w:r/>
+            <w:r>
+              <w:rPr>
+                <w:b w:val="0"/>
+                <w:sz w:val="17"/>
+              </w:rPr>
+              <w:t>CCF</w:t>
+            </w:r>
+          </w:p>
+        </w:tc>
+        <w:tc>
+          <w:tcPr>
+            <w:tcW w:type="dxa" w:w="7811"/>
+          </w:tcPr>
+          <w:p>
+            <w:r/>
+            <w:r>
+              <w:rPr>
+                <w:b w:val="0"/>
+                <w:sz w:val="17"/>
+              </w:rPr>
+              <w:t>Credit Conversion Factor — Umrechnungsfaktor für außerbilanzielle Kreditzusagen in EAD</w:t>
+            </w:r>
+          </w:p>
+        </w:tc>
+      </w:tr>
+      <w:tr>
+        <w:tc>
+          <w:tcPr>
+            <w:tcW w:type="dxa" w:w="1600"/>
+          </w:tcPr>
+          <w:p>
+            <w:r/>
+            <w:r>
+              <w:rPr>
+                <w:b w:val="0"/>
+                <w:sz w:val="17"/>
+              </w:rPr>
+              <w:t>CET1</w:t>
+            </w:r>
+          </w:p>
+        </w:tc>
+        <w:tc>
+          <w:tcPr>
+            <w:tcW w:type="dxa" w:w="7811"/>
+          </w:tcPr>
+          <w:p>
+            <w:r/>
+            <w:r>
+              <w:rPr>
+                <w:b w:val="0"/>
+                <w:sz w:val="17"/>
+              </w:rPr>
+              <w:t>Common Equity Tier 1 — hartes Kernkapital; die CET1-Quote (CET1 ÷ RWA) ist die Zielgröße des Modells</w:t>
+            </w:r>
+          </w:p>
+        </w:tc>
+      </w:tr>
+      <w:tr>
+        <w:tc>
+          <w:tcPr>
+            <w:tcW w:type="dxa" w:w="1600"/>
+          </w:tcPr>
+          <w:p>
+            <w:r/>
+            <w:r>
+              <w:rPr>
+                <w:b w:val="0"/>
+                <w:sz w:val="17"/>
+              </w:rPr>
+              <w:t>CRR</w:t>
+            </w:r>
+          </w:p>
+        </w:tc>
+        <w:tc>
+          <w:tcPr>
+            <w:tcW w:type="dxa" w:w="7811"/>
+          </w:tcPr>
+          <w:p>
+            <w:r/>
+            <w:r>
+              <w:rPr>
+                <w:b w:val="0"/>
+                <w:sz w:val="17"/>
+              </w:rPr>
+              <w:t>Capital Requirements Regulation — Verordnung (EU) Nr. 575/2013</w:t>
+            </w:r>
+          </w:p>
+        </w:tc>
+      </w:tr>
+      <w:tr>
+        <w:tc>
+          <w:tcPr>
+            <w:tcW w:type="dxa" w:w="1600"/>
+          </w:tcPr>
+          <w:p>
+            <w:r/>
+            <w:r>
+              <w:rPr>
+                <w:b w:val="0"/>
+                <w:sz w:val="17"/>
+              </w:rPr>
+              <w:t>EAD</w:t>
+            </w:r>
+          </w:p>
+        </w:tc>
+        <w:tc>
+          <w:tcPr>
+            <w:tcW w:type="dxa" w:w="7811"/>
+          </w:tcPr>
+          <w:p>
+            <w:r/>
+            <w:r>
+              <w:rPr>
+                <w:b w:val="0"/>
+                <w:sz w:val="17"/>
+              </w:rPr>
+              <w:t>Exposure at Default — Forderungshöhe bei Ausfall (post-CCF)</w:t>
+            </w:r>
+          </w:p>
+        </w:tc>
+      </w:tr>
+      <w:tr>
+        <w:tc>
+          <w:tcPr>
+            <w:tcW w:type="dxa" w:w="1600"/>
+          </w:tcPr>
+          <w:p>
+            <w:r/>
+            <w:r>
+              <w:rPr>
+                <w:b w:val="0"/>
+                <w:sz w:val="17"/>
+              </w:rPr>
+              <w:t>EBA</w:t>
+            </w:r>
+          </w:p>
+        </w:tc>
+        <w:tc>
+          <w:tcPr>
+            <w:tcW w:type="dxa" w:w="7811"/>
+          </w:tcPr>
+          <w:p>
+            <w:r/>
+            <w:r>
+              <w:rPr>
+                <w:b w:val="0"/>
+                <w:sz w:val="17"/>
+              </w:rPr>
+              <w:t>European Banking Authority — EU-Bankenaufsichtsbehörde</w:t>
+            </w:r>
+          </w:p>
+        </w:tc>
+      </w:tr>
+      <w:tr>
+        <w:tc>
+          <w:tcPr>
+            <w:tcW w:type="dxa" w:w="1600"/>
+          </w:tcPr>
+          <w:p>
+            <w:r/>
+            <w:r>
+              <w:rPr>
+                <w:b w:val="0"/>
+                <w:sz w:val="17"/>
+              </w:rPr>
+              <w:t>EL</w:t>
+            </w:r>
+          </w:p>
+        </w:tc>
+        <w:tc>
+          <w:tcPr>
+            <w:tcW w:type="dxa" w:w="7811"/>
+          </w:tcPr>
+          <w:p>
+            <w:r/>
+            <w:r>
+              <w:rPr>
+                <w:b w:val="0"/>
+                <w:sz w:val="17"/>
+              </w:rPr>
+              <w:t>Expected Loss — erwarteter Verlust = PD · LGD · EAD</w:t>
+            </w:r>
+          </w:p>
+        </w:tc>
+      </w:tr>
+      <w:tr>
+        <w:tc>
+          <w:tcPr>
+            <w:tcW w:type="dxa" w:w="1600"/>
+          </w:tcPr>
+          <w:p>
+            <w:r/>
+            <w:r>
+              <w:rPr>
+                <w:b w:val="0"/>
+                <w:sz w:val="17"/>
+              </w:rPr>
+              <w:t>EU CR6</w:t>
+            </w:r>
+          </w:p>
+        </w:tc>
+        <w:tc>
+          <w:tcPr>
+            <w:tcW w:type="dxa" w:w="7811"/>
+          </w:tcPr>
+          <w:p>
+            <w:r/>
+            <w:r>
+              <w:rPr>
+                <w:b w:val="0"/>
+                <w:sz w:val="17"/>
+              </w:rPr>
+              <w:t>Pillar-3-Offenlegungstemplate für IRB-Kreditrisiko (PD/LGD/EAD je Exposure-Klasse; EBA ITS/2020/04)</w:t>
+            </w:r>
+          </w:p>
+        </w:tc>
+      </w:tr>
+      <w:tr>
+        <w:tc>
+          <w:tcPr>
+            <w:tcW w:type="dxa" w:w="1600"/>
+          </w:tcPr>
+          <w:p>
+            <w:r/>
+            <w:r>
+              <w:rPr>
+                <w:b w:val="0"/>
+                <w:sz w:val="17"/>
+              </w:rPr>
+              <w:t>FVOCI</w:t>
+            </w:r>
+          </w:p>
+        </w:tc>
+        <w:tc>
+          <w:tcPr>
+            <w:tcW w:type="dxa" w:w="7811"/>
+          </w:tcPr>
+          <w:p>
+            <w:r/>
+            <w:r>
+              <w:rPr>
+                <w:b w:val="0"/>
+                <w:sz w:val="17"/>
+              </w:rPr>
+              <w:t>Fair Value through Other Comprehensive Income — Marktwertänderungen wirken erfolgsneutral direkt im Eigenkapital (OCI)</w:t>
+            </w:r>
+          </w:p>
+        </w:tc>
+      </w:tr>
+      <w:tr>
+        <w:tc>
+          <w:tcPr>
+            <w:tcW w:type="dxa" w:w="1600"/>
+          </w:tcPr>
+          <w:p>
+            <w:r/>
+            <w:r>
+              <w:rPr>
+                <w:b w:val="0"/>
+                <w:sz w:val="17"/>
+              </w:rPr>
+              <w:t>FVTPL / HfT</w:t>
+            </w:r>
+          </w:p>
+        </w:tc>
+        <w:tc>
+          <w:tcPr>
+            <w:tcW w:type="dxa" w:w="7811"/>
+          </w:tcPr>
+          <w:p>
+            <w:r/>
+            <w:r>
+              <w:rPr>
+                <w:b w:val="0"/>
+                <w:sz w:val="17"/>
+              </w:rPr>
+              <w:t>Fair Value through Profit or Loss / Held for Trading — Marktwertänderungen wirken über die Gewinn- und Verlustrechnung</w:t>
+            </w:r>
+          </w:p>
+        </w:tc>
+      </w:tr>
+      <w:tr>
+        <w:tc>
+          <w:tcPr>
+            <w:tcW w:type="dxa" w:w="1600"/>
+          </w:tcPr>
+          <w:p>
+            <w:r/>
+            <w:r>
+              <w:rPr>
+                <w:b w:val="0"/>
+                <w:sz w:val="17"/>
+              </w:rPr>
+              <w:t>ICAAP</w:t>
+            </w:r>
+          </w:p>
+        </w:tc>
+        <w:tc>
+          <w:tcPr>
+            <w:tcW w:type="dxa" w:w="7811"/>
+          </w:tcPr>
+          <w:p>
+            <w:r/>
+            <w:r>
+              <w:rPr>
+                <w:b w:val="0"/>
+                <w:sz w:val="17"/>
+              </w:rPr>
+              <w:t>Internal Capital Adequacy Assessment Process — bankinterner Kapitaladäquanz-Prozess</w:t>
+            </w:r>
+          </w:p>
+        </w:tc>
+      </w:tr>
+      <w:tr>
+        <w:tc>
+          <w:tcPr>
+            <w:tcW w:type="dxa" w:w="1600"/>
+          </w:tcPr>
+          <w:p>
+            <w:r/>
+            <w:r>
+              <w:rPr>
+                <w:b w:val="0"/>
+                <w:sz w:val="17"/>
+              </w:rPr>
+              <w:t>IRB</w:t>
+            </w:r>
+          </w:p>
+        </w:tc>
+        <w:tc>
+          <w:tcPr>
+            <w:tcW w:type="dxa" w:w="7811"/>
+          </w:tcPr>
+          <w:p>
+            <w:r/>
+            <w:r>
+              <w:rPr>
+                <w:b w:val="0"/>
+                <w:sz w:val="17"/>
+              </w:rPr>
+              <w:t>Internal Ratings-Based Approach — auf internen Ratings basierender Ansatz der Kapitalunterlegung</w:t>
+            </w:r>
+          </w:p>
+        </w:tc>
+      </w:tr>
+      <w:tr>
+        <w:tc>
+          <w:tcPr>
+            <w:tcW w:type="dxa" w:w="1600"/>
+          </w:tcPr>
+          <w:p>
+            <w:r/>
+            <w:r>
+              <w:rPr>
+                <w:b w:val="0"/>
+                <w:sz w:val="17"/>
+              </w:rPr>
+              <w:t>LEI</w:t>
+            </w:r>
+          </w:p>
+        </w:tc>
+        <w:tc>
+          <w:tcPr>
+            <w:tcW w:type="dxa" w:w="7811"/>
+          </w:tcPr>
+          <w:p>
+            <w:r/>
+            <w:r>
+              <w:rPr>
+                <w:b w:val="0"/>
+                <w:sz w:val="17"/>
+              </w:rPr>
+              <w:t>Legal Entity Identifier — eindeutige Kennung je Institut</w:t>
+            </w:r>
+          </w:p>
+        </w:tc>
+      </w:tr>
+      <w:tr>
+        <w:tc>
+          <w:tcPr>
+            <w:tcW w:type="dxa" w:w="1600"/>
+          </w:tcPr>
+          <w:p>
+            <w:r/>
+            <w:r>
+              <w:rPr>
+                <w:b w:val="0"/>
+                <w:sz w:val="17"/>
+              </w:rPr>
+              <w:t>LGD</w:t>
+            </w:r>
+          </w:p>
+        </w:tc>
+        <w:tc>
+          <w:tcPr>
+            <w:tcW w:type="dxa" w:w="7811"/>
+          </w:tcPr>
+          <w:p>
+            <w:r/>
+            <w:r>
+              <w:rPr>
+                <w:b w:val="0"/>
+                <w:sz w:val="17"/>
+              </w:rPr>
+              <w:t>Loss Given Default — Verlustquote bei Ausfall</w:t>
+            </w:r>
+          </w:p>
+        </w:tc>
+      </w:tr>
+      <w:tr>
+        <w:tc>
+          <w:tcPr>
+            <w:tcW w:type="dxa" w:w="1600"/>
+          </w:tcPr>
+          <w:p>
+            <w:r/>
+            <w:r>
+              <w:rPr>
+                <w:b w:val="0"/>
+                <w:sz w:val="17"/>
+              </w:rPr>
+              <w:t>MAE</w:t>
+            </w:r>
+          </w:p>
+        </w:tc>
+        <w:tc>
+          <w:tcPr>
+            <w:tcW w:type="dxa" w:w="7811"/>
+          </w:tcPr>
+          <w:p>
+            <w:r/>
+            <w:r>
+              <w:rPr>
+                <w:b w:val="0"/>
+                <w:sz w:val="17"/>
+              </w:rPr>
+              <w:t>Mean Absolute Error — mittlerer absoluter Prognosefehler</w:t>
+            </w:r>
+          </w:p>
+        </w:tc>
+      </w:tr>
+      <w:tr>
+        <w:tc>
+          <w:tcPr>
+            <w:tcW w:type="dxa" w:w="1600"/>
+          </w:tcPr>
+          <w:p>
+            <w:r/>
+            <w:r>
+              <w:rPr>
+                <w:b w:val="0"/>
+                <w:sz w:val="17"/>
+              </w:rPr>
+              <w:t>MtM</w:t>
+            </w:r>
+          </w:p>
+        </w:tc>
+        <w:tc>
+          <w:tcPr>
+            <w:tcW w:type="dxa" w:w="7811"/>
+          </w:tcPr>
+          <w:p>
+            <w:r/>
+            <w:r>
+              <w:rPr>
+                <w:b w:val="0"/>
+                <w:sz w:val="17"/>
+              </w:rPr>
+              <w:t>Mark-to-Market — Bewertung zum aktuellen Marktwert</w:t>
+            </w:r>
+          </w:p>
+        </w:tc>
+      </w:tr>
+      <w:tr>
+        <w:tc>
+          <w:tcPr>
+            <w:tcW w:type="dxa" w:w="1600"/>
+          </w:tcPr>
+          <w:p>
+            <w:r/>
+            <w:r>
+              <w:rPr>
+                <w:b w:val="0"/>
+                <w:sz w:val="17"/>
+              </w:rPr>
+              <w:t>NII / NIM</w:t>
+            </w:r>
+          </w:p>
+        </w:tc>
+        <w:tc>
+          <w:tcPr>
+            <w:tcW w:type="dxa" w:w="7811"/>
+          </w:tcPr>
+          <w:p>
+            <w:r/>
+            <w:r>
+              <w:rPr>
+                <w:b w:val="0"/>
+                <w:sz w:val="17"/>
+              </w:rPr>
+              <w:t>Net Interest Income / Margin — Zinsüberschuss bzw. Zinsmarge einer Bank</w:t>
+            </w:r>
+          </w:p>
+        </w:tc>
+      </w:tr>
+      <w:tr>
+        <w:tc>
+          <w:tcPr>
+            <w:tcW w:type="dxa" w:w="1600"/>
+          </w:tcPr>
+          <w:p>
+            <w:r/>
+            <w:r>
+              <w:rPr>
+                <w:b w:val="0"/>
+                <w:sz w:val="17"/>
+              </w:rPr>
+              <w:t>OCI</w:t>
+            </w:r>
+          </w:p>
+        </w:tc>
+        <w:tc>
+          <w:tcPr>
+            <w:tcW w:type="dxa" w:w="7811"/>
+          </w:tcPr>
+          <w:p>
+            <w:r/>
+            <w:r>
+              <w:rPr>
+                <w:b w:val="0"/>
+                <w:sz w:val="17"/>
+              </w:rPr>
+              <w:t>Other Comprehensive Income — erfolgsneutrales Eigenkapital (sonstiges Ergebnis)</w:t>
+            </w:r>
+          </w:p>
+        </w:tc>
+      </w:tr>
+      <w:tr>
+        <w:tc>
+          <w:tcPr>
+            <w:tcW w:type="dxa" w:w="1600"/>
+          </w:tcPr>
+          <w:p>
+            <w:r/>
+            <w:r>
+              <w:rPr>
+                <w:b w:val="0"/>
+                <w:sz w:val="17"/>
+              </w:rPr>
+              <w:t>PD</w:t>
+            </w:r>
+          </w:p>
+        </w:tc>
+        <w:tc>
+          <w:tcPr>
+            <w:tcW w:type="dxa" w:w="7811"/>
+          </w:tcPr>
+          <w:p>
+            <w:r/>
+            <w:r>
+              <w:rPr>
+                <w:b w:val="0"/>
+                <w:sz w:val="17"/>
+              </w:rPr>
+              <w:t>Probability of Default — 1-Jahres-Ausfallwahrscheinlichkeit (CRR Art. 180)</w:t>
+            </w:r>
+          </w:p>
+        </w:tc>
+      </w:tr>
+      <w:tr>
+        <w:tc>
+          <w:tcPr>
+            <w:tcW w:type="dxa" w:w="1600"/>
+          </w:tcPr>
+          <w:p>
+            <w:r/>
+            <w:r>
+              <w:rPr>
+                <w:b w:val="0"/>
+                <w:sz w:val="17"/>
+              </w:rPr>
+              <w:t>PIT / TTC</w:t>
+            </w:r>
+          </w:p>
+        </w:tc>
+        <w:tc>
+          <w:tcPr>
+            <w:tcW w:type="dxa" w:w="7811"/>
+          </w:tcPr>
+          <w:p>
+            <w:r/>
+            <w:r>
+              <w:rPr>
+                <w:b w:val="0"/>
+                <w:sz w:val="17"/>
+              </w:rPr>
+              <w:t>Point-in-Time / Through-the-Cycle — stichtagsbezogene vs. über den Zyklus geglättete Risikomessung</w:t>
+            </w:r>
+          </w:p>
+        </w:tc>
+      </w:tr>
+      <w:tr>
+        <w:tc>
+          <w:tcPr>
+            <w:tcW w:type="dxa" w:w="1600"/>
+          </w:tcPr>
+          <w:p>
+            <w:r/>
+            <w:r>
+              <w:rPr>
+                <w:b w:val="0"/>
+                <w:sz w:val="17"/>
+              </w:rPr>
+              <w:t>pp</w:t>
+            </w:r>
+          </w:p>
+        </w:tc>
+        <w:tc>
+          <w:tcPr>
+            <w:tcW w:type="dxa" w:w="7811"/>
+          </w:tcPr>
+          <w:p>
+            <w:r/>
+            <w:r>
+              <w:rPr>
+                <w:b w:val="0"/>
+                <w:sz w:val="17"/>
+              </w:rPr>
+              <w:t>Prozentpunkte</w:t>
+            </w:r>
+          </w:p>
+        </w:tc>
+      </w:tr>
+      <w:tr>
+        <w:tc>
+          <w:tcPr>
+            <w:tcW w:type="dxa" w:w="1600"/>
+          </w:tcPr>
+          <w:p>
+            <w:r/>
+            <w:r>
+              <w:rPr>
+                <w:b w:val="0"/>
+                <w:sz w:val="17"/>
+              </w:rPr>
+              <w:t>QRRE</w:t>
+            </w:r>
+          </w:p>
+        </w:tc>
+        <w:tc>
+          <w:tcPr>
+            <w:tcW w:type="dxa" w:w="7811"/>
+          </w:tcPr>
+          <w:p>
+            <w:r/>
+            <w:r>
+              <w:rPr>
+                <w:b w:val="0"/>
+                <w:sz w:val="17"/>
+              </w:rPr>
+              <w:t>Qualifying Revolving Retail Exposures — revolvierende Konsumentenkredite (z. B. Kreditkarten)</w:t>
+            </w:r>
+          </w:p>
+        </w:tc>
+      </w:tr>
+      <w:tr>
+        <w:tc>
+          <w:tcPr>
+            <w:tcW w:type="dxa" w:w="1600"/>
+          </w:tcPr>
+          <w:p>
+            <w:r/>
+            <w:r>
+              <w:rPr>
+                <w:b w:val="0"/>
+                <w:sz w:val="17"/>
+              </w:rPr>
+              <w:t>RWA</w:t>
+            </w:r>
+          </w:p>
+        </w:tc>
+        <w:tc>
+          <w:tcPr>
+            <w:tcW w:type="dxa" w:w="7811"/>
+          </w:tcPr>
+          <w:p>
+            <w:r/>
+            <w:r>
+              <w:rPr>
+                <w:b w:val="0"/>
+                <w:sz w:val="17"/>
+              </w:rPr>
+              <w:t>Risk-Weighted Assets — risikogewichtete Aktiva; Nenner der CET1-Quote</w:t>
+            </w:r>
+          </w:p>
+        </w:tc>
+      </w:tr>
+      <w:tr>
+        <w:tc>
+          <w:tcPr>
+            <w:tcW w:type="dxa" w:w="1600"/>
+          </w:tcPr>
+          <w:p>
+            <w:r/>
+            <w:r>
+              <w:rPr>
+                <w:b w:val="0"/>
+                <w:sz w:val="17"/>
+              </w:rPr>
+              <w:t>SREP</w:t>
+            </w:r>
+          </w:p>
+        </w:tc>
+        <w:tc>
+          <w:tcPr>
+            <w:tcW w:type="dxa" w:w="7811"/>
+          </w:tcPr>
+          <w:p>
+            <w:r/>
+            <w:r>
+              <w:rPr>
+                <w:b w:val="0"/>
+                <w:sz w:val="17"/>
+              </w:rPr>
+              <w:t>Supervisory Review and Evaluation Process — aufsichtlicher Überprüfungsprozess</w:t>
+            </w:r>
+          </w:p>
+        </w:tc>
+      </w:tr>
+    </w:tbl>
+    <w:p>
+      <w:pPr>
+        <w:spacing w:after="80"/>
+      </w:pPr>
+    </w:p>
+    <w:p>
+      <w:pPr>
+        <w:pStyle w:val="Heading2"/>
+      </w:pPr>
+      <w:r>
+        <w:t>Symbole</w:t>
+      </w:r>
+    </w:p>
+    <w:tbl>
+      <w:tblPr>
+        <w:tblStyle w:val="TableGrid"/>
+        <w:tblW w:type="auto" w:w="0"/>
+        <w:jc w:val="center"/>
+        <w:tblLook w:firstColumn="1" w:firstRow="1" w:lastColumn="0" w:lastRow="0" w:noHBand="0" w:noVBand="1" w:val="04A0"/>
+      </w:tblPr>
+      <w:tblGrid>
+        <w:gridCol w:w="3137"/>
+        <w:gridCol w:w="3137"/>
+        <w:gridCol w:w="3137"/>
+      </w:tblGrid>
+      <w:tr>
+        <w:tc>
+          <w:tcPr>
+            <w:tcW w:type="dxa" w:w="1506"/>
+            <w:shd w:val="clear" w:fill="D9E4EC"/>
+          </w:tcPr>
+          <w:p>
+            <w:r/>
+            <w:r>
+              <w:rPr>
+                <w:b/>
+                <w:sz w:val="17"/>
+              </w:rPr>
+              <w:t>Symbol</w:t>
+            </w:r>
+          </w:p>
+        </w:tc>
+        <w:tc>
+          <w:tcPr>
+            <w:tcW w:type="dxa" w:w="5835"/>
+            <w:shd w:val="clear" w:fill="D9E4EC"/>
+          </w:tcPr>
+          <w:p>
+            <w:r/>
+            <w:r>
+              <w:rPr>
+                <w:b/>
+                <w:sz w:val="17"/>
+              </w:rPr>
+              <w:t>Bedeutung</w:t>
+            </w:r>
+          </w:p>
+        </w:tc>
+        <w:tc>
+          <w:tcPr>
+            <w:tcW w:type="dxa" w:w="2070"/>
+            <w:shd w:val="clear" w:fill="D9E4EC"/>
+          </w:tcPr>
+          <w:p>
+            <w:r/>
+            <w:r>
+              <w:rPr>
+                <w:b/>
+                <w:sz w:val="17"/>
+              </w:rPr>
+              <w:t>Ort</w:t>
+            </w:r>
+          </w:p>
+        </w:tc>
+      </w:tr>
+      <w:tr>
+        <w:tc>
+          <w:tcPr>
+            <w:tcW w:type="dxa" w:w="1506"/>
+          </w:tcPr>
+          <w:p>
+            <w:r/>
+            <w:r>
+              <w:rPr>
+                <w:b w:val="0"/>
+                <w:sz w:val="17"/>
+              </w:rPr>
+              <w:t>ΔBrent_log</w:t>
+            </w:r>
+          </w:p>
+        </w:tc>
+        <w:tc>
+          <w:tcPr>
+            <w:tcW w:type="dxa" w:w="5835"/>
+          </w:tcPr>
+          <w:p>
+            <w:r/>
+            <w:r>
+              <w:rPr>
+                <w:b w:val="0"/>
+                <w:sz w:val="17"/>
+              </w:rPr>
+              <w:t>Ölpreis-Schock als log-Return ln(P₁/P₀); +0,50 ≈ +65 % Preis</w:t>
+            </w:r>
+          </w:p>
+        </w:tc>
+        <w:tc>
+          <w:tcPr>
+            <w:tcW w:type="dxa" w:w="2070"/>
+          </w:tcPr>
+          <w:p>
+            <w:r/>
+            <w:r>
+              <w:rPr>
+                <w:b w:val="0"/>
+                <w:sz w:val="17"/>
+              </w:rPr>
+              <w:t>Abschnitt 2</w:t>
+            </w:r>
+          </w:p>
+        </w:tc>
+      </w:tr>
+      <w:tr>
+        <w:tc>
+          <w:tcPr>
+            <w:tcW w:type="dxa" w:w="1506"/>
+          </w:tcPr>
+          <w:p>
+            <w:r/>
+            <w:r>
+              <w:rPr>
+                <w:b w:val="0"/>
+                <w:sz w:val="17"/>
+              </w:rPr>
+              <w:t>Δr_10y</w:t>
+            </w:r>
+          </w:p>
+        </w:tc>
+        <w:tc>
+          <w:tcPr>
+            <w:tcW w:type="dxa" w:w="5835"/>
+          </w:tcPr>
+          <w:p>
+            <w:r/>
+            <w:r>
+              <w:rPr>
+                <w:b w:val="0"/>
+                <w:sz w:val="17"/>
+              </w:rPr>
+              <w:t>Parallelverschiebung des 10-Jahres-Zinses in pp</w:t>
+            </w:r>
+          </w:p>
+        </w:tc>
+        <w:tc>
+          <w:tcPr>
+            <w:tcW w:type="dxa" w:w="2070"/>
+          </w:tcPr>
+          <w:p>
+            <w:r/>
+            <w:r>
+              <w:rPr>
+                <w:b w:val="0"/>
+                <w:sz w:val="17"/>
+              </w:rPr>
+              <w:t>Abschnitt 2</w:t>
+            </w:r>
+          </w:p>
+        </w:tc>
+      </w:tr>
+      <w:tr>
+        <w:tc>
+          <w:tcPr>
+            <w:tcW w:type="dxa" w:w="1506"/>
+          </w:tcPr>
+          <w:p>
+            <w:r/>
+            <w:r>
+              <w:rPr>
+                <w:b w:val="0"/>
+                <w:sz w:val="17"/>
+              </w:rPr>
+              <w:t>β_Öl, β_Zins</w:t>
+            </w:r>
+          </w:p>
+        </w:tc>
+        <w:tc>
+          <w:tcPr>
+            <w:tcW w:type="dxa" w:w="5835"/>
+          </w:tcPr>
+          <w:p>
+            <w:r/>
+            <w:r>
+              <w:rPr>
+                <w:b w:val="0"/>
+                <w:sz w:val="17"/>
+              </w:rPr>
+              <w:t>PD-Sensitivitäten je Kreditklasse (pp ΔPD pro Faktoreinheit)</w:t>
+            </w:r>
+          </w:p>
+        </w:tc>
+        <w:tc>
+          <w:tcPr>
+            <w:tcW w:type="dxa" w:w="2070"/>
+          </w:tcPr>
+          <w:p>
+            <w:r/>
+            <w:r>
+              <w:rPr>
+                <w:b w:val="0"/>
+                <w:sz w:val="17"/>
+              </w:rPr>
+              <w:t>Abschnitt 3</w:t>
+            </w:r>
+          </w:p>
+        </w:tc>
+      </w:tr>
+      <w:tr>
+        <w:tc>
+          <w:tcPr>
+            <w:tcW w:type="dxa" w:w="1506"/>
+          </w:tcPr>
+          <w:p>
+            <w:r/>
+            <w:r>
+              <w:rPr>
+                <w:b w:val="0"/>
+                <w:sz w:val="17"/>
+              </w:rPr>
+              <w:t>γ_Öl, γ_Zins</w:t>
+            </w:r>
+          </w:p>
+        </w:tc>
+        <w:tc>
+          <w:tcPr>
+            <w:tcW w:type="dxa" w:w="5835"/>
+          </w:tcPr>
+          <w:p>
+            <w:r/>
+            <w:r>
+              <w:rPr>
+                <w:b w:val="0"/>
+                <w:sz w:val="17"/>
+              </w:rPr>
+              <w:t>LGD-Sensitivitäten je Kreditklasse</w:t>
+            </w:r>
+          </w:p>
+        </w:tc>
+        <w:tc>
+          <w:tcPr>
+            <w:tcW w:type="dxa" w:w="2070"/>
+          </w:tcPr>
+          <w:p>
+            <w:r/>
+            <w:r>
+              <w:rPr>
+                <w:b w:val="0"/>
+                <w:sz w:val="17"/>
+              </w:rPr>
+              <w:t>Abschnitt 3</w:t>
+            </w:r>
+          </w:p>
+        </w:tc>
+      </w:tr>
+      <w:tr>
+        <w:tc>
+          <w:tcPr>
+            <w:tcW w:type="dxa" w:w="1506"/>
+          </w:tcPr>
+          <w:p>
+            <w:r/>
+            <w:r>
+              <w:rPr>
+                <w:b w:val="0"/>
+                <w:sz w:val="17"/>
+              </w:rPr>
+              <w:t>ρ</w:t>
+            </w:r>
+          </w:p>
+        </w:tc>
+        <w:tc>
+          <w:tcPr>
+            <w:tcW w:type="dxa" w:w="5835"/>
+          </w:tcPr>
+          <w:p>
+            <w:r/>
+            <w:r>
+              <w:rPr>
+                <w:b w:val="0"/>
+                <w:sz w:val="17"/>
+              </w:rPr>
+              <w:t>Asset-Korrelation der IRB-Formel (CRR Art. 153/154)</w:t>
+            </w:r>
+          </w:p>
+        </w:tc>
+        <w:tc>
+          <w:tcPr>
+            <w:tcW w:type="dxa" w:w="2070"/>
+          </w:tcPr>
+          <w:p>
+            <w:r/>
+            <w:r>
+              <w:rPr>
+                <w:b w:val="0"/>
+                <w:sz w:val="17"/>
+              </w:rPr>
+              <w:t>Abschnitt 4</w:t>
+            </w:r>
+          </w:p>
+        </w:tc>
+      </w:tr>
+      <w:tr>
+        <w:tc>
+          <w:tcPr>
+            <w:tcW w:type="dxa" w:w="1506"/>
+          </w:tcPr>
+          <w:p>
+            <w:r/>
+            <w:r>
+              <w:rPr>
+                <w:b w:val="0"/>
+                <w:sz w:val="17"/>
+              </w:rPr>
+              <w:t>K</w:t>
+            </w:r>
+          </w:p>
+        </w:tc>
+        <w:tc>
+          <w:tcPr>
+            <w:tcW w:type="dxa" w:w="5835"/>
+          </w:tcPr>
+          <w:p>
+            <w:r/>
+            <w:r>
+              <w:rPr>
+                <w:b w:val="0"/>
+                <w:sz w:val="17"/>
+              </w:rPr>
+              <w:t>Kapitalanforderung je Einheit Exposure (IRB-Formel)</w:t>
+            </w:r>
+          </w:p>
+        </w:tc>
+        <w:tc>
+          <w:tcPr>
+            <w:tcW w:type="dxa" w:w="2070"/>
+          </w:tcPr>
+          <w:p>
+            <w:r/>
+            <w:r>
+              <w:rPr>
+                <w:b w:val="0"/>
+                <w:sz w:val="17"/>
+              </w:rPr>
+              <w:t>Abschnitt 4</w:t>
+            </w:r>
+          </w:p>
+        </w:tc>
+      </w:tr>
+      <w:tr>
+        <w:tc>
+          <w:tcPr>
+            <w:tcW w:type="dxa" w:w="1506"/>
+          </w:tcPr>
+          <w:p>
+            <w:r/>
+            <w:r>
+              <w:rPr>
+                <w:b w:val="0"/>
+                <w:sz w:val="17"/>
+              </w:rPr>
+              <w:t>N, N⁻¹</w:t>
+            </w:r>
+          </w:p>
+        </w:tc>
+        <w:tc>
+          <w:tcPr>
+            <w:tcW w:type="dxa" w:w="5835"/>
+          </w:tcPr>
+          <w:p>
+            <w:r/>
+            <w:r>
+              <w:rPr>
+                <w:b w:val="0"/>
+                <w:sz w:val="17"/>
+              </w:rPr>
+              <w:t>Standardnormal-Verteilungsfunktion und ihre Inverse</w:t>
+            </w:r>
+          </w:p>
+        </w:tc>
+        <w:tc>
+          <w:tcPr>
+            <w:tcW w:type="dxa" w:w="2070"/>
+          </w:tcPr>
+          <w:p>
+            <w:r/>
+            <w:r>
+              <w:rPr>
+                <w:b w:val="0"/>
+                <w:sz w:val="17"/>
+              </w:rPr>
+              <w:t>Abschnitt 4</w:t>
+            </w:r>
+          </w:p>
+        </w:tc>
+      </w:tr>
+      <w:tr>
+        <w:tc>
+          <w:tcPr>
+            <w:tcW w:type="dxa" w:w="1506"/>
+          </w:tcPr>
+          <w:p>
+            <w:r/>
+            <w:r>
+              <w:rPr>
+                <w:b w:val="0"/>
+                <w:sz w:val="17"/>
+              </w:rPr>
+              <w:t>α = 99,9 %</w:t>
+            </w:r>
+          </w:p>
+        </w:tc>
+        <w:tc>
+          <w:tcPr>
+            <w:tcW w:type="dxa" w:w="5835"/>
+          </w:tcPr>
+          <w:p>
+            <w:r/>
+            <w:r>
+              <w:rPr>
+                <w:b w:val="0"/>
+                <w:sz w:val="17"/>
+              </w:rPr>
+              <w:t>Konfidenzniveau der IRB-Formel</w:t>
+            </w:r>
+          </w:p>
+        </w:tc>
+        <w:tc>
+          <w:tcPr>
+            <w:tcW w:type="dxa" w:w="2070"/>
+          </w:tcPr>
+          <w:p>
+            <w:r/>
+            <w:r>
+              <w:rPr>
+                <w:b w:val="0"/>
+                <w:sz w:val="17"/>
+              </w:rPr>
+              <w:t>Abschnitt 4</w:t>
+            </w:r>
+          </w:p>
+        </w:tc>
+      </w:tr>
+      <w:tr>
+        <w:tc>
+          <w:tcPr>
+            <w:tcW w:type="dxa" w:w="1506"/>
+          </w:tcPr>
+          <w:p>
+            <w:r/>
+            <w:r>
+              <w:rPr>
+                <w:b w:val="0"/>
+                <w:sz w:val="17"/>
+              </w:rPr>
+              <w:t>b(PD), MA</w:t>
+            </w:r>
+          </w:p>
+        </w:tc>
+        <w:tc>
+          <w:tcPr>
+            <w:tcW w:type="dxa" w:w="5835"/>
+          </w:tcPr>
+          <w:p>
+            <w:r/>
+            <w:r>
+              <w:rPr>
+                <w:b w:val="0"/>
+                <w:sz w:val="17"/>
+              </w:rPr>
+              <w:t>Laufzeit-Glättungsfunktion und Laufzeit-Adjustment</w:t>
+            </w:r>
+          </w:p>
+        </w:tc>
+        <w:tc>
+          <w:tcPr>
+            <w:tcW w:type="dxa" w:w="2070"/>
+          </w:tcPr>
+          <w:p>
+            <w:r/>
+            <w:r>
+              <w:rPr>
+                <w:b w:val="0"/>
+                <w:sz w:val="17"/>
+              </w:rPr>
+              <w:t>Abschnitt 4</w:t>
+            </w:r>
+          </w:p>
+        </w:tc>
+      </w:tr>
+      <w:tr>
+        <w:tc>
+          <w:tcPr>
+            <w:tcW w:type="dxa" w:w="1506"/>
+          </w:tcPr>
+          <w:p>
+            <w:r/>
+            <w:r>
+              <w:rPr>
+                <w:b w:val="0"/>
+                <w:sz w:val="17"/>
+              </w:rPr>
+              <w:t>M</w:t>
+            </w:r>
+          </w:p>
+        </w:tc>
+        <w:tc>
+          <w:tcPr>
+            <w:tcW w:type="dxa" w:w="5835"/>
+          </w:tcPr>
+          <w:p>
+            <w:r/>
+            <w:r>
+              <w:rPr>
+                <w:b w:val="0"/>
+                <w:sz w:val="17"/>
+              </w:rPr>
+              <w:t>effektive Restlaufzeit; Konvention M = 2,5 Jahre</w:t>
+            </w:r>
+          </w:p>
+        </w:tc>
+        <w:tc>
+          <w:tcPr>
+            <w:tcW w:type="dxa" w:w="2070"/>
+          </w:tcPr>
+          <w:p>
+            <w:r/>
+            <w:r>
+              <w:rPr>
+                <w:b w:val="0"/>
+                <w:sz w:val="17"/>
+              </w:rPr>
+              <w:t>Abschnitt 4</w:t>
+            </w:r>
+          </w:p>
+        </w:tc>
+      </w:tr>
+      <w:tr>
+        <w:tc>
+          <w:tcPr>
+            <w:tcW w:type="dxa" w:w="1506"/>
+          </w:tcPr>
+          <w:p>
+            <w:r/>
+            <w:r>
+              <w:rPr>
+                <w:b w:val="0"/>
+                <w:sz w:val="17"/>
+              </w:rPr>
+              <w:t>S</w:t>
+            </w:r>
+          </w:p>
+        </w:tc>
+        <w:tc>
+          <w:tcPr>
+            <w:tcW w:type="dxa" w:w="5835"/>
+          </w:tcPr>
+          <w:p>
+            <w:r/>
+            <w:r>
+              <w:rPr>
+                <w:b w:val="0"/>
+                <w:sz w:val="17"/>
+              </w:rPr>
+              <w:t>Jahresumsatz für die KMU-ρ-Anpassung; Konvention 20 Mio. €</w:t>
+            </w:r>
+          </w:p>
+        </w:tc>
+        <w:tc>
+          <w:tcPr>
+            <w:tcW w:type="dxa" w:w="2070"/>
+          </w:tcPr>
+          <w:p>
+            <w:r/>
+            <w:r>
+              <w:rPr>
+                <w:b w:val="0"/>
+                <w:sz w:val="17"/>
+              </w:rPr>
+              <w:t>Abschnitt 4</w:t>
+            </w:r>
+          </w:p>
+        </w:tc>
+      </w:tr>
+      <w:tr>
+        <w:tc>
+          <w:tcPr>
+            <w:tcW w:type="dxa" w:w="1506"/>
+          </w:tcPr>
+          <w:p>
+            <w:r/>
+            <w:r>
+              <w:rPr>
+                <w:b w:val="0"/>
+                <w:sz w:val="17"/>
+              </w:rPr>
+              <w:t>D_bucket</w:t>
+            </w:r>
+          </w:p>
+        </w:tc>
+        <w:tc>
+          <w:tcPr>
+            <w:tcW w:type="dxa" w:w="5835"/>
+          </w:tcPr>
+          <w:p>
+            <w:r/>
+            <w:r>
+              <w:rPr>
+                <w:b w:val="0"/>
+                <w:sz w:val="17"/>
+              </w:rPr>
+              <w:t>Modified Duration je Laufzeit-Bucket (Sovereign-Kanal)</w:t>
+            </w:r>
+          </w:p>
+        </w:tc>
+        <w:tc>
+          <w:tcPr>
+            <w:tcW w:type="dxa" w:w="2070"/>
+          </w:tcPr>
+          <w:p>
+            <w:r/>
+            <w:r>
+              <w:rPr>
+                <w:b w:val="0"/>
+                <w:sz w:val="17"/>
+              </w:rPr>
+              <w:t>Abschnitt 4</w:t>
+            </w:r>
+          </w:p>
+        </w:tc>
+      </w:tr>
+      <w:tr>
+        <w:tc>
+          <w:tcPr>
+            <w:tcW w:type="dxa" w:w="1506"/>
+          </w:tcPr>
+          <w:p>
+            <w:r/>
+            <w:r>
+              <w:rPr>
+                <w:b w:val="0"/>
+                <w:sz w:val="17"/>
+              </w:rPr>
+              <w:t>ΔRWA, ΔEL, ΔMtM</w:t>
+            </w:r>
+          </w:p>
+        </w:tc>
+        <w:tc>
+          <w:tcPr>
+            <w:tcW w:type="dxa" w:w="5835"/>
+          </w:tcPr>
+          <w:p>
+            <w:r/>
+            <w:r>
+              <w:rPr>
+                <w:b w:val="0"/>
+                <w:sz w:val="17"/>
+              </w:rPr>
+              <w:t>Stress-Deltas der CET1-Bridge</w:t>
+            </w:r>
+          </w:p>
+        </w:tc>
+        <w:tc>
+          <w:tcPr>
+            <w:tcW w:type="dxa" w:w="2070"/>
+          </w:tcPr>
+          <w:p>
+            <w:r/>
+            <w:r>
+              <w:rPr>
+                <w:b w:val="0"/>
+                <w:sz w:val="17"/>
+              </w:rPr>
+              <w:t>Abschnitt 4</w:t>
+            </w:r>
+          </w:p>
+        </w:tc>
+      </w:tr>
+      <w:tr>
+        <w:tc>
+          <w:tcPr>
+            <w:tcW w:type="dxa" w:w="1506"/>
+          </w:tcPr>
+          <w:p>
+            <w:r/>
+            <w:r>
+              <w:rPr>
+                <w:b w:val="0"/>
+                <w:sz w:val="17"/>
+              </w:rPr>
+              <w:t>e_i, MAE, Bias</w:t>
+            </w:r>
+          </w:p>
+        </w:tc>
+        <w:tc>
+          <w:tcPr>
+            <w:tcW w:type="dxa" w:w="5835"/>
+          </w:tcPr>
+          <w:p>
+            <w:r/>
+            <w:r>
+              <w:rPr>
+                <w:b w:val="0"/>
+                <w:sz w:val="17"/>
+              </w:rPr>
+              <w:t>Prognosefehler je Bank-Jahr und Fehlermaße</w:t>
+            </w:r>
+          </w:p>
+        </w:tc>
+        <w:tc>
+          <w:tcPr>
+            <w:tcW w:type="dxa" w:w="2070"/>
+          </w:tcPr>
+          <w:p>
+            <w:r/>
+            <w:r>
+              <w:rPr>
+                <w:b w:val="0"/>
+                <w:sz w:val="17"/>
+              </w:rPr>
+              <w:t>Abschnitt 7</w:t>
+            </w:r>
+          </w:p>
+        </w:tc>
+      </w:tr>
+    </w:tbl>
+    <w:p>
+      <w:pPr>
+        <w:spacing w:after="80"/>
+      </w:pPr>
     </w:p>
     <w:p>
       <w:r>
@@ -254,6 +1937,330 @@
     </w:p>
     <w:p>
       <w:pPr>
+        <w:pStyle w:val="Heading2"/>
+      </w:pPr>
+      <w:r>
+        <w:t>Prüfpfad für kritische Evaluation</w:t>
+      </w:r>
+    </w:p>
+    <w:p>
+      <w:pPr>
+        <w:spacing w:after="140"/>
+      </w:pPr>
+      <w:r>
+        <w:rPr>
+          <w:b w:val="0"/>
+          <w:i w:val="0"/>
+          <w:sz w:val="21"/>
+        </w:rPr>
+        <w:t>Das Dokument ist so aufgebaut, dass ein Dritter die Modelllogik vom Rohdatum bis zur CET1-Quote nachvollziehen kann. Die folgende Kurzlandkarte nennt die jeweils prüfbare Stelle; Details folgen in den Abschnitten 2 bis 8.</w:t>
+      </w:r>
+    </w:p>
+    <w:tbl>
+      <w:tblPr>
+        <w:tblStyle w:val="TableGrid"/>
+        <w:tblW w:type="auto" w:w="0"/>
+        <w:jc w:val="center"/>
+        <w:tblLook w:firstColumn="1" w:firstRow="1" w:lastColumn="0" w:lastRow="0" w:noHBand="0" w:noVBand="1" w:val="04A0"/>
+      </w:tblPr>
+      <w:tblGrid>
+        <w:gridCol w:w="3137"/>
+        <w:gridCol w:w="3137"/>
+        <w:gridCol w:w="3137"/>
+      </w:tblGrid>
+      <w:tr>
+        <w:tc>
+          <w:tcPr>
+            <w:tcW w:type="dxa" w:w="2823"/>
+            <w:shd w:val="clear" w:fill="D9E4EC"/>
+          </w:tcPr>
+          <w:p>
+            <w:r/>
+            <w:r>
+              <w:rPr>
+                <w:b/>
+                <w:sz w:val="17"/>
+              </w:rPr>
+              <w:t>Prüffrage</w:t>
+            </w:r>
+          </w:p>
+        </w:tc>
+        <w:tc>
+          <w:tcPr>
+            <w:tcW w:type="dxa" w:w="4706"/>
+            <w:shd w:val="clear" w:fill="D9E4EC"/>
+          </w:tcPr>
+          <w:p>
+            <w:r/>
+            <w:r>
+              <w:rPr>
+                <w:b/>
+                <w:sz w:val="17"/>
+              </w:rPr>
+              <w:t>Nachvollziehbarer Beleg</w:t>
+            </w:r>
+          </w:p>
+        </w:tc>
+        <w:tc>
+          <w:tcPr>
+            <w:tcW w:type="dxa" w:w="1882"/>
+            <w:shd w:val="clear" w:fill="D9E4EC"/>
+          </w:tcPr>
+          <w:p>
+            <w:r/>
+            <w:r>
+              <w:rPr>
+                <w:b/>
+                <w:sz w:val="17"/>
+              </w:rPr>
+              <w:t>Abschnitt</w:t>
+            </w:r>
+          </w:p>
+        </w:tc>
+      </w:tr>
+      <w:tr>
+        <w:tc>
+          <w:tcPr>
+            <w:tcW w:type="dxa" w:w="2823"/>
+          </w:tcPr>
+          <w:p>
+            <w:r/>
+            <w:r>
+              <w:rPr>
+                <w:b w:val="0"/>
+                <w:sz w:val="17"/>
+              </w:rPr>
+              <w:t>Woher kommen PD, LGD und EAD?</w:t>
+            </w:r>
+          </w:p>
+        </w:tc>
+        <w:tc>
+          <w:tcPr>
+            <w:tcW w:type="dxa" w:w="4706"/>
+          </w:tcPr>
+          <w:p>
+            <w:r/>
+            <w:r>
+              <w:rPr>
+                <w:b w:val="0"/>
+                <w:sz w:val="17"/>
+              </w:rPr>
+              <w:t>Pillar-3-EU-CR6-Zeilen mit Quellen-URL, Seitenzahl und Tabellenname; keine Ableitung aus RWA oder NPL-Quoten</w:t>
+            </w:r>
+          </w:p>
+        </w:tc>
+        <w:tc>
+          <w:tcPr>
+            <w:tcW w:type="dxa" w:w="1882"/>
+          </w:tcPr>
+          <w:p>
+            <w:r/>
+            <w:r>
+              <w:rPr>
+                <w:b w:val="0"/>
+                <w:sz w:val="17"/>
+              </w:rPr>
+              <w:t>5 / A-01 / A-02</w:t>
+            </w:r>
+          </w:p>
+        </w:tc>
+      </w:tr>
+      <w:tr>
+        <w:tc>
+          <w:tcPr>
+            <w:tcW w:type="dxa" w:w="2823"/>
+          </w:tcPr>
+          <w:p>
+            <w:r/>
+            <w:r>
+              <w:rPr>
+                <w:b w:val="0"/>
+                <w:sz w:val="17"/>
+              </w:rPr>
+              <w:t>Welche Werte sind Annahmen, welche nicht?</w:t>
+            </w:r>
+          </w:p>
+        </w:tc>
+        <w:tc>
+          <w:tcPr>
+            <w:tcW w:type="dxa" w:w="4706"/>
+          </w:tcPr>
+          <w:p>
+            <w:r/>
+            <w:r>
+              <w:rPr>
+                <w:b w:val="0"/>
+                <w:sz w:val="17"/>
+              </w:rPr>
+              <w:t>Konfidenzklassen [published], [estimate], [approximation], [assumption]; ρ ist regulatorischer CRR-Parameter, keine Schätzung</w:t>
+            </w:r>
+          </w:p>
+        </w:tc>
+        <w:tc>
+          <w:tcPr>
+            <w:tcW w:type="dxa" w:w="1882"/>
+          </w:tcPr>
+          <w:p>
+            <w:r/>
+            <w:r>
+              <w:rPr>
+                <w:b w:val="0"/>
+                <w:sz w:val="17"/>
+              </w:rPr>
+              <w:t>4 / 6</w:t>
+            </w:r>
+          </w:p>
+        </w:tc>
+      </w:tr>
+      <w:tr>
+        <w:tc>
+          <w:tcPr>
+            <w:tcW w:type="dxa" w:w="2823"/>
+          </w:tcPr>
+          <w:p>
+            <w:r/>
+            <w:r>
+              <w:rPr>
+                <w:b w:val="0"/>
+                <w:sz w:val="17"/>
+              </w:rPr>
+              <w:t>Wie läuft ein Schock durch das Modell?</w:t>
+            </w:r>
+          </w:p>
+        </w:tc>
+        <w:tc>
+          <w:tcPr>
+            <w:tcW w:type="dxa" w:w="4706"/>
+          </w:tcPr>
+          <w:p>
+            <w:r/>
+            <w:r>
+              <w:rPr>
+                <w:b w:val="0"/>
+                <w:sz w:val="17"/>
+              </w:rPr>
+              <w:t>ΔBrent und Δr_10y → ΔPD/ΔLGD → IRB-K-Formel → ΔRWA/ΔEL → CET1-Bridge</w:t>
+            </w:r>
+          </w:p>
+        </w:tc>
+        <w:tc>
+          <w:tcPr>
+            <w:tcW w:type="dxa" w:w="1882"/>
+          </w:tcPr>
+          <w:p>
+            <w:r/>
+            <w:r>
+              <w:rPr>
+                <w:b w:val="0"/>
+                <w:sz w:val="17"/>
+              </w:rPr>
+              <w:t>3 / 4</w:t>
+            </w:r>
+          </w:p>
+        </w:tc>
+      </w:tr>
+      <w:tr>
+        <w:tc>
+          <w:tcPr>
+            <w:tcW w:type="dxa" w:w="2823"/>
+          </w:tcPr>
+          <w:p>
+            <w:r/>
+            <w:r>
+              <w:rPr>
+                <w:b w:val="0"/>
+                <w:sz w:val="17"/>
+              </w:rPr>
+              <w:t>Wie wird Look-ahead im Backtest verhindert?</w:t>
+            </w:r>
+          </w:p>
+        </w:tc>
+        <w:tc>
+          <w:tcPr>
+            <w:tcW w:type="dxa" w:w="4706"/>
+          </w:tcPr>
+          <w:p>
+            <w:r/>
+            <w:r>
+              <w:rPr>
+                <w:b w:val="0"/>
+                <w:sz w:val="17"/>
+              </w:rPr>
+              <w:t>Walk-Forward: Portfolio zum Vorjahresstichtag einfrieren, realen Jahresschock einspeisen, erst danach mit gemeldeter CET1 vergleichen</w:t>
+            </w:r>
+          </w:p>
+        </w:tc>
+        <w:tc>
+          <w:tcPr>
+            <w:tcW w:type="dxa" w:w="1882"/>
+          </w:tcPr>
+          <w:p>
+            <w:r/>
+            <w:r>
+              <w:rPr>
+                <w:b w:val="0"/>
+                <w:sz w:val="17"/>
+              </w:rPr>
+              <w:t>7 / A-02c</w:t>
+            </w:r>
+          </w:p>
+        </w:tc>
+      </w:tr>
+      <w:tr>
+        <w:tc>
+          <w:tcPr>
+            <w:tcW w:type="dxa" w:w="2823"/>
+          </w:tcPr>
+          <w:p>
+            <w:r/>
+            <w:r>
+              <w:rPr>
+                <w:b w:val="0"/>
+                <w:sz w:val="17"/>
+              </w:rPr>
+              <w:t>Wo liegen die bewussten Grenzen?</w:t>
+            </w:r>
+          </w:p>
+        </w:tc>
+        <w:tc>
+          <w:tcPr>
+            <w:tcW w:type="dxa" w:w="4706"/>
+          </w:tcPr>
+          <w:p>
+            <w:r/>
+            <w:r>
+              <w:rPr>
+                <w:b w:val="0"/>
+                <w:sz w:val="17"/>
+              </w:rPr>
+              <w:t>Scope-Grenzen separat ausgewiesen: u. a. kein NII-Gegeneffekt, kein Hedge-Rekonstrukt, kein Mehrjahrespfad</w:t>
+            </w:r>
+          </w:p>
+        </w:tc>
+        <w:tc>
+          <w:tcPr>
+            <w:tcW w:type="dxa" w:w="1882"/>
+          </w:tcPr>
+          <w:p>
+            <w:r/>
+            <w:r>
+              <w:rPr>
+                <w:b w:val="0"/>
+                <w:sz w:val="17"/>
+              </w:rPr>
+              <w:t>8</w:t>
+            </w:r>
+          </w:p>
+        </w:tc>
+      </w:tr>
+    </w:tbl>
+    <w:p>
+      <w:pPr>
+        <w:spacing w:after="80"/>
+      </w:pPr>
+    </w:p>
+    <w:p>
+      <w:pPr>
         <w:pStyle w:val="Heading1"/>
       </w:pPr>
       <w:r>
@@ -470,7 +2477,7 @@
                 <w:b w:val="0"/>
                 <w:sz w:val="18"/>
               </w:rPr>
-              <w:t>Refinanzierungs-/Bewertungsschock: verteuert Anschluss-finanzierung, senkt Sicherheiten- und Anleihewerte</w:t>
+              <w:t>Refinanzierungs-/Bewertungsschock: verteuert Anschlussfinanzierung, senkt Sicherheiten- und Anleihewerte</w:t>
             </w:r>
           </w:p>
         </w:tc>
@@ -514,7 +2521,7 @@
           <w:i w:val="0"/>
           <w:sz w:val="21"/>
         </w:rPr>
-        <w:t xml:space="preserve"> Über fünf Jahre (1 242 Handelstage) beträgt die Korrelation der beiden Faktoren nur ρ = +0,07 (95 %-Konfidenzintervall [+0,01; +0,12]; OLS-R² = 0,005). Sie tragen also nahezu unabhängige Information — eine Aggregation zu einem Einheitsfaktor würde genau die Unterscheidung wegwerfen, die z. B. eine zinsgetriebene Hypothekenkrise von einem Energiekostenschock trennt (Annahme A-10).</w:t>
+        <w:t xml:space="preserve"> Gemessen auf Tagesbasis — tägliche Brent-log-Returns gegen tägliche Änderungen des 10-Jahres-Svensson-Zinses, rollierendes 5-Jahres-Fenster mit 1 242 Handelstagen — beträgt die Pearson-Korrelation der beiden Faktoren nur ρ = +0,07 (Fisher-z-95 %-Konfidenzintervall [+0,01; +0,12]; OLS-R² = 0,005). Sie tragen also nahezu unabhängige Information — eine Aggregation zu einem Einheitsfaktor würde genau die Unterscheidung wegwerfen, die z. B. eine zinsgetriebene Hypothekenkrise von einem Energiekostenschock trennt. Die Grenze dieser Tages-Evidenz für den Jahres-Horizont diskutiert Annahme A-10; die Slider-Spannen des Cockpits (ΔBrent_log ∈ [−1,0; +1,5], Δr_10y ∈ [−3; +5] pp) orientieren sich an der Größenordnung des adversen EBA/ESRB-2025-Szenarios (§4.1.6).</w:t>
       </w:r>
     </w:p>
     <w:p>
@@ -1819,7 +3826,7 @@
           <w:i/>
           <w:sz w:val="19"/>
         </w:rPr>
-        <w:t>Quellen der Kalibrierung: EBA (2024) *2025 EU-wide Stress Test — Methodological Note* §2.4.2 (sektorale Sensitivitäten sind der aufsichtlich vorgesehene Ansatz); ECB WP 2897 (Unternehmens-PD auf Angebots-/Zinsschocks, KMU-Verstärkung), ECB WP 3112 (Hypotheken-Defaults und Zins), ECB Financial Stability Review Mai 2024 (Haushalte). Die β sind als belegte, per Regler übersteuerbare Defaults ausgewiesen — Konfidenzklasse [estimate].</w:t>
+        <w:t>Quellen der Kalibrierung: EBA (2024) *2025 EU-wide Stress Test — Methodological Note* §2.4.2 (sektorale Sensitivitäten sind der aufsichtlich vorgesehene Ansatz); ECB WP 2897 (Unternehmens-PD auf Angebots-/Zinsschocks, KMU-Verstärkung ≈ 2–3×), ECB WP 3207 (Sektor-Heterogenität der Unternehmens-Ausfälle im Stress), ECB WP 3112 (Hypotheken-Defaults und Zins), ECB Financial Stability Review Mai 2024 (Haushalte); die relative Rangfolge der Klassen ist gegen EBA Results 2025, Fig. 22 (projizierte Verlustquoten je Portfolio) quervalidiert. Die β sind als belegte, per Regler übersteuerbare Defaults ausgewiesen — Konfidenzklasse [estimate]; ihre Wirkung auf das Endergebnis quantifiziert der ±50-%-Robustheitstest in Abschnitt 7.</w:t>
       </w:r>
     </w:p>
     <w:p>
@@ -1840,7 +3847,7 @@
           <w:i w:val="0"/>
           <w:sz w:val="21"/>
         </w:rPr>
-        <w:t>Angenommen wird ein Corporate-Segment mit PD = 2,50 % und LGD = 35,00 %; als Szenario tritt ein Zinsanstieg von +2,0 Prozentpunkten bei gleichzeitig +30 % Ölpreis ein. Dann rechnet das Modell in drei Schritten:</w:t>
+        <w:t>Angenommen wird ein Corporate-Segment mit PD = 2,50 % und LGD = 35,00 %; als Szenario treten ein Zinsanstieg von +2,0 Prozentpunkten und ein Brent-log-Return von +0,30 (entspricht e^0,30 − 1 ≈ +35 % Ölpreis, vgl. die Log-Konvention aus Abschnitt 2) gleichzeitig ein. Dann rechnet das Modell in drei Schritten:</w:t>
       </w:r>
     </w:p>
     <w:p>
@@ -1953,7 +3960,7 @@
           <w:b w:val="0"/>
           <w:sz w:val="21"/>
         </w:rPr>
-        <w:t xml:space="preserve"> der erwartete Verlust steigt von 0,875 % auf 1,111 % des Exposures (</w:t>
+        <w:t xml:space="preserve"> der erwartete Verlust steigt von 0,875 % auf 1,111 % des Exposures (relativ </w:t>
       </w:r>
       <w:r>
         <w:rPr>
@@ -1967,21 +3974,21 @@
           <w:b w:val="0"/>
           <w:sz w:val="21"/>
         </w:rPr>
-        <w:t>), die RWA-Dichte von 95,0 % auf 105,9 % (</w:t>
+        <w:t xml:space="preserve">), die RWA-Dichte von 95,0 % auf 105,9 % — ein Anstieg um </w:t>
       </w:r>
       <w:r>
         <w:rPr>
           <w:b/>
           <w:sz w:val="21"/>
         </w:rPr>
-        <w:t>+11,5 %</w:t>
+        <w:t>+10,9 pp</w:t>
       </w:r>
       <w:r>
         <w:rPr>
           <w:b w:val="0"/>
           <w:sz w:val="21"/>
         </w:rPr>
-        <w:t>).</w:t>
+        <w:t xml:space="preserve"> absolut (relativ +11,5 %).</w:t>
       </w:r>
     </w:p>
     <w:p>
@@ -2070,9 +4077,23 @@
         <w:rPr>
           <w:b w:val="0"/>
           <w:i w:val="0"/>
+          <w:color w:val="034B6F"/>
+          <w:sz w:val="20"/>
+        </w:rPr>
+        <w:t>CET1-Quote_stress = ( CET1 − ΔEL_Kredit + ΔMtM_Sov ) / ( RWA_total + ΔRWA_Kredit )</w:t>
+      </w:r>
+    </w:p>
+    <w:p>
+      <w:pPr>
+        <w:spacing w:after="140"/>
+      </w:pPr>
+      <w:r>
+        <w:rPr>
+          <w:b w:val="0"/>
+          <w:i w:val="0"/>
           <w:sz w:val="21"/>
         </w:rPr>
-        <w:t xml:space="preserve">Dabei ist ρ der regulatorische IRB-Klassenparameter nach CRR Art. 153/154, MA das Laufzeit-Adjustment und N die Standardnormalverteilung. Die theoretische Fundierung des ASRF-Rahmens liefern Vasicek (1991, 2002) und Gordy (2003). Der </w:t>
+        <w:t xml:space="preserve">Dabei ist ρ der regulatorische IRB-Klassenparameter nach CRR Art. 153/154, MA das Laufzeit-Adjustment und N die Standardnormalverteilung; ΔMtM_Sov ist bei Zinsanstieg negativ (Kurswertverlust) und umfasst nur den CET1-wirksamen FVOCI/FVTPL-Anteil. Das Kreditbuch wirkt also auf Zähler (−ΔEL) </w:t>
       </w:r>
       <w:r>
         <w:rPr>
@@ -2080,7 +4101,7 @@
           <w:i w:val="0"/>
           <w:sz w:val="21"/>
         </w:rPr>
-        <w:t>Sovereign-Kanal</w:t>
+        <w:t>und</w:t>
       </w:r>
       <w:r>
         <w:rPr>
@@ -2088,7 +4109,514 @@
           <w:i w:val="0"/>
           <w:sz w:val="21"/>
         </w:rPr>
-        <w:t xml:space="preserve"> bewertet parallel die Staatsanleihebestände: ΔMtM = −Duration · Δr · Exposure, CET1-wirksam nur für den FVOCI/FVTPL-Anteil je Bank (EBA-IFRS-9-Split, Annahme A-06; Durationslogik nach Tuckman/Serrat 2012). Die begleitenden Marktbuch-Analysen des Cockpits — Staaten-Banken-Verflechtung (Doom Loop) und latente Bewertungs-verluste — stützen sich auf Brunnermeier et al. (2016), Acharya/Drechsler/Schnabl (2014) und Jiang et al. (2023).</w:t>
+        <w:t xml:space="preserve"> Nenner (+ΔRWA), der Sovereign-Kanal nur auf den Zähler. Die theoretische Fundierung des ASRF-Rahmens liefern Vasicek (1991, 2002) und Gordy (2003).</w:t>
+      </w:r>
+    </w:p>
+    <w:p>
+      <w:pPr>
+        <w:pStyle w:val="Heading2"/>
+      </w:pPr>
+      <w:r>
+        <w:t>Die Formelstrecke im Detail</w:t>
+      </w:r>
+    </w:p>
+    <w:p>
+      <w:pPr>
+        <w:spacing w:after="140"/>
+      </w:pPr>
+      <w:r>
+        <w:rPr>
+          <w:b/>
+          <w:i w:val="0"/>
+          <w:sz w:val="21"/>
+        </w:rPr>
+        <w:t>Laufzeit-Adjustment:</w:t>
+      </w:r>
+      <w:r>
+        <w:rPr>
+          <w:b w:val="0"/>
+          <w:i w:val="0"/>
+          <w:sz w:val="21"/>
+        </w:rPr>
+        <w:t xml:space="preserve"> b(PD) = (0,11852 − 0,05478 · ln PD)² und MA = (1 + (M − 2,5) · b) / (1 − 1,5 · b). MA gilt für corporate, sme_corporate, bank und sovereign; für die Retail-Klassen (mortgage, qrre, other_retail) ist MA = 1 (CRR-Systematik). </w:t>
+      </w:r>
+      <w:r>
+        <w:rPr>
+          <w:b/>
+          <w:i w:val="0"/>
+          <w:sz w:val="21"/>
+        </w:rPr>
+        <w:t>Zwei stille Konventionen, hier explizit ausgewiesen [assumption]:</w:t>
+      </w:r>
+      <w:r>
+        <w:rPr>
+          <w:b w:val="0"/>
+          <w:i w:val="0"/>
+          <w:sz w:val="21"/>
+        </w:rPr>
+        <w:t xml:space="preserve"> Die effektive Restlaufzeit ist einheitlich </w:t>
+      </w:r>
+      <w:r>
+        <w:rPr>
+          <w:b/>
+          <w:i w:val="0"/>
+          <w:sz w:val="21"/>
+        </w:rPr>
+        <w:t>M = 2,5 Jahre</w:t>
+      </w:r>
+      <w:r>
+        <w:rPr>
+          <w:b w:val="0"/>
+          <w:i w:val="0"/>
+          <w:sz w:val="21"/>
+        </w:rPr>
+        <w:t xml:space="preserve"> gesetzt (Basel-Default; Pillar 3 legt keine Restlaufzeit je Klasse offen — konstant über alle Jahrgänge und damit zeitvergleichs-neutral), und die KMU-Größenanpassung nutzt einen repräsentativen Jahresumsatz </w:t>
+      </w:r>
+      <w:r>
+        <w:rPr>
+          <w:b/>
+          <w:i w:val="0"/>
+          <w:sz w:val="21"/>
+        </w:rPr>
+        <w:t>S = 20 Mio. €</w:t>
+      </w:r>
+      <w:r>
+        <w:rPr>
+          <w:b w:val="0"/>
+          <w:i w:val="0"/>
+          <w:sz w:val="21"/>
+        </w:rPr>
+        <w:t xml:space="preserve"> für das aggregierte SME-Buch.</w:t>
+      </w:r>
+    </w:p>
+    <w:p>
+      <w:pPr>
+        <w:spacing w:after="140"/>
+      </w:pPr>
+      <w:r>
+        <w:rPr>
+          <w:b/>
+          <w:i w:val="0"/>
+          <w:sz w:val="21"/>
+        </w:rPr>
+        <w:t>Kanal-Zerlegung:</w:t>
+      </w:r>
+      <w:r>
+        <w:rPr>
+          <w:b w:val="0"/>
+          <w:i w:val="0"/>
+          <w:sz w:val="21"/>
+        </w:rPr>
+        <w:t xml:space="preserve"> Die Stress-Wirkung wird sequentiell zerlegt — Stufe 1 stresst nur die PD (PD-Kanal), Stufe 2 zusätzlich die LGD (LGD-Kanal); beide Teilbeträge addieren sich exakt zu ΔRWA bzw. ΔEL. </w:t>
+      </w:r>
+      <w:r>
+        <w:rPr>
+          <w:b/>
+          <w:i w:val="0"/>
+          <w:sz w:val="21"/>
+        </w:rPr>
+        <w:t>ΔEL als Zähler-Proxy:</w:t>
+      </w:r>
+      <w:r>
+        <w:rPr>
+          <w:b w:val="0"/>
+          <w:i w:val="0"/>
+          <w:sz w:val="21"/>
+        </w:rPr>
+        <w:t xml:space="preserve"> ΔEL = Δ(PD · LGD · EAD) wird 1:1 vom CET1-Zähler abgezogen — als Proxy der stressbedingten Risikovorsorge. Die regulatorische EL-Shortfall-Mechanik (CRR Art. 36, 62) wird nicht separat modelliert — eine bewusste Vereinfachung auf der konservativen Seite.</w:t>
+      </w:r>
+    </w:p>
+    <w:p>
+      <w:pPr>
+        <w:spacing w:after="140"/>
+      </w:pPr>
+      <w:r>
+        <w:rPr>
+          <w:b/>
+          <w:i w:val="0"/>
+          <w:sz w:val="21"/>
+        </w:rPr>
+        <w:t>Asset-Korrelation ρ je Klasse</w:t>
+      </w:r>
+      <w:r>
+        <w:rPr>
+          <w:b w:val="0"/>
+          <w:i w:val="0"/>
+          <w:sz w:val="21"/>
+        </w:rPr>
+        <w:t xml:space="preserve"> — regulatorisch fixiert (CRR Art. 153/154), keine Modellannahme:</w:t>
+      </w:r>
+    </w:p>
+    <w:tbl>
+      <w:tblPr>
+        <w:tblStyle w:val="TableGrid"/>
+        <w:tblW w:type="auto" w:w="0"/>
+        <w:jc w:val="center"/>
+        <w:tblLook w:firstColumn="1" w:firstRow="1" w:lastColumn="0" w:lastRow="0" w:noHBand="0" w:noVBand="1" w:val="04A0"/>
+      </w:tblPr>
+      <w:tblGrid>
+        <w:gridCol w:w="3137"/>
+        <w:gridCol w:w="3137"/>
+        <w:gridCol w:w="3137"/>
+      </w:tblGrid>
+      <w:tr>
+        <w:tc>
+          <w:tcPr>
+            <w:tcW w:type="dxa" w:w="2259"/>
+            <w:shd w:val="clear" w:fill="D9E4EC"/>
+          </w:tcPr>
+          <w:p>
+            <w:r/>
+            <w:r>
+              <w:rPr>
+                <w:b/>
+                <w:sz w:val="17"/>
+              </w:rPr>
+              <w:t>Klasse</w:t>
+            </w:r>
+          </w:p>
+        </w:tc>
+        <w:tc>
+          <w:tcPr>
+            <w:tcW w:type="dxa" w:w="4894"/>
+            <w:shd w:val="clear" w:fill="D9E4EC"/>
+          </w:tcPr>
+          <w:p>
+            <w:r/>
+            <w:r>
+              <w:rPr>
+                <w:b/>
+                <w:sz w:val="17"/>
+              </w:rPr>
+              <w:t>ρ-Festlegung (wie implementiert)</w:t>
+            </w:r>
+          </w:p>
+        </w:tc>
+        <w:tc>
+          <w:tcPr>
+            <w:tcW w:type="dxa" w:w="2259"/>
+            <w:shd w:val="clear" w:fill="D9E4EC"/>
+          </w:tcPr>
+          <w:p>
+            <w:r/>
+            <w:r>
+              <w:rPr>
+                <w:b/>
+                <w:sz w:val="17"/>
+              </w:rPr>
+              <w:t>Spanne / Wert</w:t>
+            </w:r>
+          </w:p>
+        </w:tc>
+      </w:tr>
+      <w:tr>
+        <w:tc>
+          <w:tcPr>
+            <w:tcW w:type="dxa" w:w="2259"/>
+          </w:tcPr>
+          <w:p>
+            <w:r/>
+            <w:r>
+              <w:rPr>
+                <w:b w:val="0"/>
+                <w:sz w:val="17"/>
+              </w:rPr>
+              <w:t>corporate, bank, sovereign</w:t>
+            </w:r>
+          </w:p>
+        </w:tc>
+        <w:tc>
+          <w:tcPr>
+            <w:tcW w:type="dxa" w:w="4894"/>
+          </w:tcPr>
+          <w:p>
+            <w:r/>
+            <w:r>
+              <w:rPr>
+                <w:b w:val="0"/>
+                <w:sz w:val="17"/>
+              </w:rPr>
+              <w:t>ρ = 0,12·R + 0,24·(1−R) mit R = (1−e^(−50·PD)) / (1−e^(−50))</w:t>
+            </w:r>
+          </w:p>
+        </w:tc>
+        <w:tc>
+          <w:tcPr>
+            <w:tcW w:type="dxa" w:w="2259"/>
+          </w:tcPr>
+          <w:p>
+            <w:r/>
+            <w:r>
+              <w:rPr>
+                <w:b w:val="0"/>
+                <w:sz w:val="17"/>
+              </w:rPr>
+              <w:t>0,24 → 0,12 (fallend in PD)</w:t>
+            </w:r>
+          </w:p>
+        </w:tc>
+      </w:tr>
+      <w:tr>
+        <w:tc>
+          <w:tcPr>
+            <w:tcW w:type="dxa" w:w="2259"/>
+          </w:tcPr>
+          <w:p>
+            <w:r/>
+            <w:r>
+              <w:rPr>
+                <w:b w:val="0"/>
+                <w:sz w:val="17"/>
+              </w:rPr>
+              <w:t>sme_corporate</w:t>
+            </w:r>
+          </w:p>
+        </w:tc>
+        <w:tc>
+          <w:tcPr>
+            <w:tcW w:type="dxa" w:w="4894"/>
+          </w:tcPr>
+          <w:p>
+            <w:r/>
+            <w:r>
+              <w:rPr>
+                <w:b w:val="0"/>
+                <w:sz w:val="17"/>
+              </w:rPr>
+              <w:t>wie corporate, abzüglich Größenanpassung 0,04 · (1−(S−5)/45) bei S = 20 Mio. €</w:t>
+            </w:r>
+          </w:p>
+        </w:tc>
+        <w:tc>
+          <w:tcPr>
+            <w:tcW w:type="dxa" w:w="2259"/>
+          </w:tcPr>
+          <w:p>
+            <w:r/>
+            <w:r>
+              <w:rPr>
+                <w:b w:val="0"/>
+                <w:sz w:val="17"/>
+              </w:rPr>
+              <w:t>Abschlag 0,027</w:t>
+            </w:r>
+          </w:p>
+        </w:tc>
+      </w:tr>
+      <w:tr>
+        <w:tc>
+          <w:tcPr>
+            <w:tcW w:type="dxa" w:w="2259"/>
+          </w:tcPr>
+          <w:p>
+            <w:r/>
+            <w:r>
+              <w:rPr>
+                <w:b w:val="0"/>
+                <w:sz w:val="17"/>
+              </w:rPr>
+              <w:t>mortgage</w:t>
+            </w:r>
+          </w:p>
+        </w:tc>
+        <w:tc>
+          <w:tcPr>
+            <w:tcW w:type="dxa" w:w="4894"/>
+          </w:tcPr>
+          <w:p>
+            <w:r/>
+            <w:r>
+              <w:rPr>
+                <w:b w:val="0"/>
+                <w:sz w:val="17"/>
+              </w:rPr>
+              <w:t>konstant</w:t>
+            </w:r>
+          </w:p>
+        </w:tc>
+        <w:tc>
+          <w:tcPr>
+            <w:tcW w:type="dxa" w:w="2259"/>
+          </w:tcPr>
+          <w:p>
+            <w:r/>
+            <w:r>
+              <w:rPr>
+                <w:b w:val="0"/>
+                <w:sz w:val="17"/>
+              </w:rPr>
+              <w:t>0,15</w:t>
+            </w:r>
+          </w:p>
+        </w:tc>
+      </w:tr>
+      <w:tr>
+        <w:tc>
+          <w:tcPr>
+            <w:tcW w:type="dxa" w:w="2259"/>
+          </w:tcPr>
+          <w:p>
+            <w:r/>
+            <w:r>
+              <w:rPr>
+                <w:b w:val="0"/>
+                <w:sz w:val="17"/>
+              </w:rPr>
+              <w:t>qrre</w:t>
+            </w:r>
+          </w:p>
+        </w:tc>
+        <w:tc>
+          <w:tcPr>
+            <w:tcW w:type="dxa" w:w="4894"/>
+          </w:tcPr>
+          <w:p>
+            <w:r/>
+            <w:r>
+              <w:rPr>
+                <w:b w:val="0"/>
+                <w:sz w:val="17"/>
+              </w:rPr>
+              <w:t>konstant</w:t>
+            </w:r>
+          </w:p>
+        </w:tc>
+        <w:tc>
+          <w:tcPr>
+            <w:tcW w:type="dxa" w:w="2259"/>
+          </w:tcPr>
+          <w:p>
+            <w:r/>
+            <w:r>
+              <w:rPr>
+                <w:b w:val="0"/>
+                <w:sz w:val="17"/>
+              </w:rPr>
+              <w:t>0,04</w:t>
+            </w:r>
+          </w:p>
+        </w:tc>
+      </w:tr>
+      <w:tr>
+        <w:tc>
+          <w:tcPr>
+            <w:tcW w:type="dxa" w:w="2259"/>
+          </w:tcPr>
+          <w:p>
+            <w:r/>
+            <w:r>
+              <w:rPr>
+                <w:b w:val="0"/>
+                <w:sz w:val="17"/>
+              </w:rPr>
+              <w:t>other_retail</w:t>
+            </w:r>
+          </w:p>
+        </w:tc>
+        <w:tc>
+          <w:tcPr>
+            <w:tcW w:type="dxa" w:w="4894"/>
+          </w:tcPr>
+          <w:p>
+            <w:r/>
+            <w:r>
+              <w:rPr>
+                <w:b w:val="0"/>
+                <w:sz w:val="17"/>
+              </w:rPr>
+              <w:t>ρ = 0,03·R₃₅ + 0,16·(1−R₃₅) mit R₃₅ analog (Faktor 35)</w:t>
+            </w:r>
+          </w:p>
+        </w:tc>
+        <w:tc>
+          <w:tcPr>
+            <w:tcW w:type="dxa" w:w="2259"/>
+          </w:tcPr>
+          <w:p>
+            <w:r/>
+            <w:r>
+              <w:rPr>
+                <w:b w:val="0"/>
+                <w:sz w:val="17"/>
+              </w:rPr>
+              <w:t>0,16 → 0,03 (fallend in PD)</w:t>
+            </w:r>
+          </w:p>
+        </w:tc>
+      </w:tr>
+    </w:tbl>
+    <w:p>
+      <w:pPr>
+        <w:spacing w:after="80"/>
+      </w:pPr>
+    </w:p>
+    <w:p>
+      <w:pPr>
+        <w:pStyle w:val="Heading2"/>
+      </w:pPr>
+      <w:r>
+        <w:t>Der Sovereign-Kanal konkret</w:t>
+      </w:r>
+    </w:p>
+    <w:p>
+      <w:pPr>
+        <w:spacing w:after="140"/>
+      </w:pPr>
+      <w:r>
+        <w:rPr>
+          <w:b w:val="0"/>
+          <w:i w:val="0"/>
+          <w:sz w:val="21"/>
+        </w:rPr>
+        <w:t xml:space="preserve">Parallel zum Kreditbuch werden die Staatsanleihebestände bewertet: </w:t>
+      </w:r>
+      <w:r>
+        <w:rPr>
+          <w:b/>
+          <w:i w:val="0"/>
+          <w:sz w:val="21"/>
+        </w:rPr>
+        <w:t>ΔMtM = −D_bucket · Δr · Exposure_bucket</w:t>
+      </w:r>
+      <w:r>
+        <w:rPr>
+          <w:b w:val="0"/>
+          <w:i w:val="0"/>
+          <w:sz w:val="21"/>
+        </w:rPr>
+        <w:t xml:space="preserve">, summiert über die EBA-Laufzeit-Buckets je Bank. Die Modified Duration je Bucket ist eine Konvention über den Bucket-Mittelpunkt — 0,125 / 0,625 / 1,5 / 2,5 / 4,0 / 7,5 Jahre für die geschlossenen Buckets; der offene &gt;10Y-Bucket konservativ mit </w:t>
+      </w:r>
+      <w:r>
+        <w:rPr>
+          <w:b/>
+          <w:i w:val="0"/>
+          <w:sz w:val="21"/>
+        </w:rPr>
+        <w:t>15 Jahren</w:t>
+      </w:r>
+      <w:r>
+        <w:rPr>
+          <w:b w:val="0"/>
+          <w:i w:val="0"/>
+          <w:sz w:val="21"/>
+        </w:rPr>
+        <w:t xml:space="preserve"> (angelehnt an das Basel-/EBA-Zeitband 10–15 J.; Slotting-Logik analog BCBS 368). CET1-wirksam ist nur der HfT/FVTPL/FVOCI-Anteil — dieser IFRS-9-Split ist </w:t>
+      </w:r>
+      <w:r>
+        <w:rPr>
+          <w:b/>
+          <w:i w:val="0"/>
+          <w:sz w:val="21"/>
+        </w:rPr>
+        <w:t>je Bank aus der EBA Transparency gemeldet</w:t>
+      </w:r>
+      <w:r>
+        <w:rPr>
+          <w:b w:val="0"/>
+          <w:i w:val="0"/>
+          <w:sz w:val="21"/>
+        </w:rPr>
+        <w:t>, keine Pauschal-Annahme; duration-gewichtet sind über die zehn Banken ≈ 51 % des Brutto-MtM CET1-wirksam. Konvexität ist vernachlässigt (linearer Duration-Ansatz — überzeichnet den Verlust bei großen Zinsanstiegen leicht, wirkt also konservativ). Der Kanal nutzt den EBA-Perimeter aller zehn Banken und ist unabhängig davon, ob eine Bank Staaten im IRB-Kreditbuch führt (Beispiel Santander: Standardansatz im Kreditbuch, vollständig im Sovereign-Kanal). Durationslogik nach Tuckman/Serrat (2012); die begleitenden Marktbuch-Analysen des Cockpits — Staaten-Banken-Verflechtung (Doom Loop) und latente Bewertungsverluste — stützen sich auf Brunnermeier et al. (2016), Acharya/Drechsler/Schnabl (2014) und Jiang et al. (2023).</w:t>
       </w:r>
     </w:p>
     <w:p>
@@ -2158,6 +4686,1127 @@
         <w:pStyle w:val="Heading2"/>
       </w:pPr>
       <w:r>
+        <w:t>Das Banken-Universum</w:t>
+      </w:r>
+    </w:p>
+    <w:p>
+      <w:pPr>
+        <w:spacing w:after="140"/>
+      </w:pPr>
+      <w:r>
+        <w:rPr>
+          <w:b w:val="0"/>
+          <w:i w:val="0"/>
+          <w:sz w:val="21"/>
+        </w:rPr>
+        <w:t xml:space="preserve">Die zehn größten EU-Banken nach IRB-EAD — zusammen </w:t>
+      </w:r>
+      <w:r>
+        <w:rPr>
+          <w:b/>
+          <w:i w:val="0"/>
+          <w:sz w:val="21"/>
+        </w:rPr>
+        <w:t>≈ 8,28 Bio. € IRB-EAD ≈ 56 %</w:t>
+      </w:r>
+      <w:r>
+        <w:rPr>
+          <w:b w:val="0"/>
+          <w:i w:val="0"/>
+          <w:sz w:val="21"/>
+        </w:rPr>
+        <w:t xml:space="preserve"> des gesamten IRB-EAD im EBA-Transparency-Datensatz (Auswahllogik: Annahme A-08). CET1-Quoten aus dem EBA-Kapitalpanel, Stichtag 31.12.2024:</w:t>
+      </w:r>
+    </w:p>
+    <w:tbl>
+      <w:tblPr>
+        <w:tblStyle w:val="TableGrid"/>
+        <w:tblW w:type="auto" w:w="0"/>
+        <w:jc w:val="center"/>
+        <w:tblLook w:firstColumn="1" w:firstRow="1" w:lastColumn="0" w:lastRow="0" w:noHBand="0" w:noVBand="1" w:val="04A0"/>
+      </w:tblPr>
+      <w:tblGrid>
+        <w:gridCol w:w="1569"/>
+        <w:gridCol w:w="1569"/>
+        <w:gridCol w:w="1569"/>
+        <w:gridCol w:w="1569"/>
+        <w:gridCol w:w="1569"/>
+        <w:gridCol w:w="1569"/>
+      </w:tblGrid>
+      <w:tr>
+        <w:tc>
+          <w:tcPr>
+            <w:tcW w:type="dxa" w:w="376"/>
+            <w:shd w:val="clear" w:fill="D9E4EC"/>
+          </w:tcPr>
+          <w:p>
+            <w:r/>
+            <w:r>
+              <w:rPr>
+                <w:b/>
+                <w:sz w:val="17"/>
+              </w:rPr>
+              <w:t>#</w:t>
+            </w:r>
+          </w:p>
+        </w:tc>
+        <w:tc>
+          <w:tcPr>
+            <w:tcW w:type="dxa" w:w="2541"/>
+            <w:shd w:val="clear" w:fill="D9E4EC"/>
+          </w:tcPr>
+          <w:p>
+            <w:r/>
+            <w:r>
+              <w:rPr>
+                <w:b/>
+                <w:sz w:val="17"/>
+              </w:rPr>
+              <w:t>Bank</w:t>
+            </w:r>
+          </w:p>
+        </w:tc>
+        <w:tc>
+          <w:tcPr>
+            <w:tcW w:type="dxa" w:w="659"/>
+            <w:shd w:val="clear" w:fill="D9E4EC"/>
+          </w:tcPr>
+          <w:p>
+            <w:r/>
+            <w:r>
+              <w:rPr>
+                <w:b/>
+                <w:sz w:val="17"/>
+              </w:rPr>
+              <w:t>Land</w:t>
+            </w:r>
+          </w:p>
+        </w:tc>
+        <w:tc>
+          <w:tcPr>
+            <w:tcW w:type="dxa" w:w="1600"/>
+            <w:shd w:val="clear" w:fill="D9E4EC"/>
+          </w:tcPr>
+          <w:p>
+            <w:r/>
+            <w:r>
+              <w:rPr>
+                <w:b/>
+                <w:sz w:val="17"/>
+              </w:rPr>
+              <w:t>IRB-EAD (Mrd €)</w:t>
+            </w:r>
+          </w:p>
+        </w:tc>
+        <w:tc>
+          <w:tcPr>
+            <w:tcW w:type="dxa" w:w="1412"/>
+            <w:shd w:val="clear" w:fill="D9E4EC"/>
+          </w:tcPr>
+          <w:p>
+            <w:r/>
+            <w:r>
+              <w:rPr>
+                <w:b/>
+                <w:sz w:val="17"/>
+              </w:rPr>
+              <w:t>CET1 31.12.24</w:t>
+            </w:r>
+          </w:p>
+        </w:tc>
+        <w:tc>
+          <w:tcPr>
+            <w:tcW w:type="dxa" w:w="2823"/>
+            <w:shd w:val="clear" w:fill="D9E4EC"/>
+          </w:tcPr>
+          <w:p>
+            <w:r/>
+            <w:r>
+              <w:rPr>
+                <w:b/>
+                <w:sz w:val="17"/>
+              </w:rPr>
+              <w:t>Backtest-Zellen</w:t>
+            </w:r>
+          </w:p>
+        </w:tc>
+      </w:tr>
+      <w:tr>
+        <w:tc>
+          <w:tcPr>
+            <w:tcW w:type="dxa" w:w="376"/>
+          </w:tcPr>
+          <w:p>
+            <w:r/>
+            <w:r>
+              <w:rPr>
+                <w:b w:val="0"/>
+                <w:sz w:val="17"/>
+              </w:rPr>
+              <w:t>1</w:t>
+            </w:r>
+          </w:p>
+        </w:tc>
+        <w:tc>
+          <w:tcPr>
+            <w:tcW w:type="dxa" w:w="2541"/>
+          </w:tcPr>
+          <w:p>
+            <w:r/>
+            <w:r>
+              <w:rPr>
+                <w:b w:val="0"/>
+                <w:sz w:val="17"/>
+              </w:rPr>
+              <w:t>Groupe Crédit Agricole ¹</w:t>
+            </w:r>
+          </w:p>
+        </w:tc>
+        <w:tc>
+          <w:tcPr>
+            <w:tcW w:type="dxa" w:w="659"/>
+          </w:tcPr>
+          <w:p>
+            <w:r/>
+            <w:r>
+              <w:rPr>
+                <w:b w:val="0"/>
+                <w:sz w:val="17"/>
+              </w:rPr>
+              <w:t>FR</w:t>
+            </w:r>
+          </w:p>
+        </w:tc>
+        <w:tc>
+          <w:tcPr>
+            <w:tcW w:type="dxa" w:w="1600"/>
+          </w:tcPr>
+          <w:p>
+            <w:r/>
+            <w:r>
+              <w:rPr>
+                <w:b w:val="0"/>
+                <w:sz w:val="17"/>
+              </w:rPr>
+              <w:t>1.646</w:t>
+            </w:r>
+          </w:p>
+        </w:tc>
+        <w:tc>
+          <w:tcPr>
+            <w:tcW w:type="dxa" w:w="1412"/>
+          </w:tcPr>
+          <w:p>
+            <w:r/>
+            <w:r>
+              <w:rPr>
+                <w:b w:val="0"/>
+                <w:sz w:val="17"/>
+              </w:rPr>
+              <w:t>17,2 %</w:t>
+            </w:r>
+          </w:p>
+        </w:tc>
+        <w:tc>
+          <w:tcPr>
+            <w:tcW w:type="dxa" w:w="2823"/>
+          </w:tcPr>
+          <w:p>
+            <w:r/>
+            <w:r>
+              <w:rPr>
+                <w:b w:val="0"/>
+                <w:sz w:val="17"/>
+              </w:rPr>
+              <w:t>27 (+1)*</w:t>
+            </w:r>
+          </w:p>
+        </w:tc>
+      </w:tr>
+      <w:tr>
+        <w:tc>
+          <w:tcPr>
+            <w:tcW w:type="dxa" w:w="376"/>
+          </w:tcPr>
+          <w:p>
+            <w:r/>
+            <w:r>
+              <w:rPr>
+                <w:b w:val="0"/>
+                <w:sz w:val="17"/>
+              </w:rPr>
+              <w:t>2</w:t>
+            </w:r>
+          </w:p>
+        </w:tc>
+        <w:tc>
+          <w:tcPr>
+            <w:tcW w:type="dxa" w:w="2541"/>
+          </w:tcPr>
+          <w:p>
+            <w:r/>
+            <w:r>
+              <w:rPr>
+                <w:b w:val="0"/>
+                <w:sz w:val="17"/>
+              </w:rPr>
+              <w:t>BNP Paribas</w:t>
+            </w:r>
+          </w:p>
+        </w:tc>
+        <w:tc>
+          <w:tcPr>
+            <w:tcW w:type="dxa" w:w="659"/>
+          </w:tcPr>
+          <w:p>
+            <w:r/>
+            <w:r>
+              <w:rPr>
+                <w:b w:val="0"/>
+                <w:sz w:val="17"/>
+              </w:rPr>
+              <w:t>FR</w:t>
+            </w:r>
+          </w:p>
+        </w:tc>
+        <w:tc>
+          <w:tcPr>
+            <w:tcW w:type="dxa" w:w="1600"/>
+          </w:tcPr>
+          <w:p>
+            <w:r/>
+            <w:r>
+              <w:rPr>
+                <w:b w:val="0"/>
+                <w:sz w:val="17"/>
+              </w:rPr>
+              <w:t>1.301</w:t>
+            </w:r>
+          </w:p>
+        </w:tc>
+        <w:tc>
+          <w:tcPr>
+            <w:tcW w:type="dxa" w:w="1412"/>
+          </w:tcPr>
+          <w:p>
+            <w:r/>
+            <w:r>
+              <w:rPr>
+                <w:b w:val="0"/>
+                <w:sz w:val="17"/>
+              </w:rPr>
+              <w:t>12,9 %</w:t>
+            </w:r>
+          </w:p>
+        </w:tc>
+        <w:tc>
+          <w:tcPr>
+            <w:tcW w:type="dxa" w:w="2823"/>
+          </w:tcPr>
+          <w:p>
+            <w:r/>
+            <w:r>
+              <w:rPr>
+                <w:b w:val="0"/>
+                <w:sz w:val="17"/>
+              </w:rPr>
+              <w:t>28</w:t>
+            </w:r>
+          </w:p>
+        </w:tc>
+      </w:tr>
+      <w:tr>
+        <w:tc>
+          <w:tcPr>
+            <w:tcW w:type="dxa" w:w="376"/>
+          </w:tcPr>
+          <w:p>
+            <w:r/>
+            <w:r>
+              <w:rPr>
+                <w:b w:val="0"/>
+                <w:sz w:val="17"/>
+              </w:rPr>
+              <w:t>3</w:t>
+            </w:r>
+          </w:p>
+        </w:tc>
+        <w:tc>
+          <w:tcPr>
+            <w:tcW w:type="dxa" w:w="2541"/>
+          </w:tcPr>
+          <w:p>
+            <w:r/>
+            <w:r>
+              <w:rPr>
+                <w:b w:val="0"/>
+                <w:sz w:val="17"/>
+              </w:rPr>
+              <w:t>ING Groep</w:t>
+            </w:r>
+          </w:p>
+        </w:tc>
+        <w:tc>
+          <w:tcPr>
+            <w:tcW w:type="dxa" w:w="659"/>
+          </w:tcPr>
+          <w:p>
+            <w:r/>
+            <w:r>
+              <w:rPr>
+                <w:b w:val="0"/>
+                <w:sz w:val="17"/>
+              </w:rPr>
+              <w:t>NL</w:t>
+            </w:r>
+          </w:p>
+        </w:tc>
+        <w:tc>
+          <w:tcPr>
+            <w:tcW w:type="dxa" w:w="1600"/>
+          </w:tcPr>
+          <w:p>
+            <w:r/>
+            <w:r>
+              <w:rPr>
+                <w:b w:val="0"/>
+                <w:sz w:val="17"/>
+              </w:rPr>
+              <w:t>928</w:t>
+            </w:r>
+          </w:p>
+        </w:tc>
+        <w:tc>
+          <w:tcPr>
+            <w:tcW w:type="dxa" w:w="1412"/>
+          </w:tcPr>
+          <w:p>
+            <w:r/>
+            <w:r>
+              <w:rPr>
+                <w:b w:val="0"/>
+                <w:sz w:val="17"/>
+              </w:rPr>
+              <w:t>13,6 %</w:t>
+            </w:r>
+          </w:p>
+        </w:tc>
+        <w:tc>
+          <w:tcPr>
+            <w:tcW w:type="dxa" w:w="2823"/>
+          </w:tcPr>
+          <w:p>
+            <w:r/>
+            <w:r>
+              <w:rPr>
+                <w:b w:val="0"/>
+                <w:sz w:val="17"/>
+              </w:rPr>
+              <w:t>24 ²</w:t>
+            </w:r>
+          </w:p>
+        </w:tc>
+      </w:tr>
+      <w:tr>
+        <w:tc>
+          <w:tcPr>
+            <w:tcW w:type="dxa" w:w="376"/>
+          </w:tcPr>
+          <w:p>
+            <w:r/>
+            <w:r>
+              <w:rPr>
+                <w:b w:val="0"/>
+                <w:sz w:val="17"/>
+              </w:rPr>
+              <w:t>4</w:t>
+            </w:r>
+          </w:p>
+        </w:tc>
+        <w:tc>
+          <w:tcPr>
+            <w:tcW w:type="dxa" w:w="2541"/>
+          </w:tcPr>
+          <w:p>
+            <w:r/>
+            <w:r>
+              <w:rPr>
+                <w:b w:val="0"/>
+                <w:sz w:val="17"/>
+              </w:rPr>
+              <w:t>Société Générale</w:t>
+            </w:r>
+          </w:p>
+        </w:tc>
+        <w:tc>
+          <w:tcPr>
+            <w:tcW w:type="dxa" w:w="659"/>
+          </w:tcPr>
+          <w:p>
+            <w:r/>
+            <w:r>
+              <w:rPr>
+                <w:b w:val="0"/>
+                <w:sz w:val="17"/>
+              </w:rPr>
+              <w:t>FR</w:t>
+            </w:r>
+          </w:p>
+        </w:tc>
+        <w:tc>
+          <w:tcPr>
+            <w:tcW w:type="dxa" w:w="1600"/>
+          </w:tcPr>
+          <w:p>
+            <w:r/>
+            <w:r>
+              <w:rPr>
+                <w:b w:val="0"/>
+                <w:sz w:val="17"/>
+              </w:rPr>
+              <w:t>791</w:t>
+            </w:r>
+          </w:p>
+        </w:tc>
+        <w:tc>
+          <w:tcPr>
+            <w:tcW w:type="dxa" w:w="1412"/>
+          </w:tcPr>
+          <w:p>
+            <w:r/>
+            <w:r>
+              <w:rPr>
+                <w:b w:val="0"/>
+                <w:sz w:val="17"/>
+              </w:rPr>
+              <w:t>13,3 %</w:t>
+            </w:r>
+          </w:p>
+        </w:tc>
+        <w:tc>
+          <w:tcPr>
+            <w:tcW w:type="dxa" w:w="2823"/>
+          </w:tcPr>
+          <w:p>
+            <w:r/>
+            <w:r>
+              <w:rPr>
+                <w:b w:val="0"/>
+                <w:sz w:val="17"/>
+              </w:rPr>
+              <w:t>27 (+1)*</w:t>
+            </w:r>
+          </w:p>
+        </w:tc>
+      </w:tr>
+      <w:tr>
+        <w:tc>
+          <w:tcPr>
+            <w:tcW w:type="dxa" w:w="376"/>
+          </w:tcPr>
+          <w:p>
+            <w:r/>
+            <w:r>
+              <w:rPr>
+                <w:b w:val="0"/>
+                <w:sz w:val="17"/>
+              </w:rPr>
+              <w:t>5</w:t>
+            </w:r>
+          </w:p>
+        </w:tc>
+        <w:tc>
+          <w:tcPr>
+            <w:tcW w:type="dxa" w:w="2541"/>
+          </w:tcPr>
+          <w:p>
+            <w:r/>
+            <w:r>
+              <w:rPr>
+                <w:b w:val="0"/>
+                <w:sz w:val="17"/>
+              </w:rPr>
+              <w:t>Groupe BPCE</w:t>
+            </w:r>
+          </w:p>
+        </w:tc>
+        <w:tc>
+          <w:tcPr>
+            <w:tcW w:type="dxa" w:w="659"/>
+          </w:tcPr>
+          <w:p>
+            <w:r/>
+            <w:r>
+              <w:rPr>
+                <w:b w:val="0"/>
+                <w:sz w:val="17"/>
+              </w:rPr>
+              <w:t>FR</w:t>
+            </w:r>
+          </w:p>
+        </w:tc>
+        <w:tc>
+          <w:tcPr>
+            <w:tcW w:type="dxa" w:w="1600"/>
+          </w:tcPr>
+          <w:p>
+            <w:r/>
+            <w:r>
+              <w:rPr>
+                <w:b w:val="0"/>
+                <w:sz w:val="17"/>
+              </w:rPr>
+              <w:t>777</w:t>
+            </w:r>
+          </w:p>
+        </w:tc>
+        <w:tc>
+          <w:tcPr>
+            <w:tcW w:type="dxa" w:w="1412"/>
+          </w:tcPr>
+          <w:p>
+            <w:r/>
+            <w:r>
+              <w:rPr>
+                <w:b w:val="0"/>
+                <w:sz w:val="17"/>
+              </w:rPr>
+              <w:t>16,2 %</w:t>
+            </w:r>
+          </w:p>
+        </w:tc>
+        <w:tc>
+          <w:tcPr>
+            <w:tcW w:type="dxa" w:w="2823"/>
+          </w:tcPr>
+          <w:p>
+            <w:r/>
+            <w:r>
+              <w:rPr>
+                <w:b w:val="0"/>
+                <w:sz w:val="17"/>
+              </w:rPr>
+              <w:t>28</w:t>
+            </w:r>
+          </w:p>
+        </w:tc>
+      </w:tr>
+      <w:tr>
+        <w:tc>
+          <w:tcPr>
+            <w:tcW w:type="dxa" w:w="376"/>
+          </w:tcPr>
+          <w:p>
+            <w:r/>
+            <w:r>
+              <w:rPr>
+                <w:b w:val="0"/>
+                <w:sz w:val="17"/>
+              </w:rPr>
+              <w:t>6</w:t>
+            </w:r>
+          </w:p>
+        </w:tc>
+        <w:tc>
+          <w:tcPr>
+            <w:tcW w:type="dxa" w:w="2541"/>
+          </w:tcPr>
+          <w:p>
+            <w:r/>
+            <w:r>
+              <w:rPr>
+                <w:b w:val="0"/>
+                <w:sz w:val="17"/>
+              </w:rPr>
+              <w:t>Deutsche Bank</w:t>
+            </w:r>
+          </w:p>
+        </w:tc>
+        <w:tc>
+          <w:tcPr>
+            <w:tcW w:type="dxa" w:w="659"/>
+          </w:tcPr>
+          <w:p>
+            <w:r/>
+            <w:r>
+              <w:rPr>
+                <w:b w:val="0"/>
+                <w:sz w:val="17"/>
+              </w:rPr>
+              <w:t>DE</w:t>
+            </w:r>
+          </w:p>
+        </w:tc>
+        <w:tc>
+          <w:tcPr>
+            <w:tcW w:type="dxa" w:w="1600"/>
+          </w:tcPr>
+          <w:p>
+            <w:r/>
+            <w:r>
+              <w:rPr>
+                <w:b w:val="0"/>
+                <w:sz w:val="17"/>
+              </w:rPr>
+              <w:t>739</w:t>
+            </w:r>
+          </w:p>
+        </w:tc>
+        <w:tc>
+          <w:tcPr>
+            <w:tcW w:type="dxa" w:w="1412"/>
+          </w:tcPr>
+          <w:p>
+            <w:r/>
+            <w:r>
+              <w:rPr>
+                <w:b w:val="0"/>
+                <w:sz w:val="17"/>
+              </w:rPr>
+              <w:t>13,8 %</w:t>
+            </w:r>
+          </w:p>
+        </w:tc>
+        <w:tc>
+          <w:tcPr>
+            <w:tcW w:type="dxa" w:w="2823"/>
+          </w:tcPr>
+          <w:p>
+            <w:r/>
+            <w:r>
+              <w:rPr>
+                <w:b w:val="0"/>
+                <w:sz w:val="17"/>
+              </w:rPr>
+              <w:t>28</w:t>
+            </w:r>
+          </w:p>
+        </w:tc>
+      </w:tr>
+      <w:tr>
+        <w:tc>
+          <w:tcPr>
+            <w:tcW w:type="dxa" w:w="376"/>
+          </w:tcPr>
+          <w:p>
+            <w:r/>
+            <w:r>
+              <w:rPr>
+                <w:b w:val="0"/>
+                <w:sz w:val="17"/>
+              </w:rPr>
+              <w:t>7</w:t>
+            </w:r>
+          </w:p>
+        </w:tc>
+        <w:tc>
+          <w:tcPr>
+            <w:tcW w:type="dxa" w:w="2541"/>
+          </w:tcPr>
+          <w:p>
+            <w:r/>
+            <w:r>
+              <w:rPr>
+                <w:b w:val="0"/>
+                <w:sz w:val="17"/>
+              </w:rPr>
+              <w:t>Crédit Mutuel</w:t>
+            </w:r>
+          </w:p>
+        </w:tc>
+        <w:tc>
+          <w:tcPr>
+            <w:tcW w:type="dxa" w:w="659"/>
+          </w:tcPr>
+          <w:p>
+            <w:r/>
+            <w:r>
+              <w:rPr>
+                <w:b w:val="0"/>
+                <w:sz w:val="17"/>
+              </w:rPr>
+              <w:t>FR</w:t>
+            </w:r>
+          </w:p>
+        </w:tc>
+        <w:tc>
+          <w:tcPr>
+            <w:tcW w:type="dxa" w:w="1600"/>
+          </w:tcPr>
+          <w:p>
+            <w:r/>
+            <w:r>
+              <w:rPr>
+                <w:b w:val="0"/>
+                <w:sz w:val="17"/>
+              </w:rPr>
+              <w:t>627</w:t>
+            </w:r>
+          </w:p>
+        </w:tc>
+        <w:tc>
+          <w:tcPr>
+            <w:tcW w:type="dxa" w:w="1412"/>
+          </w:tcPr>
+          <w:p>
+            <w:r/>
+            <w:r>
+              <w:rPr>
+                <w:b w:val="0"/>
+                <w:sz w:val="17"/>
+              </w:rPr>
+              <w:t>19,4 %</w:t>
+            </w:r>
+          </w:p>
+        </w:tc>
+        <w:tc>
+          <w:tcPr>
+            <w:tcW w:type="dxa" w:w="2823"/>
+          </w:tcPr>
+          <w:p>
+            <w:r/>
+            <w:r>
+              <w:rPr>
+                <w:b w:val="0"/>
+                <w:sz w:val="17"/>
+              </w:rPr>
+              <w:t>19 ³</w:t>
+            </w:r>
+          </w:p>
+        </w:tc>
+      </w:tr>
+      <w:tr>
+        <w:tc>
+          <w:tcPr>
+            <w:tcW w:type="dxa" w:w="376"/>
+          </w:tcPr>
+          <w:p>
+            <w:r/>
+            <w:r>
+              <w:rPr>
+                <w:b w:val="0"/>
+                <w:sz w:val="17"/>
+              </w:rPr>
+              <w:t>8</w:t>
+            </w:r>
+          </w:p>
+        </w:tc>
+        <w:tc>
+          <w:tcPr>
+            <w:tcW w:type="dxa" w:w="2541"/>
+          </w:tcPr>
+          <w:p>
+            <w:r/>
+            <w:r>
+              <w:rPr>
+                <w:b w:val="0"/>
+                <w:sz w:val="17"/>
+              </w:rPr>
+              <w:t>Banco Santander</w:t>
+            </w:r>
+          </w:p>
+        </w:tc>
+        <w:tc>
+          <w:tcPr>
+            <w:tcW w:type="dxa" w:w="659"/>
+          </w:tcPr>
+          <w:p>
+            <w:r/>
+            <w:r>
+              <w:rPr>
+                <w:b w:val="0"/>
+                <w:sz w:val="17"/>
+              </w:rPr>
+              <w:t>ES</w:t>
+            </w:r>
+          </w:p>
+        </w:tc>
+        <w:tc>
+          <w:tcPr>
+            <w:tcW w:type="dxa" w:w="1600"/>
+          </w:tcPr>
+          <w:p>
+            <w:r/>
+            <w:r>
+              <w:rPr>
+                <w:b w:val="0"/>
+                <w:sz w:val="17"/>
+              </w:rPr>
+              <w:t>595</w:t>
+            </w:r>
+          </w:p>
+        </w:tc>
+        <w:tc>
+          <w:tcPr>
+            <w:tcW w:type="dxa" w:w="1412"/>
+          </w:tcPr>
+          <w:p>
+            <w:r/>
+            <w:r>
+              <w:rPr>
+                <w:b w:val="0"/>
+                <w:sz w:val="17"/>
+              </w:rPr>
+              <w:t>12,8 %</w:t>
+            </w:r>
+          </w:p>
+        </w:tc>
+        <w:tc>
+          <w:tcPr>
+            <w:tcW w:type="dxa" w:w="2823"/>
+          </w:tcPr>
+          <w:p>
+            <w:r/>
+            <w:r>
+              <w:rPr>
+                <w:b w:val="0"/>
+                <w:sz w:val="17"/>
+              </w:rPr>
+              <w:t>24</w:t>
+            </w:r>
+          </w:p>
+        </w:tc>
+      </w:tr>
+      <w:tr>
+        <w:tc>
+          <w:tcPr>
+            <w:tcW w:type="dxa" w:w="376"/>
+          </w:tcPr>
+          <w:p>
+            <w:r/>
+            <w:r>
+              <w:rPr>
+                <w:b w:val="0"/>
+                <w:sz w:val="17"/>
+              </w:rPr>
+              <w:t>9</w:t>
+            </w:r>
+          </w:p>
+        </w:tc>
+        <w:tc>
+          <w:tcPr>
+            <w:tcW w:type="dxa" w:w="2541"/>
+          </w:tcPr>
+          <w:p>
+            <w:r/>
+            <w:r>
+              <w:rPr>
+                <w:b w:val="0"/>
+                <w:sz w:val="17"/>
+              </w:rPr>
+              <w:t>Coöperatieve Rabobank</w:t>
+            </w:r>
+          </w:p>
+        </w:tc>
+        <w:tc>
+          <w:tcPr>
+            <w:tcW w:type="dxa" w:w="659"/>
+          </w:tcPr>
+          <w:p>
+            <w:r/>
+            <w:r>
+              <w:rPr>
+                <w:b w:val="0"/>
+                <w:sz w:val="17"/>
+              </w:rPr>
+              <w:t>NL</w:t>
+            </w:r>
+          </w:p>
+        </w:tc>
+        <w:tc>
+          <w:tcPr>
+            <w:tcW w:type="dxa" w:w="1600"/>
+          </w:tcPr>
+          <w:p>
+            <w:r/>
+            <w:r>
+              <w:rPr>
+                <w:b w:val="0"/>
+                <w:sz w:val="17"/>
+              </w:rPr>
+              <w:t>469</w:t>
+            </w:r>
+          </w:p>
+        </w:tc>
+        <w:tc>
+          <w:tcPr>
+            <w:tcW w:type="dxa" w:w="1412"/>
+          </w:tcPr>
+          <w:p>
+            <w:r/>
+            <w:r>
+              <w:rPr>
+                <w:b w:val="0"/>
+                <w:sz w:val="17"/>
+              </w:rPr>
+              <w:t>16,9 %</w:t>
+            </w:r>
+          </w:p>
+        </w:tc>
+        <w:tc>
+          <w:tcPr>
+            <w:tcW w:type="dxa" w:w="2823"/>
+          </w:tcPr>
+          <w:p>
+            <w:r/>
+            <w:r>
+              <w:rPr>
+                <w:b w:val="0"/>
+                <w:sz w:val="17"/>
+              </w:rPr>
+              <w:t>24</w:t>
+            </w:r>
+          </w:p>
+        </w:tc>
+      </w:tr>
+      <w:tr>
+        <w:tc>
+          <w:tcPr>
+            <w:tcW w:type="dxa" w:w="376"/>
+          </w:tcPr>
+          <w:p>
+            <w:r/>
+            <w:r>
+              <w:rPr>
+                <w:b w:val="0"/>
+                <w:sz w:val="17"/>
+              </w:rPr>
+              <w:t>10</w:t>
+            </w:r>
+          </w:p>
+        </w:tc>
+        <w:tc>
+          <w:tcPr>
+            <w:tcW w:type="dxa" w:w="2541"/>
+          </w:tcPr>
+          <w:p>
+            <w:r/>
+            <w:r>
+              <w:rPr>
+                <w:b w:val="0"/>
+                <w:sz w:val="17"/>
+              </w:rPr>
+              <w:t>UniCredit</w:t>
+            </w:r>
+          </w:p>
+        </w:tc>
+        <w:tc>
+          <w:tcPr>
+            <w:tcW w:type="dxa" w:w="659"/>
+          </w:tcPr>
+          <w:p>
+            <w:r/>
+            <w:r>
+              <w:rPr>
+                <w:b w:val="0"/>
+                <w:sz w:val="17"/>
+              </w:rPr>
+              <w:t>IT</w:t>
+            </w:r>
+          </w:p>
+        </w:tc>
+        <w:tc>
+          <w:tcPr>
+            <w:tcW w:type="dxa" w:w="1600"/>
+          </w:tcPr>
+          <w:p>
+            <w:r/>
+            <w:r>
+              <w:rPr>
+                <w:b w:val="0"/>
+                <w:sz w:val="17"/>
+              </w:rPr>
+              <w:t>409</w:t>
+            </w:r>
+          </w:p>
+        </w:tc>
+        <w:tc>
+          <w:tcPr>
+            <w:tcW w:type="dxa" w:w="1412"/>
+          </w:tcPr>
+          <w:p>
+            <w:r/>
+            <w:r>
+              <w:rPr>
+                <w:b w:val="0"/>
+                <w:sz w:val="17"/>
+              </w:rPr>
+              <w:t>16,0 %</w:t>
+            </w:r>
+          </w:p>
+        </w:tc>
+        <w:tc>
+          <w:tcPr>
+            <w:tcW w:type="dxa" w:w="2823"/>
+          </w:tcPr>
+          <w:p>
+            <w:r/>
+            <w:r>
+              <w:rPr>
+                <w:b w:val="0"/>
+                <w:sz w:val="17"/>
+              </w:rPr>
+              <w:t>24</w:t>
+            </w:r>
+          </w:p>
+        </w:tc>
+      </w:tr>
+    </w:tbl>
+    <w:p>
+      <w:pPr>
+        <w:spacing w:after="80"/>
+      </w:pPr>
+    </w:p>
+    <w:p>
+      <w:pPr>
+        <w:spacing w:after="140"/>
+      </w:pPr>
+      <w:r>
+        <w:rPr>
+          <w:b w:val="0"/>
+          <w:i/>
+          <w:sz w:val="17"/>
+        </w:rPr>
+        <w:t xml:space="preserve">¹ Live-Universum auf Gruppenebene (LEI FR969500TJ5KRTCJQWXH); die Backtest-Reihe läuft auf der börsennotierten </w:t>
+      </w:r>
+      <w:r>
+        <w:rPr>
+          <w:b/>
+          <w:i/>
+          <w:sz w:val="17"/>
+        </w:rPr>
+        <w:t>Crédit Agricole S.A.</w:t>
+      </w:r>
+      <w:r>
+        <w:rPr>
+          <w:b w:val="0"/>
+          <w:i/>
+          <w:sz w:val="17"/>
+        </w:rPr>
+        <w:t xml:space="preserve"> (LEI F0HUI1NY1AZMJMD8LP67, CET1 18,8 %) — der Ebene des EBA-Transparency-Kapitalpanels. · * (+1) = eine zusätzliche quellenbelegte, aber modell-ausgeschlossene Audit-Zeile (`include_in_backtest = 0`, siehe unten). · ² inkl. der ING-spezifischen Zusatzklasse mortgage_sme; kein QRRE-/Sovereign-A-IRB im Meldeumfang. · ³ dünnster Meldeumfang (5 Klassen); enthält die einzige offene Zelle (corporate 2021). Summe genutzter Backtest-Zeilen: </w:t>
+      </w:r>
+      <w:r>
+        <w:rPr>
+          <w:b/>
+          <w:i/>
+          <w:sz w:val="17"/>
+        </w:rPr>
+        <w:t>253</w:t>
+      </w:r>
+      <w:r>
+        <w:rPr>
+          <w:b w:val="0"/>
+          <w:i/>
+          <w:sz w:val="17"/>
+        </w:rPr>
+        <w:t>.</w:t>
+      </w:r>
+    </w:p>
+    <w:p>
+      <w:pPr>
+        <w:pStyle w:val="Heading2"/>
+      </w:pPr>
+      <w:r>
         <w:t>Live-Snapshot (Cockpit)</w:t>
       </w:r>
     </w:p>
@@ -2195,7 +5844,7 @@
           <w:i w:val="0"/>
           <w:sz w:val="21"/>
         </w:rPr>
-        <w:t>, jede Zeile direkt aus dem EU-CR6-Sub-total des jeweiligen Pillar-3-Reports mit Seiten- und URL-Beleg (Konfidenzklasse [published]). Santander-Sovereign läuft regulatorisch im Standardansatz und ist daher aus dem IRB-Kreditbuch ausgenommen.</w:t>
+        <w:t>; 69 der 70 Zeilen tragen PD/LGD-Werte direkt aus dem EU-CR6-Sub-total des jeweiligen Pillar-3-Reports mit Seiten- und URL-Beleg (Konfidenzklasse [published]). Die 70. Zeile — Santander-Sovereign — ist ein dokumentierter Platzhalter ohne IRB-Parameter, weil Santander Staaten regulatorisch im Standardansatz führt (im Sovereign-MtM-Kanal, Abschnitt 4, ist Santander dennoch vollständig enthalten).</w:t>
       </w:r>
     </w:p>
     <w:p>
@@ -2248,7 +5897,7 @@
           <w:i w:val="0"/>
           <w:sz w:val="21"/>
         </w:rPr>
-        <w:t xml:space="preserve"> (255 von 256 gemeldeten Zellen) - Klassen, die eine Bank gar nicht im A-IRB führt, zählen nicht als Lücke. Davon sind </w:t>
+        <w:t xml:space="preserve"> (255 von 256 gemeldeten Zellen) — Klassen, die eine Bank gar nicht im A-IRB führt, zählen nicht als Lücke. Davon sind </w:t>
       </w:r>
       <w:r>
         <w:rPr>
@@ -3113,7 +6762,7 @@
                 <w:b w:val="0"/>
                 <w:sz w:val="17"/>
               </w:rPr>
-              <w:t>kein eigener Kanal (entfernt — kleine Handelsbücher, keine belastbare FRTB-Kalibrierung)</w:t>
+              <w:t>kein eigener Kanal (kleine Handelsbücher, keine belastbare öffentliche FRTB-Kalibrierung)</w:t>
             </w:r>
           </w:p>
         </w:tc>
@@ -3143,7 +6792,7 @@
                 <w:b w:val="0"/>
                 <w:sz w:val="17"/>
               </w:rPr>
-              <w:t>Änderungsprotokoll 06/2026</w:t>
+              <w:t>Scope-Abgrenzung</w:t>
             </w:r>
           </w:p>
         </w:tc>
@@ -3990,7 +7639,7 @@
           <w:i w:val="0"/>
           <w:sz w:val="19"/>
         </w:rPr>
-        <w:t xml:space="preserve"> ein Kanal mit angenommenem Marktrisiko-Multiplikator (frühere Version, entfernt). </w:t>
+        <w:t xml:space="preserve"> ein Kanal mit angenommenem Marktrisiko-Multiplikator ohne bankindividuelle Datenbasis. </w:t>
       </w:r>
       <w:r>
         <w:rPr>
@@ -4006,7 +7655,7 @@
           <w:i w:val="0"/>
           <w:sz w:val="19"/>
         </w:rPr>
-        <w:t xml:space="preserve"> Für Banken mit größerem Handelsbuch wird der Stress tendenziell unterschätzt — als Scope-Grenze dokumentiert (Abschnitt 8).</w:t>
+        <w:t xml:space="preserve"> Für Banken mit größerem Handelsbuch wird der Stress tendenziell unterschätzt; diese Grenze ist als Scope-Grenze dokumentiert (Abschnitt 8).</w:t>
       </w:r>
     </w:p>
     <w:p>
@@ -4428,7 +8077,7 @@
                 <w:b/>
                 <w:sz w:val="18"/>
               </w:rPr>
-              <w:t>≈ 1,3 pp</w:t>
+              <w:t>1,26 pp</w:t>
             </w:r>
           </w:p>
         </w:tc>
@@ -4569,7 +8218,7 @@
                 <w:b/>
                 <w:sz w:val="18"/>
               </w:rPr>
-              <w:t>−1,0 pp</w:t>
+              <w:t>-0,99 pp</w:t>
             </w:r>
           </w:p>
         </w:tc>
@@ -4605,7 +8254,299 @@
           <w:i w:val="0"/>
           <w:sz w:val="19"/>
         </w:rPr>
-        <w:t>Alle 10 Banken sind in allen drei Backtest-Jahren vertreten (30 von 30 möglichen Bank-Jahren). Im Zinsschock-Jahr 2022 liegt das Modell bei allen 10 Banken auf der konservativen Seite (Ø −2,5 pp — der bewusst nicht angesetzte NII-Gegeneffekt); in den ruhigeren Jahren 2023/2024 beträgt der mittlere Fehler nur 0,5 bzw. 0,8 pp.</w:t>
+        <w:t>Alle 10 Banken sind in allen drei Backtest-Jahren vertreten (30 von 30 möglichen Bank-Jahren). Im Zinsschock-Jahr 2022 liegt das Modell bei allen 10 Banken auf der konservativen Seite (Ø -2,49 pp — der bewusst nicht angesetzte NII-Gegeneffekt); in den ruhigeren Jahren 2023/2024 beträgt der mittlere Fehler 0,48 bzw. 0,81 pp.</w:t>
+      </w:r>
+    </w:p>
+    <w:p>
+      <w:pPr>
+        <w:pStyle w:val="Heading2"/>
+      </w:pPr>
+      <w:r>
+        <w:t>Robustheit der Stress-Transmission</w:t>
+      </w:r>
+    </w:p>
+    <w:tbl>
+      <w:tblPr>
+        <w:tblStyle w:val="TableGrid"/>
+        <w:tblW w:type="auto" w:w="0"/>
+        <w:jc w:val="center"/>
+        <w:tblLook w:firstColumn="1" w:firstRow="1" w:lastColumn="0" w:lastRow="0" w:noHBand="0" w:noVBand="1" w:val="04A0"/>
+      </w:tblPr>
+      <w:tblGrid>
+        <w:gridCol w:w="2353"/>
+        <w:gridCol w:w="2353"/>
+        <w:gridCol w:w="2353"/>
+        <w:gridCol w:w="2353"/>
+      </w:tblGrid>
+      <w:tr>
+        <w:tc>
+          <w:tcPr>
+            <w:tcW w:type="dxa" w:w="2070"/>
+            <w:shd w:val="clear" w:fill="D9E4EC"/>
+          </w:tcPr>
+          <w:p>
+            <w:r/>
+            <w:r>
+              <w:rPr>
+                <w:b/>
+                <w:sz w:val="17"/>
+              </w:rPr>
+              <w:t>Test</w:t>
+            </w:r>
+          </w:p>
+        </w:tc>
+        <w:tc>
+          <w:tcPr>
+            <w:tcW w:type="dxa" w:w="1318"/>
+            <w:shd w:val="clear" w:fill="D9E4EC"/>
+          </w:tcPr>
+          <w:p>
+            <w:r/>
+            <w:r>
+              <w:rPr>
+                <w:b/>
+                <w:sz w:val="17"/>
+              </w:rPr>
+              <w:t>MAE</w:t>
+            </w:r>
+          </w:p>
+        </w:tc>
+        <w:tc>
+          <w:tcPr>
+            <w:tcW w:type="dxa" w:w="1318"/>
+            <w:shd w:val="clear" w:fill="D9E4EC"/>
+          </w:tcPr>
+          <w:p>
+            <w:r/>
+            <w:r>
+              <w:rPr>
+                <w:b/>
+                <w:sz w:val="17"/>
+              </w:rPr>
+              <w:t>Bias</w:t>
+            </w:r>
+          </w:p>
+        </w:tc>
+        <w:tc>
+          <w:tcPr>
+            <w:tcW w:type="dxa" w:w="4706"/>
+            <w:shd w:val="clear" w:fill="D9E4EC"/>
+          </w:tcPr>
+          <w:p>
+            <w:r/>
+            <w:r>
+              <w:rPr>
+                <w:b/>
+                <w:sz w:val="17"/>
+              </w:rPr>
+              <w:t>Einordnung</w:t>
+            </w:r>
+          </w:p>
+        </w:tc>
+      </w:tr>
+      <w:tr>
+        <w:tc>
+          <w:tcPr>
+            <w:tcW w:type="dxa" w:w="2070"/>
+          </w:tcPr>
+          <w:p>
+            <w:r/>
+            <w:r>
+              <w:rPr>
+                <w:b w:val="0"/>
+                <w:sz w:val="17"/>
+              </w:rPr>
+              <w:t>β/γ × 0,5</w:t>
+            </w:r>
+          </w:p>
+        </w:tc>
+        <w:tc>
+          <w:tcPr>
+            <w:tcW w:type="dxa" w:w="1318"/>
+          </w:tcPr>
+          <w:p>
+            <w:r/>
+            <w:r>
+              <w:rPr>
+                <w:b w:val="0"/>
+                <w:sz w:val="17"/>
+              </w:rPr>
+              <w:t>0,80 pp</w:t>
+            </w:r>
+          </w:p>
+        </w:tc>
+        <w:tc>
+          <w:tcPr>
+            <w:tcW w:type="dxa" w:w="1318"/>
+          </w:tcPr>
+          <w:p>
+            <w:r/>
+            <w:r>
+              <w:rPr>
+                <w:b w:val="0"/>
+                <w:sz w:val="17"/>
+              </w:rPr>
+              <w:t>-0,63 pp</w:t>
+            </w:r>
+          </w:p>
+        </w:tc>
+        <w:tc>
+          <w:tcPr>
+            <w:tcW w:type="dxa" w:w="4706"/>
+          </w:tcPr>
+          <w:p>
+            <w:r/>
+            <w:r>
+              <w:rPr>
+                <w:b w:val="0"/>
+                <w:sz w:val="17"/>
+              </w:rPr>
+              <w:t>Schwächerer Stress; 2022 bleibt konservativ</w:t>
+            </w:r>
+          </w:p>
+        </w:tc>
+      </w:tr>
+      <w:tr>
+        <w:tc>
+          <w:tcPr>
+            <w:tcW w:type="dxa" w:w="2070"/>
+          </w:tcPr>
+          <w:p>
+            <w:r/>
+            <w:r>
+              <w:rPr>
+                <w:b w:val="0"/>
+                <w:sz w:val="17"/>
+              </w:rPr>
+              <w:t>Basiskalibrierung</w:t>
+            </w:r>
+          </w:p>
+        </w:tc>
+        <w:tc>
+          <w:tcPr>
+            <w:tcW w:type="dxa" w:w="1318"/>
+          </w:tcPr>
+          <w:p>
+            <w:r/>
+            <w:r>
+              <w:rPr>
+                <w:b w:val="0"/>
+                <w:sz w:val="17"/>
+              </w:rPr>
+              <w:t>1,26 pp</w:t>
+            </w:r>
+          </w:p>
+        </w:tc>
+        <w:tc>
+          <w:tcPr>
+            <w:tcW w:type="dxa" w:w="1318"/>
+          </w:tcPr>
+          <w:p>
+            <w:r/>
+            <w:r>
+              <w:rPr>
+                <w:b w:val="0"/>
+                <w:sz w:val="17"/>
+              </w:rPr>
+              <w:t>-0,99 pp</w:t>
+            </w:r>
+          </w:p>
+        </w:tc>
+        <w:tc>
+          <w:tcPr>
+            <w:tcW w:type="dxa" w:w="4706"/>
+          </w:tcPr>
+          <w:p>
+            <w:r/>
+            <w:r>
+              <w:rPr>
+                <w:b w:val="0"/>
+                <w:sz w:val="17"/>
+              </w:rPr>
+              <w:t>Hauptfall des Cockpits</w:t>
+            </w:r>
+          </w:p>
+        </w:tc>
+      </w:tr>
+      <w:tr>
+        <w:tc>
+          <w:tcPr>
+            <w:tcW w:type="dxa" w:w="2070"/>
+          </w:tcPr>
+          <w:p>
+            <w:r/>
+            <w:r>
+              <w:rPr>
+                <w:b w:val="0"/>
+                <w:sz w:val="17"/>
+              </w:rPr>
+              <w:t>β/γ × 1,5</w:t>
+            </w:r>
+          </w:p>
+        </w:tc>
+        <w:tc>
+          <w:tcPr>
+            <w:tcW w:type="dxa" w:w="1318"/>
+          </w:tcPr>
+          <w:p>
+            <w:r/>
+            <w:r>
+              <w:rPr>
+                <w:b w:val="0"/>
+                <w:sz w:val="17"/>
+              </w:rPr>
+              <w:t>1,71 pp</w:t>
+            </w:r>
+          </w:p>
+        </w:tc>
+        <w:tc>
+          <w:tcPr>
+            <w:tcW w:type="dxa" w:w="1318"/>
+          </w:tcPr>
+          <w:p>
+            <w:r/>
+            <w:r>
+              <w:rPr>
+                <w:b w:val="0"/>
+                <w:sz w:val="17"/>
+              </w:rPr>
+              <w:t>-1,31 pp</w:t>
+            </w:r>
+          </w:p>
+        </w:tc>
+        <w:tc>
+          <w:tcPr>
+            <w:tcW w:type="dxa" w:w="4706"/>
+          </w:tcPr>
+          <w:p>
+            <w:r/>
+            <w:r>
+              <w:rPr>
+                <w:b w:val="0"/>
+                <w:sz w:val="17"/>
+              </w:rPr>
+              <w:t>Strengerer Stress; bewusst konservative Oberseite</w:t>
+            </w:r>
+          </w:p>
+        </w:tc>
+      </w:tr>
+    </w:tbl>
+    <w:p>
+      <w:pPr>
+        <w:spacing w:after="80"/>
+      </w:pPr>
+    </w:p>
+    <w:p>
+      <w:pPr>
+        <w:spacing w:after="140"/>
+      </w:pPr>
+      <w:r>
+        <w:rPr>
+          <w:b w:val="0"/>
+          <w:i w:val="0"/>
+          <w:sz w:val="19"/>
+        </w:rPr>
+        <w:t>Der Test skaliert die gesamte PD-/LGD-Transmission um ±50 %. Er zeigt, ob das Ergebnis nur an einer punktgenauen β-Wahl hängt. Die Richtung bleibt stabil: stärkere β verschärfen den konservativen Bias, schwächere β reduzieren ihn, ohne das Backtest-Narrativ zu drehen.</w:t>
       </w:r>
     </w:p>
     <w:p>
@@ -4674,7 +8615,7 @@
           <w:i w:val="0"/>
           <w:sz w:val="21"/>
         </w:rPr>
-        <w:t xml:space="preserve"> — regulatorisch geglättet und antizyklisch (CRR Art. 180) sowie durch Portfoliosteuerung überlagert. Beleg 2022: Zins +2,8 pp → Modell-PD +0,5 pp, gemeldete PD −0,2 pp. Validiert ist das Modell deshalb als </w:t>
+        <w:t xml:space="preserve"> — regulatorisch geglättet und antizyklisch (CRR Art. 180) sowie durch Portfoliosteuerung überlagert. Beleg 2022: Zins +2,8 pp → Modell-PD +0,5 pp, gemeldete PD −0,1 pp (ungewichteter Durchschnitt über Bank-Klassen-Paare; EAD-gewichtet +0,6 vs. −0,2 pp). Validiert ist das Modell deshalb als </w:t>
       </w:r>
       <w:r>
         <w:rPr>

</xml_diff>

<commit_message>
Polish model assumptions wording and contents
</commit_message>
<xml_diff>
--- a/Abgabe-Files/Abgabedokumente/Modellannahmen.docx
+++ b/Abgabe-Files/Abgabedokumente/Modellannahmen.docx
@@ -27,7 +27,7 @@
         </w:rPr>
         <w:t>EU Banking Credit Stress Cockpit</w:t>
         <w:br/>
-        <w:t>2-Faktor-Kreditstress (Basel-III-IRB) · Zielgröße CET1-Quote · Pillar-3-Datenbasis</w:t>
+        <w:t>2-Faktor-Kreditstress (Basel-III-IRB) | Zielgröße CET1-Quote | Pillar-3-Datenbasis</w:t>
       </w:r>
     </w:p>
     <w:p>
@@ -40,7 +40,7 @@
           <w:color w:val="6E6E6E"/>
           <w:sz w:val="19"/>
         </w:rPr>
-        <w:t>Kuratierte Abgabefassung · Stand 08.07.2026</w:t>
+        <w:t>Kuratierte Abgabefassung | Stand 08.07.2026</w:t>
         <w:br/>
         <w:t>Technische Referenz: Modellarchitektur/docs/MODEL_ASSUMPTIONS.md (V2.1)</w:t>
       </w:r>
@@ -60,600 +60,328 @@
         <w:t>Inhaltsverzeichnis</w:t>
       </w:r>
     </w:p>
-    <w:tbl>
-      <w:tblPr>
-        <w:tblStyle w:val="TableGrid"/>
-        <w:tblW w:type="auto" w:w="0"/>
-        <w:jc w:val="center"/>
-        <w:tblLook w:firstColumn="1" w:firstRow="1" w:lastColumn="0" w:lastRow="0" w:noHBand="0" w:noVBand="1" w:val="04A0"/>
-      </w:tblPr>
-      <w:tblGrid>
-        <w:gridCol w:w="4706"/>
-        <w:gridCol w:w="4706"/>
-      </w:tblGrid>
-      <w:tr>
-        <w:tc>
-          <w:tcPr>
-            <w:tcW w:type="dxa" w:w="8093"/>
-            <w:shd w:val="clear" w:fill="D9E4EC"/>
-          </w:tcPr>
-          <w:p>
-            <w:r/>
-            <w:r>
-              <w:rPr>
-                <w:b/>
-                <w:sz w:val="18"/>
-              </w:rPr>
-              <w:t>Kapitel</w:t>
-            </w:r>
-          </w:p>
-        </w:tc>
-        <w:tc>
-          <w:tcPr>
-            <w:tcW w:type="dxa" w:w="1318"/>
-            <w:shd w:val="clear" w:fill="D9E4EC"/>
-          </w:tcPr>
-          <w:p>
-            <w:r/>
-            <w:r>
-              <w:rPr>
-                <w:b/>
-                <w:sz w:val="18"/>
-              </w:rPr>
-              <w:t>Seite</w:t>
-            </w:r>
-          </w:p>
-        </w:tc>
-      </w:tr>
-      <w:tr>
-        <w:tc>
-          <w:tcPr>
-            <w:tcW w:type="dxa" w:w="8093"/>
-          </w:tcPr>
-          <w:p>
-            <w:r/>
-            <w:r>
-              <w:rPr>
-                <w:b w:val="0"/>
-                <w:sz w:val="18"/>
-              </w:rPr>
-              <w:t>Abkürzungen und Symbole</w:t>
-            </w:r>
-          </w:p>
-        </w:tc>
-        <w:tc>
-          <w:tcPr>
-            <w:tcW w:type="dxa" w:w="1318"/>
-          </w:tcPr>
-          <w:p>
-            <w:r/>
-            <w:r>
-              <w:rPr>
-                <w:b w:val="0"/>
-                <w:sz w:val="18"/>
-              </w:rPr>
-              <w:t>3</w:t>
-            </w:r>
-          </w:p>
-        </w:tc>
-      </w:tr>
-      <w:tr>
-        <w:tc>
-          <w:tcPr>
-            <w:tcW w:type="dxa" w:w="8093"/>
-          </w:tcPr>
-          <w:p>
-            <w:r/>
-            <w:r>
-              <w:rPr>
-                <w:b w:val="0"/>
-                <w:sz w:val="18"/>
-              </w:rPr>
-              <w:t>1 · Das Modell auf einen Blick</w:t>
-            </w:r>
-          </w:p>
-        </w:tc>
-        <w:tc>
-          <w:tcPr>
-            <w:tcW w:type="dxa" w:w="1318"/>
-          </w:tcPr>
-          <w:p>
-            <w:r/>
-            <w:r>
-              <w:rPr>
-                <w:b w:val="0"/>
-                <w:sz w:val="18"/>
-              </w:rPr>
-              <w:t>5</w:t>
-            </w:r>
-          </w:p>
-        </w:tc>
-      </w:tr>
-      <w:tr>
-        <w:tc>
-          <w:tcPr>
-            <w:tcW w:type="dxa" w:w="8093"/>
-          </w:tcPr>
-          <w:p>
-            <w:r/>
-            <w:r>
-              <w:rPr>
-                <w:b w:val="0"/>
-                <w:sz w:val="18"/>
-              </w:rPr>
-              <w:t xml:space="preserve">  Prüfpfad für kritische Evaluation</w:t>
-            </w:r>
-          </w:p>
-        </w:tc>
-        <w:tc>
-          <w:tcPr>
-            <w:tcW w:type="dxa" w:w="1318"/>
-          </w:tcPr>
-          <w:p>
-            <w:r/>
-            <w:r>
-              <w:rPr>
-                <w:b w:val="0"/>
-                <w:sz w:val="18"/>
-              </w:rPr>
-              <w:t>5</w:t>
-            </w:r>
-          </w:p>
-        </w:tc>
-      </w:tr>
-      <w:tr>
-        <w:tc>
-          <w:tcPr>
-            <w:tcW w:type="dxa" w:w="8093"/>
-          </w:tcPr>
-          <w:p>
-            <w:r/>
-            <w:r>
-              <w:rPr>
-                <w:b w:val="0"/>
-                <w:sz w:val="18"/>
-              </w:rPr>
-              <w:t>2 · Die zwei Risikofaktoren</w:t>
-            </w:r>
-          </w:p>
-        </w:tc>
-        <w:tc>
-          <w:tcPr>
-            <w:tcW w:type="dxa" w:w="1318"/>
-          </w:tcPr>
-          <w:p>
-            <w:r/>
-            <w:r>
-              <w:rPr>
-                <w:b w:val="0"/>
-                <w:sz w:val="18"/>
-              </w:rPr>
-              <w:t>6</w:t>
-            </w:r>
-          </w:p>
-        </w:tc>
-      </w:tr>
-      <w:tr>
-        <w:tc>
-          <w:tcPr>
-            <w:tcW w:type="dxa" w:w="8093"/>
-          </w:tcPr>
-          <w:p>
-            <w:r/>
-            <w:r>
-              <w:rPr>
-                <w:b w:val="0"/>
-                <w:sz w:val="18"/>
-              </w:rPr>
-              <w:t xml:space="preserve">  Warum Brent-log-Return?</w:t>
-            </w:r>
-          </w:p>
-        </w:tc>
-        <w:tc>
-          <w:tcPr>
-            <w:tcW w:type="dxa" w:w="1318"/>
-          </w:tcPr>
-          <w:p>
-            <w:r/>
-            <w:r>
-              <w:rPr>
-                <w:b w:val="0"/>
-                <w:sz w:val="18"/>
-              </w:rPr>
-              <w:t>6</w:t>
-            </w:r>
-          </w:p>
-        </w:tc>
-      </w:tr>
-      <w:tr>
-        <w:tc>
-          <w:tcPr>
-            <w:tcW w:type="dxa" w:w="8093"/>
-          </w:tcPr>
-          <w:p>
-            <w:r/>
-            <w:r>
-              <w:rPr>
-                <w:b w:val="0"/>
-                <w:sz w:val="18"/>
-              </w:rPr>
-              <w:t xml:space="preserve">  Datenquellen und ihre Rollen</w:t>
-            </w:r>
-          </w:p>
-        </w:tc>
-        <w:tc>
-          <w:tcPr>
-            <w:tcW w:type="dxa" w:w="1318"/>
-          </w:tcPr>
-          <w:p>
-            <w:r/>
-            <w:r>
-              <w:rPr>
-                <w:b w:val="0"/>
-                <w:sz w:val="18"/>
-              </w:rPr>
-              <w:t>7</w:t>
-            </w:r>
-          </w:p>
-        </w:tc>
-      </w:tr>
-      <w:tr>
-        <w:tc>
-          <w:tcPr>
-            <w:tcW w:type="dxa" w:w="8093"/>
-          </w:tcPr>
-          <w:p>
-            <w:r/>
-            <w:r>
-              <w:rPr>
-                <w:b w:val="0"/>
-                <w:sz w:val="18"/>
-              </w:rPr>
-              <w:t>3 · Sektor-differenzierte Stress-Transmission</w:t>
-            </w:r>
-          </w:p>
-        </w:tc>
-        <w:tc>
-          <w:tcPr>
-            <w:tcW w:type="dxa" w:w="1318"/>
-          </w:tcPr>
-          <w:p>
-            <w:r/>
-            <w:r>
-              <w:rPr>
-                <w:b w:val="0"/>
-                <w:sz w:val="18"/>
-              </w:rPr>
-              <w:t>7</w:t>
-            </w:r>
-          </w:p>
-        </w:tc>
-      </w:tr>
-      <w:tr>
-        <w:tc>
-          <w:tcPr>
-            <w:tcW w:type="dxa" w:w="8093"/>
-          </w:tcPr>
-          <w:p>
-            <w:r/>
-            <w:r>
-              <w:rPr>
-                <w:b w:val="0"/>
-                <w:sz w:val="18"/>
-              </w:rPr>
-              <w:t xml:space="preserve">  Ökonomische Logik je Kreditklasse</w:t>
-            </w:r>
-          </w:p>
-        </w:tc>
-        <w:tc>
-          <w:tcPr>
-            <w:tcW w:type="dxa" w:w="1318"/>
-          </w:tcPr>
-          <w:p>
-            <w:r/>
-            <w:r>
-              <w:rPr>
-                <w:b w:val="0"/>
-                <w:sz w:val="18"/>
-              </w:rPr>
-              <w:t>8</w:t>
-            </w:r>
-          </w:p>
-        </w:tc>
-      </w:tr>
-      <w:tr>
-        <w:tc>
-          <w:tcPr>
-            <w:tcW w:type="dxa" w:w="8093"/>
-          </w:tcPr>
-          <w:p>
-            <w:r/>
-            <w:r>
-              <w:rPr>
-                <w:b w:val="0"/>
-                <w:sz w:val="18"/>
-              </w:rPr>
-              <w:t xml:space="preserve">  Durchgerechnetes Beispiel</w:t>
-            </w:r>
-          </w:p>
-        </w:tc>
-        <w:tc>
-          <w:tcPr>
-            <w:tcW w:type="dxa" w:w="1318"/>
-          </w:tcPr>
-          <w:p>
-            <w:r/>
-            <w:r>
-              <w:rPr>
-                <w:b w:val="0"/>
-                <w:sz w:val="18"/>
-              </w:rPr>
-              <w:t>8</w:t>
-            </w:r>
-          </w:p>
-        </w:tc>
-      </w:tr>
-      <w:tr>
-        <w:tc>
-          <w:tcPr>
-            <w:tcW w:type="dxa" w:w="8093"/>
-          </w:tcPr>
-          <w:p>
-            <w:r/>
-            <w:r>
-              <w:rPr>
-                <w:b w:val="0"/>
-                <w:sz w:val="18"/>
-              </w:rPr>
-              <w:t>4 · Kapitalrechnung und CET1-Bridge</w:t>
-            </w:r>
-          </w:p>
-        </w:tc>
-        <w:tc>
-          <w:tcPr>
-            <w:tcW w:type="dxa" w:w="1318"/>
-          </w:tcPr>
-          <w:p>
-            <w:r/>
-            <w:r>
-              <w:rPr>
-                <w:b w:val="0"/>
-                <w:sz w:val="18"/>
-              </w:rPr>
-              <w:t>9</w:t>
-            </w:r>
-          </w:p>
-        </w:tc>
-      </w:tr>
-      <w:tr>
-        <w:tc>
-          <w:tcPr>
-            <w:tcW w:type="dxa" w:w="8093"/>
-          </w:tcPr>
-          <w:p>
-            <w:r/>
-            <w:r>
-              <w:rPr>
-                <w:b w:val="0"/>
-                <w:sz w:val="18"/>
-              </w:rPr>
-              <w:t xml:space="preserve">  Die Formelstrecke im Detail</w:t>
-            </w:r>
-          </w:p>
-        </w:tc>
-        <w:tc>
-          <w:tcPr>
-            <w:tcW w:type="dxa" w:w="1318"/>
-          </w:tcPr>
-          <w:p>
-            <w:r/>
-            <w:r>
-              <w:rPr>
-                <w:b w:val="0"/>
-                <w:sz w:val="18"/>
-              </w:rPr>
-              <w:t>9</w:t>
-            </w:r>
-          </w:p>
-        </w:tc>
-      </w:tr>
-      <w:tr>
-        <w:tc>
-          <w:tcPr>
-            <w:tcW w:type="dxa" w:w="8093"/>
-          </w:tcPr>
-          <w:p>
-            <w:r/>
-            <w:r>
-              <w:rPr>
-                <w:b w:val="0"/>
-                <w:sz w:val="18"/>
-              </w:rPr>
-              <w:t xml:space="preserve">  Der Sovereign-Kanal konkret</w:t>
-            </w:r>
-          </w:p>
-        </w:tc>
-        <w:tc>
-          <w:tcPr>
-            <w:tcW w:type="dxa" w:w="1318"/>
-          </w:tcPr>
-          <w:p>
-            <w:r/>
-            <w:r>
-              <w:rPr>
-                <w:b w:val="0"/>
-                <w:sz w:val="18"/>
-              </w:rPr>
-              <w:t>10</w:t>
-            </w:r>
-          </w:p>
-        </w:tc>
-      </w:tr>
-      <w:tr>
-        <w:tc>
-          <w:tcPr>
-            <w:tcW w:type="dxa" w:w="8093"/>
-          </w:tcPr>
-          <w:p>
-            <w:r/>
-            <w:r>
-              <w:rPr>
-                <w:b w:val="0"/>
-                <w:sz w:val="18"/>
-              </w:rPr>
-              <w:t>5 · Datenbasis und Integritätssicherung</w:t>
-            </w:r>
-          </w:p>
-        </w:tc>
-        <w:tc>
-          <w:tcPr>
-            <w:tcW w:type="dxa" w:w="1318"/>
-          </w:tcPr>
-          <w:p>
-            <w:r/>
-            <w:r>
-              <w:rPr>
-                <w:b w:val="0"/>
-                <w:sz w:val="18"/>
-              </w:rPr>
-              <w:t>11</w:t>
-            </w:r>
-          </w:p>
-        </w:tc>
-      </w:tr>
-      <w:tr>
-        <w:tc>
-          <w:tcPr>
-            <w:tcW w:type="dxa" w:w="8093"/>
-          </w:tcPr>
-          <w:p>
-            <w:r/>
-            <w:r>
-              <w:rPr>
-                <w:b w:val="0"/>
-                <w:sz w:val="18"/>
-              </w:rPr>
-              <w:t>6 · Annahmen-Inventar (A-01 bis A-10)</w:t>
-            </w:r>
-          </w:p>
-        </w:tc>
-        <w:tc>
-          <w:tcPr>
-            <w:tcW w:type="dxa" w:w="1318"/>
-          </w:tcPr>
-          <w:p>
-            <w:r/>
-            <w:r>
-              <w:rPr>
-                <w:b w:val="0"/>
-                <w:sz w:val="18"/>
-              </w:rPr>
-              <w:t>12</w:t>
-            </w:r>
-          </w:p>
-        </w:tc>
-      </w:tr>
-      <w:tr>
-        <w:tc>
-          <w:tcPr>
-            <w:tcW w:type="dxa" w:w="8093"/>
-          </w:tcPr>
-          <w:p>
-            <w:r/>
-            <w:r>
-              <w:rPr>
-                <w:b w:val="0"/>
-                <w:sz w:val="18"/>
-              </w:rPr>
-              <w:t>7 · Validierung: CET1-Walk-Forward-Backtest</w:t>
-            </w:r>
-          </w:p>
-        </w:tc>
-        <w:tc>
-          <w:tcPr>
-            <w:tcW w:type="dxa" w:w="1318"/>
-          </w:tcPr>
-          <w:p>
-            <w:r/>
-            <w:r>
-              <w:rPr>
-                <w:b w:val="0"/>
-                <w:sz w:val="18"/>
-              </w:rPr>
-              <w:t>15</w:t>
-            </w:r>
-          </w:p>
-        </w:tc>
-      </w:tr>
-      <w:tr>
-        <w:tc>
-          <w:tcPr>
-            <w:tcW w:type="dxa" w:w="8093"/>
-          </w:tcPr>
-          <w:p>
-            <w:r/>
-            <w:r>
-              <w:rPr>
-                <w:b w:val="0"/>
-                <w:sz w:val="18"/>
-              </w:rPr>
-              <w:t>8 · Bewusste Scope-Grenzen</w:t>
-            </w:r>
-          </w:p>
-        </w:tc>
-        <w:tc>
-          <w:tcPr>
-            <w:tcW w:type="dxa" w:w="1318"/>
-          </w:tcPr>
-          <w:p>
-            <w:r/>
-            <w:r>
-              <w:rPr>
-                <w:b w:val="0"/>
-                <w:sz w:val="18"/>
-              </w:rPr>
-              <w:t>16</w:t>
-            </w:r>
-          </w:p>
-        </w:tc>
-      </w:tr>
-      <w:tr>
-        <w:tc>
-          <w:tcPr>
-            <w:tcW w:type="dxa" w:w="8093"/>
-          </w:tcPr>
-          <w:p>
-            <w:r/>
-            <w:r>
-              <w:rPr>
-                <w:b w:val="0"/>
-                <w:sz w:val="18"/>
-              </w:rPr>
-              <w:t>9 · Bibliographie</w:t>
-            </w:r>
-          </w:p>
-        </w:tc>
-        <w:tc>
-          <w:tcPr>
-            <w:tcW w:type="dxa" w:w="1318"/>
-          </w:tcPr>
-          <w:p>
-            <w:r/>
-            <w:r>
-              <w:rPr>
-                <w:b w:val="0"/>
-                <w:sz w:val="18"/>
-              </w:rPr>
-              <w:t>17</w:t>
-            </w:r>
-          </w:p>
-        </w:tc>
-      </w:tr>
-    </w:tbl>
     <w:p>
       <w:pPr>
-        <w:spacing w:after="80"/>
+        <w:tabs>
+          <w:tab w:pos="9298" w:val="right" w:leader="dot"/>
+        </w:tabs>
+        <w:spacing w:after="60"/>
+        <w:ind w:left="0"/>
       </w:pPr>
+      <w:r>
+        <w:rPr>
+          <w:rFonts w:ascii="Arial" w:hAnsi="Arial"/>
+          <w:b/>
+          <w:sz w:val="19"/>
+        </w:rPr>
+        <w:t>Abkürzungen und Symbole</w:t>
+        <w:tab/>
+        <w:t>3</w:t>
+      </w:r>
+    </w:p>
+    <w:p>
+      <w:pPr>
+        <w:tabs>
+          <w:tab w:pos="9298" w:val="right" w:leader="dot"/>
+        </w:tabs>
+        <w:spacing w:after="60"/>
+        <w:ind w:left="0"/>
+      </w:pPr>
+      <w:r>
+        <w:rPr>
+          <w:rFonts w:ascii="Arial" w:hAnsi="Arial"/>
+          <w:b/>
+          <w:sz w:val="19"/>
+        </w:rPr>
+        <w:t>1. Das Modell auf einen Blick</w:t>
+        <w:tab/>
+        <w:t>5</w:t>
+      </w:r>
+    </w:p>
+    <w:p>
+      <w:pPr>
+        <w:tabs>
+          <w:tab w:pos="9298" w:val="right" w:leader="dot"/>
+        </w:tabs>
+        <w:spacing w:after="60"/>
+        <w:ind w:left="312"/>
+      </w:pPr>
+      <w:r>
+        <w:rPr>
+          <w:rFonts w:ascii="Arial" w:hAnsi="Arial"/>
+          <w:b w:val="0"/>
+          <w:sz w:val="19"/>
+        </w:rPr>
+        <w:t>Orientierung für die Prüfung</w:t>
+        <w:tab/>
+        <w:t>5</w:t>
+      </w:r>
+    </w:p>
+    <w:p>
+      <w:pPr>
+        <w:tabs>
+          <w:tab w:pos="9298" w:val="right" w:leader="dot"/>
+        </w:tabs>
+        <w:spacing w:after="60"/>
+        <w:ind w:left="0"/>
+      </w:pPr>
+      <w:r>
+        <w:rPr>
+          <w:rFonts w:ascii="Arial" w:hAnsi="Arial"/>
+          <w:b/>
+          <w:sz w:val="19"/>
+        </w:rPr>
+        <w:t>2. Die zwei Risikofaktoren</w:t>
+        <w:tab/>
+        <w:t>6</w:t>
+      </w:r>
+    </w:p>
+    <w:p>
+      <w:pPr>
+        <w:tabs>
+          <w:tab w:pos="9298" w:val="right" w:leader="dot"/>
+        </w:tabs>
+        <w:spacing w:after="60"/>
+        <w:ind w:left="312"/>
+      </w:pPr>
+      <w:r>
+        <w:rPr>
+          <w:rFonts w:ascii="Arial" w:hAnsi="Arial"/>
+          <w:b w:val="0"/>
+          <w:sz w:val="19"/>
+        </w:rPr>
+        <w:t>Warum Brent und Log-Renditen?</w:t>
+        <w:tab/>
+        <w:t>6</w:t>
+      </w:r>
+    </w:p>
+    <w:p>
+      <w:pPr>
+        <w:tabs>
+          <w:tab w:pos="9298" w:val="right" w:leader="dot"/>
+        </w:tabs>
+        <w:spacing w:after="60"/>
+        <w:ind w:left="312"/>
+      </w:pPr>
+      <w:r>
+        <w:rPr>
+          <w:rFonts w:ascii="Arial" w:hAnsi="Arial"/>
+          <w:b w:val="0"/>
+          <w:sz w:val="19"/>
+        </w:rPr>
+        <w:t>Datenquellen und ihre Rollen</w:t>
+        <w:tab/>
+        <w:t>7</w:t>
+      </w:r>
+    </w:p>
+    <w:p>
+      <w:pPr>
+        <w:tabs>
+          <w:tab w:pos="9298" w:val="right" w:leader="dot"/>
+        </w:tabs>
+        <w:spacing w:after="60"/>
+        <w:ind w:left="0"/>
+      </w:pPr>
+      <w:r>
+        <w:rPr>
+          <w:rFonts w:ascii="Arial" w:hAnsi="Arial"/>
+          <w:b/>
+          <w:sz w:val="19"/>
+        </w:rPr>
+        <w:t>3. Stressübertragung nach Kreditklasse</w:t>
+        <w:tab/>
+        <w:t>7</w:t>
+      </w:r>
+    </w:p>
+    <w:p>
+      <w:pPr>
+        <w:tabs>
+          <w:tab w:pos="9298" w:val="right" w:leader="dot"/>
+        </w:tabs>
+        <w:spacing w:after="60"/>
+        <w:ind w:left="312"/>
+      </w:pPr>
+      <w:r>
+        <w:rPr>
+          <w:rFonts w:ascii="Arial" w:hAnsi="Arial"/>
+          <w:b w:val="0"/>
+          <w:sz w:val="19"/>
+        </w:rPr>
+        <w:t>Ökonomische Logik je Kreditklasse</w:t>
+        <w:tab/>
+        <w:t>8</w:t>
+      </w:r>
+    </w:p>
+    <w:p>
+      <w:pPr>
+        <w:tabs>
+          <w:tab w:pos="9298" w:val="right" w:leader="dot"/>
+        </w:tabs>
+        <w:spacing w:after="60"/>
+        <w:ind w:left="312"/>
+      </w:pPr>
+      <w:r>
+        <w:rPr>
+          <w:rFonts w:ascii="Arial" w:hAnsi="Arial"/>
+          <w:b w:val="0"/>
+          <w:sz w:val="19"/>
+        </w:rPr>
+        <w:t>Durchgerechnetes Beispiel</w:t>
+        <w:tab/>
+        <w:t>8</w:t>
+      </w:r>
+    </w:p>
+    <w:p>
+      <w:pPr>
+        <w:tabs>
+          <w:tab w:pos="9298" w:val="right" w:leader="dot"/>
+        </w:tabs>
+        <w:spacing w:after="60"/>
+        <w:ind w:left="0"/>
+      </w:pPr>
+      <w:r>
+        <w:rPr>
+          <w:rFonts w:ascii="Arial" w:hAnsi="Arial"/>
+          <w:b/>
+          <w:sz w:val="19"/>
+        </w:rPr>
+        <w:t>4. Kapitalrechnung und CET1-Überleitung</w:t>
+        <w:tab/>
+        <w:t>9</w:t>
+      </w:r>
+    </w:p>
+    <w:p>
+      <w:pPr>
+        <w:tabs>
+          <w:tab w:pos="9298" w:val="right" w:leader="dot"/>
+        </w:tabs>
+        <w:spacing w:after="60"/>
+        <w:ind w:left="312"/>
+      </w:pPr>
+      <w:r>
+        <w:rPr>
+          <w:rFonts w:ascii="Arial" w:hAnsi="Arial"/>
+          <w:b w:val="0"/>
+          <w:sz w:val="19"/>
+        </w:rPr>
+        <w:t>Die wichtigsten Formeln</w:t>
+        <w:tab/>
+        <w:t>9</w:t>
+      </w:r>
+    </w:p>
+    <w:p>
+      <w:pPr>
+        <w:tabs>
+          <w:tab w:pos="9298" w:val="right" w:leader="dot"/>
+        </w:tabs>
+        <w:spacing w:after="60"/>
+        <w:ind w:left="312"/>
+      </w:pPr>
+      <w:r>
+        <w:rPr>
+          <w:rFonts w:ascii="Arial" w:hAnsi="Arial"/>
+          <w:b w:val="0"/>
+          <w:sz w:val="19"/>
+        </w:rPr>
+        <w:t>Der Sovereign-Kanal konkret</w:t>
+        <w:tab/>
+        <w:t>10</w:t>
+      </w:r>
+    </w:p>
+    <w:p>
+      <w:pPr>
+        <w:tabs>
+          <w:tab w:pos="9298" w:val="right" w:leader="dot"/>
+        </w:tabs>
+        <w:spacing w:after="60"/>
+        <w:ind w:left="0"/>
+      </w:pPr>
+      <w:r>
+        <w:rPr>
+          <w:rFonts w:ascii="Arial" w:hAnsi="Arial"/>
+          <w:b/>
+          <w:sz w:val="19"/>
+        </w:rPr>
+        <w:t>5. Datenbasis und Qualitätsprüfung</w:t>
+        <w:tab/>
+        <w:t>11</w:t>
+      </w:r>
+    </w:p>
+    <w:p>
+      <w:pPr>
+        <w:tabs>
+          <w:tab w:pos="9298" w:val="right" w:leader="dot"/>
+        </w:tabs>
+        <w:spacing w:after="60"/>
+        <w:ind w:left="0"/>
+      </w:pPr>
+      <w:r>
+        <w:rPr>
+          <w:rFonts w:ascii="Arial" w:hAnsi="Arial"/>
+          <w:b/>
+          <w:sz w:val="19"/>
+        </w:rPr>
+        <w:t>6. Annahmenübersicht (A-01 bis A-10)</w:t>
+        <w:tab/>
+        <w:t>12</w:t>
+      </w:r>
+    </w:p>
+    <w:p>
+      <w:pPr>
+        <w:tabs>
+          <w:tab w:pos="9298" w:val="right" w:leader="dot"/>
+        </w:tabs>
+        <w:spacing w:after="60"/>
+        <w:ind w:left="0"/>
+      </w:pPr>
+      <w:r>
+        <w:rPr>
+          <w:rFonts w:ascii="Arial" w:hAnsi="Arial"/>
+          <w:b/>
+          <w:sz w:val="19"/>
+        </w:rPr>
+        <w:t>7. Validierung: CET1-Walk-Forward-Backtest</w:t>
+        <w:tab/>
+        <w:t>15</w:t>
+      </w:r>
+    </w:p>
+    <w:p>
+      <w:pPr>
+        <w:tabs>
+          <w:tab w:pos="9298" w:val="right" w:leader="dot"/>
+        </w:tabs>
+        <w:spacing w:after="60"/>
+        <w:ind w:left="0"/>
+      </w:pPr>
+      <w:r>
+        <w:rPr>
+          <w:rFonts w:ascii="Arial" w:hAnsi="Arial"/>
+          <w:b/>
+          <w:sz w:val="19"/>
+        </w:rPr>
+        <w:t>8. Bewusste Modellgrenzen</w:t>
+        <w:tab/>
+        <w:t>16</w:t>
+      </w:r>
+    </w:p>
+    <w:p>
+      <w:pPr>
+        <w:tabs>
+          <w:tab w:pos="9298" w:val="right" w:leader="dot"/>
+        </w:tabs>
+        <w:spacing w:after="60"/>
+        <w:ind w:left="0"/>
+      </w:pPr>
+      <w:r>
+        <w:rPr>
+          <w:rFonts w:ascii="Arial" w:hAnsi="Arial"/>
+          <w:b/>
+          <w:sz w:val="19"/>
+        </w:rPr>
+        <w:t>9. Bibliographie</w:t>
+        <w:tab/>
+        <w:t>17</w:t>
+      </w:r>
     </w:p>
     <w:p>
       <w:r>
@@ -678,7 +406,7 @@
           <w:i w:val="0"/>
           <w:sz w:val="21"/>
         </w:rPr>
-        <w:t>Kurzreferenz für die kritische Durchsicht — jede Abkürzung wird zusätzlich bei ihrem ersten inhaltlichen Auftreten im Text erläutert.</w:t>
+        <w:t>Kurzreferenz für die kritische Durchsicht - jede Abkürzung wird zusätzlich bei ihrem ersten inhaltlichen Auftreten im Text erläutert.</w:t>
       </w:r>
     </w:p>
     <w:p>
@@ -761,7 +489,7 @@
                 <w:b w:val="0"/>
                 <w:sz w:val="17"/>
               </w:rPr>
-              <w:t>Advanced / Foundation Internal Ratings-Based — im A-IRB schätzt die Bank PD und LGD selbst, im F-IRB nur die PD (LGD regulatorisch, z. B. 45 % für unbesicherte Senior-Forderungen)</w:t>
+              <w:t>Advanced / Foundation Internal Ratings-Based - im A-IRB schätzt die Bank PD und LGD selbst, im F-IRB nur die PD (LGD regulatorisch, z. B. 45 % für unbesicherte Senior-Forderungen)</w:t>
             </w:r>
           </w:p>
         </w:tc>
@@ -793,7 +521,7 @@
                 <w:b w:val="0"/>
                 <w:sz w:val="17"/>
               </w:rPr>
-              <w:t>Amortised Cost — zu fortgeführten Anschaffungskosten bilanziert; kein laufender Marktwert-Effekt im Eigenkapital</w:t>
+              <w:t>Amortised Cost - zu fortgeführten Anschaffungskosten bilanziert; kein laufender Marktwert-Effekt im Eigenkapital</w:t>
             </w:r>
           </w:p>
         </w:tc>
@@ -825,7 +553,7 @@
                 <w:b w:val="0"/>
                 <w:sz w:val="17"/>
               </w:rPr>
-              <w:t>Asymptotic Single Risk Factor — Portfoliomodell hinter der Basel-IRB-Formel (Vasicek/Gordy)</w:t>
+              <w:t>Asymptotic Single Risk Factor - Portfoliomodell hinter der Basel-IRB-Formel (Vasicek/Gordy)</w:t>
             </w:r>
           </w:p>
         </w:tc>
@@ -889,7 +617,7 @@
                 <w:b w:val="0"/>
                 <w:sz w:val="17"/>
               </w:rPr>
-              <w:t>Credit Conversion Factor — Umrechnungsfaktor für außerbilanzielle Kreditzusagen in EAD</w:t>
+              <w:t>Credit Conversion Factor - Umrechnungsfaktor für außerbilanzielle Kreditzusagen in EAD</w:t>
             </w:r>
           </w:p>
         </w:tc>
@@ -921,7 +649,7 @@
                 <w:b w:val="0"/>
                 <w:sz w:val="17"/>
               </w:rPr>
-              <w:t>Common Equity Tier 1 — hartes Kernkapital; die CET1-Quote (CET1 ÷ RWA) ist die Zielgröße des Modells</w:t>
+              <w:t>Common Equity Tier 1 - hartes Kernkapital; die CET1-Quote (CET1 ÷ RWA) ist die Zielgröße des Modells</w:t>
             </w:r>
           </w:p>
         </w:tc>
@@ -953,7 +681,7 @@
                 <w:b w:val="0"/>
                 <w:sz w:val="17"/>
               </w:rPr>
-              <w:t>Capital Requirements Regulation — Verordnung (EU) Nr. 575/2013</w:t>
+              <w:t>Capital Requirements Regulation - Verordnung (EU) Nr. 575/2013</w:t>
             </w:r>
           </w:p>
         </w:tc>
@@ -985,7 +713,7 @@
                 <w:b w:val="0"/>
                 <w:sz w:val="17"/>
               </w:rPr>
-              <w:t>Exposure at Default — Forderungshöhe bei Ausfall (post-CCF)</w:t>
+              <w:t>Exposure at Default - Forderungshöhe bei Ausfall (post-CCF)</w:t>
             </w:r>
           </w:p>
         </w:tc>
@@ -1017,7 +745,7 @@
                 <w:b w:val="0"/>
                 <w:sz w:val="17"/>
               </w:rPr>
-              <w:t>European Banking Authority — EU-Bankenaufsichtsbehörde</w:t>
+              <w:t>European Banking Authority - EU-Bankenaufsichtsbehörde</w:t>
             </w:r>
           </w:p>
         </w:tc>
@@ -1049,7 +777,7 @@
                 <w:b w:val="0"/>
                 <w:sz w:val="17"/>
               </w:rPr>
-              <w:t>Expected Loss — erwarteter Verlust = PD · LGD · EAD</w:t>
+              <w:t>Expected Loss - erwarteter Verlust = PD · LGD · EAD</w:t>
             </w:r>
           </w:p>
         </w:tc>
@@ -1113,7 +841,7 @@
                 <w:b w:val="0"/>
                 <w:sz w:val="17"/>
               </w:rPr>
-              <w:t>Fair Value through Other Comprehensive Income — Marktwertänderungen wirken erfolgsneutral direkt im Eigenkapital (OCI)</w:t>
+              <w:t>Fair Value through Other Comprehensive Income - Marktwertänderungen wirken erfolgsneutral direkt im Eigenkapital (OCI)</w:t>
             </w:r>
           </w:p>
         </w:tc>
@@ -1145,7 +873,7 @@
                 <w:b w:val="0"/>
                 <w:sz w:val="17"/>
               </w:rPr>
-              <w:t>Fair Value through Profit or Loss / Held for Trading — Marktwertänderungen wirken über die Gewinn- und Verlustrechnung</w:t>
+              <w:t>Fair Value through Profit or Loss / Held for Trading - Marktwertänderungen wirken über die Gewinn- und Verlustrechnung</w:t>
             </w:r>
           </w:p>
         </w:tc>
@@ -1177,7 +905,7 @@
                 <w:b w:val="0"/>
                 <w:sz w:val="17"/>
               </w:rPr>
-              <w:t>Internal Capital Adequacy Assessment Process — bankinterner Kapitaladäquanz-Prozess</w:t>
+              <w:t>Internal Capital Adequacy Assessment Process - bankinterner Kapitaladäquanz-Prozess</w:t>
             </w:r>
           </w:p>
         </w:tc>
@@ -1209,7 +937,7 @@
                 <w:b w:val="0"/>
                 <w:sz w:val="17"/>
               </w:rPr>
-              <w:t>Internal Ratings-Based Approach — auf internen Ratings basierender Ansatz der Kapitalunterlegung</w:t>
+              <w:t>Internal Ratings-Based Approach - auf internen Ratings basierender Ansatz der Kapitalunterlegung</w:t>
             </w:r>
           </w:p>
         </w:tc>
@@ -1241,7 +969,7 @@
                 <w:b w:val="0"/>
                 <w:sz w:val="17"/>
               </w:rPr>
-              <w:t>Legal Entity Identifier — eindeutige Kennung je Institut</w:t>
+              <w:t>Legal Entity Identifier - eindeutige Kennung je Institut</w:t>
             </w:r>
           </w:p>
         </w:tc>
@@ -1273,7 +1001,7 @@
                 <w:b w:val="0"/>
                 <w:sz w:val="17"/>
               </w:rPr>
-              <w:t>Loss Given Default — Verlustquote bei Ausfall</w:t>
+              <w:t>Loss Given Default - Verlustquote bei Ausfall</w:t>
             </w:r>
           </w:p>
         </w:tc>
@@ -1305,7 +1033,7 @@
                 <w:b w:val="0"/>
                 <w:sz w:val="17"/>
               </w:rPr>
-              <w:t>Mean Absolute Error — mittlerer absoluter Prognosefehler</w:t>
+              <w:t>Mean Absolute Error - mittlerer absoluter Prognosefehler</w:t>
             </w:r>
           </w:p>
         </w:tc>
@@ -1337,7 +1065,7 @@
                 <w:b w:val="0"/>
                 <w:sz w:val="17"/>
               </w:rPr>
-              <w:t>Mark-to-Market — Bewertung zum aktuellen Marktwert</w:t>
+              <w:t>Mark-to-Market - Bewertung zum aktuellen Marktwert</w:t>
             </w:r>
           </w:p>
         </w:tc>
@@ -1369,7 +1097,7 @@
                 <w:b w:val="0"/>
                 <w:sz w:val="17"/>
               </w:rPr>
-              <w:t>Net Interest Income / Margin — Zinsüberschuss bzw. Zinsmarge einer Bank</w:t>
+              <w:t>Net Interest Income / Margin - Zinsüberschuss bzw. Zinsmarge einer Bank</w:t>
             </w:r>
           </w:p>
         </w:tc>
@@ -1401,7 +1129,7 @@
                 <w:b w:val="0"/>
                 <w:sz w:val="17"/>
               </w:rPr>
-              <w:t>Other Comprehensive Income — erfolgsneutrales Eigenkapital (sonstiges Ergebnis)</w:t>
+              <w:t>Other Comprehensive Income - erfolgsneutrales Eigenkapital (sonstiges Ergebnis)</w:t>
             </w:r>
           </w:p>
         </w:tc>
@@ -1433,7 +1161,7 @@
                 <w:b w:val="0"/>
                 <w:sz w:val="17"/>
               </w:rPr>
-              <w:t>Probability of Default — 1-Jahres-Ausfallwahrscheinlichkeit (CRR Art. 180)</w:t>
+              <w:t>Probability of Default - 1-Jahres-Ausfallwahrscheinlichkeit (CRR Art. 180)</w:t>
             </w:r>
           </w:p>
         </w:tc>
@@ -1465,7 +1193,7 @@
                 <w:b w:val="0"/>
                 <w:sz w:val="17"/>
               </w:rPr>
-              <w:t>Point-in-Time / Through-the-Cycle — stichtagsbezogene vs. über den Zyklus geglättete Risikomessung</w:t>
+              <w:t>Point-in-Time / Through-the-Cycle - stichtagsbezogene vs. über den Zyklus geglättete Risikomessung</w:t>
             </w:r>
           </w:p>
         </w:tc>
@@ -1529,7 +1257,7 @@
                 <w:b w:val="0"/>
                 <w:sz w:val="17"/>
               </w:rPr>
-              <w:t>Qualifying Revolving Retail Exposures — revolvierende Konsumentenkredite (z. B. Kreditkarten)</w:t>
+              <w:t>Qualifying Revolving Retail Exposures - revolvierende Konsumentenkredite (z. B. Kreditkarten)</w:t>
             </w:r>
           </w:p>
         </w:tc>
@@ -1561,7 +1289,7 @@
                 <w:b w:val="0"/>
                 <w:sz w:val="17"/>
               </w:rPr>
-              <w:t>Risk-Weighted Assets — risikogewichtete Aktiva; Nenner der CET1-Quote</w:t>
+              <w:t>Risk-Weighted Assets - risikogewichtete Aktiva; Nenner der CET1-Quote</w:t>
             </w:r>
           </w:p>
         </w:tc>
@@ -1593,7 +1321,7 @@
                 <w:b w:val="0"/>
                 <w:sz w:val="17"/>
               </w:rPr>
-              <w:t>Supervisory Review and Evaluation Process — aufsichtlicher Überprüfungsprozess</w:t>
+              <w:t>Supervisory Review and Evaluation Process - aufsichtlicher Überprüfungsprozess</w:t>
             </w:r>
           </w:p>
         </w:tc>
@@ -2348,7 +2076,7 @@
         <w:pStyle w:val="Heading1"/>
       </w:pPr>
       <w:r>
-        <w:t>1 · Das Modell auf einen Blick</w:t>
+        <w:t>1. Das Modell auf einen Blick</w:t>
       </w:r>
     </w:p>
     <w:p>
@@ -2377,7 +2105,7 @@
           <w:i w:val="0"/>
           <w:sz w:val="21"/>
         </w:rPr>
-        <w:t xml:space="preserve"> Die CET1-Quote ist die Solvenz-Kennzahl der Bankenaufsicht — fällt sie unter die gestaffelten Mindestanforderungen, greifen aufsichtliche Maßnahmen bis hin zu Ausschüttungssperren.</w:t>
+        <w:t xml:space="preserve"> Die CET1-Quote ist die Solvenz-Kennzahl der Bankenaufsicht - fällt sie unter die gestaffelten Mindestanforderungen, greifen aufsichtliche Maßnahmen bis hin zu Ausschüttungssperren.</w:t>
       </w:r>
     </w:p>
     <w:p>
@@ -2409,7 +2137,7 @@
           <w:b w:val="0"/>
           <w:sz w:val="21"/>
         </w:rPr>
-        <w:t xml:space="preserve"> — alle Risikoparameter (PD, LGD, EAD) stammen aus den offiziellen Pillar-3-Offenlegungen (EU CR6) der Banken selbst; kein Wert wird geschätzt oder abgeleitet.</w:t>
+        <w:t xml:space="preserve"> - alle Risikoparameter (PD, LGD, EAD) stammen aus den offiziellen Pillar-3-Offenlegungen (EU CR6) der Banken selbst; kein Wert wird geschätzt oder abgeleitet.</w:t>
       </w:r>
     </w:p>
     <w:p>
@@ -2428,7 +2156,7 @@
           <w:b w:val="0"/>
           <w:sz w:val="21"/>
         </w:rPr>
-        <w:t xml:space="preserve"> — Ölpreis (ΔBrent) und 10-Jahres-Zins (Δr_10y) werden nicht zu einem Kunstfaktor aggregiert, sondern wirken einzeln und beobachtbar.</w:t>
+        <w:t xml:space="preserve"> - Ölpreis (ΔBrent) und 10-Jahres-Zins (Δr_10y) werden nicht zu einem Kunstfaktor aggregiert, sondern wirken einzeln und beobachtbar.</w:t>
       </w:r>
     </w:p>
     <w:p>
@@ -2447,7 +2175,7 @@
           <w:b w:val="0"/>
           <w:sz w:val="21"/>
         </w:rPr>
-        <w:t xml:space="preserve"> — jede Kreditklasse reagiert gemäß quellenbelegter Sensitivitäten unterschiedlich (eine Hypothek anders als ein Kreditkartenbuch).</w:t>
+        <w:t xml:space="preserve"> - jede Kreditklasse reagiert gemäß quellenbelegter Sensitivitäten unterschiedlich (eine Hypothek anders als ein Kreditkartenbuch).</w:t>
       </w:r>
     </w:p>
     <w:p>
@@ -2466,7 +2194,7 @@
           <w:b w:val="0"/>
           <w:sz w:val="21"/>
         </w:rPr>
-        <w:t xml:space="preserve"> — im Zweifel überschätzt das Modell den Kapitalbedarf; entlastende Effekte (z. B. Zinsüberschuss) werden bewusst nicht gegengerechnet.</w:t>
+        <w:t xml:space="preserve"> - im Zweifel überschätzt das Modell den Kapitalbedarf; entlastende Effekte (z. B. Zinsüberschuss) werden bewusst nicht gegengerechnet.</w:t>
       </w:r>
     </w:p>
     <w:p>
@@ -2520,7 +2248,7 @@
           <w:color w:val="6E6E6E"/>
           <w:sz w:val="17"/>
         </w:rPr>
-        <w:t>Abb. 1 · Modell-Pipeline: Zwei Makro-Schocks laufen über die β-Transmission und die Basel-III-Kapitalformel in das Kreditbuch; der Zinsschock wirkt zusätzlich über den Sovereign-Kanal. Zielgröße ist stets die CET1-Quote unter Stress.</w:t>
+        <w:t>Abb. 1: Modell-Pipeline. Zwei Makro-Schocks laufen über die β-Transmission und die Basel-III-Kapitalformel in das Kreditbuch; der Zinsschock wirkt zusätzlich über den Sovereign-Kanal. Zielgröße ist stets die CET1-Quote unter Stress.</w:t>
       </w:r>
     </w:p>
     <w:p>
@@ -2528,7 +2256,7 @@
         <w:pStyle w:val="Heading2"/>
       </w:pPr>
       <w:r>
-        <w:t>Prüfpfad für kritische Evaluation</w:t>
+        <w:t>Orientierung für die Prüfung</w:t>
       </w:r>
     </w:p>
     <w:p>
@@ -2852,7 +2580,7 @@
         <w:pStyle w:val="Heading1"/>
       </w:pPr>
       <w:r>
-        <w:t>2 · Die zwei Risikofaktoren</w:t>
+        <w:t>2. Die zwei Risikofaktoren</w:t>
       </w:r>
     </w:p>
     <w:p>
@@ -2865,7 +2593,7 @@
           <w:i w:val="0"/>
           <w:sz w:val="21"/>
         </w:rPr>
-        <w:t>Beide Faktoren sind täglich beobachtbare Marktgrößen — das Modell braucht keine latenten Zustandsvariablen:</w:t>
+        <w:t>Beide Faktoren sind täglich beobachtbare Marktgrößen - das Modell braucht keine latenten Zustandsvariablen:</w:t>
       </w:r>
     </w:p>
     <w:tbl>
@@ -3096,7 +2824,7 @@
         <w:pStyle w:val="Heading2"/>
       </w:pPr>
       <w:r>
-        <w:t>Warum Brent-log-Return?</w:t>
+        <w:t>Warum Brent und Log-Renditen?</w:t>
       </w:r>
     </w:p>
     <w:p>
@@ -3175,7 +2903,7 @@
           <w:i w:val="0"/>
           <w:sz w:val="21"/>
         </w:rPr>
-        <w:t xml:space="preserve"> Gemessen auf Tagesbasis — tägliche Brent-log-Returns gegen tägliche Änderungen des 10-Jahres-Svensson-Zinses, rollierendes 5-Jahres-Fenster mit 1 242 Handelstagen — beträgt die Pearson-Korrelation der beiden Faktoren nur ρ = +0,07 (Fisher-z-95 %-Konfidenzintervall [+0,01; +0,12]; OLS-R² = 0,005). Sie tragen also nahezu unabhängige Information — eine Aggregation zu einem Einheitsfaktor würde genau die Unterscheidung wegwerfen, die z. B. eine zinsgetriebene Hypothekenkrise von einem Energiekostenschock trennt. Die Grenze dieser Tages-Evidenz für den Jahres-Horizont diskutiert Annahme A-10; die Slider-Spannen des Cockpits (ΔBrent_log ∈ [−1,0; +1,5], Δr_10y ∈ [−3; +5] pp) orientieren sich an der Größenordnung des adversen EBA/ESRB-2025-Szenarios (§4.1.6).</w:t>
+        <w:t xml:space="preserve"> Gemessen auf Tagesbasis - tägliche Brent-log-Returns gegen tägliche Änderungen des 10-Jahres-Svensson-Zinses, rollierendes 5-Jahres-Fenster mit 1 242 Handelstagen - beträgt die Pearson-Korrelation der beiden Faktoren nur ρ = +0,07 (Fisher-z-95 %-Konfidenzintervall [+0,01; +0,12]; OLS-R² = 0,005). Sie tragen also nahezu unabhängige Information - eine Aggregation zu einem Einheitsfaktor würde genau die Unterscheidung wegwerfen, die z. B. eine zinsgetriebene Hypothekenkrise von einem Energiekostenschock trennt. Die Grenze dieser Tages-Evidenz für den Jahres-Horizont diskutiert Annahme A-10; die Slider-Spannen des Cockpits (ΔBrent_log ∈ [−1,0; +1,5], Δr_10y ∈ [−3; +5] pp) orientieren sich an der Größenordnung des adversen EBA/ESRB-2025-Szenarios (§4.1.6).</w:t>
       </w:r>
     </w:p>
     <w:p>
@@ -3297,7 +3025,7 @@
                 <w:b w:val="0"/>
                 <w:sz w:val="18"/>
               </w:rPr>
-              <w:t xml:space="preserve"> — Risikoparameter (Live-Snapshot 31.12.2024 + Backtest-Reihe FY2021–2024)</w:t>
+              <w:t xml:space="preserve"> - Risikoparameter (Live-Snapshot 31.12.2024 + Backtest-Reihe FY2021–2024)</w:t>
             </w:r>
           </w:p>
         </w:tc>
@@ -3351,7 +3079,7 @@
                 <w:b w:val="0"/>
                 <w:sz w:val="18"/>
               </w:rPr>
-              <w:t xml:space="preserve"> — realisierte Werte für die Validierung; nie PD/LGD-Quelle</w:t>
+              <w:t xml:space="preserve"> - realisierte Werte für die Validierung; nie PD/LGD-Quelle</w:t>
             </w:r>
           </w:p>
         </w:tc>
@@ -3508,7 +3236,7 @@
         <w:pStyle w:val="Heading1"/>
       </w:pPr>
       <w:r>
-        <w:t>3 · Sektor-differenzierte Stress-Transmission</w:t>
+        <w:t>3. Stressübertragung nach Kreditklasse</w:t>
       </w:r>
     </w:p>
     <w:p>
@@ -3521,7 +3249,7 @@
           <w:i w:val="0"/>
           <w:sz w:val="21"/>
         </w:rPr>
-        <w:t xml:space="preserve">Kern des Modells ist die Übersetzung der beiden Schocks in Risikoparameter — </w:t>
+        <w:t xml:space="preserve">Kern des Modells ist die Übersetzung der beiden Schocks in Risikoparameter - </w:t>
       </w:r>
       <w:r>
         <w:rPr>
@@ -3564,7 +3292,7 @@
           <w:i w:val="0"/>
           <w:sz w:val="21"/>
         </w:rPr>
-        <w:t xml:space="preserve">Die gestressten Werte werden begrenzt — jede Grenze hat einen Grund: Die </w:t>
+        <w:t xml:space="preserve">Die gestressten Werte werden begrenzt - jede Grenze hat einen Grund: Die </w:t>
       </w:r>
       <w:r>
         <w:rPr>
@@ -3580,7 +3308,7 @@
           <w:i w:val="0"/>
           <w:sz w:val="21"/>
         </w:rPr>
-        <w:t xml:space="preserve"> ist der regulatorische Basel-Floor (CRR Art. 160/163 — keine Bank darf einem lebenden Portfolio eine geringere Ausfallwahrscheinlichkeit zuweisen). Die </w:t>
+        <w:t xml:space="preserve"> ist der regulatorische Basel-Floor (CRR Art. 160/163 - keine Bank darf einem lebenden Portfolio eine geringere Ausfallwahrscheinlichkeit zuweisen). Die </w:t>
       </w:r>
       <w:r>
         <w:rPr>
@@ -3682,7 +3410,7 @@
           <w:color w:val="6E6E6E"/>
           <w:sz w:val="17"/>
         </w:rPr>
-        <w:t>Abb. 2 · Die Sensitivitäts-Matrix als Bild: Jede Zelle ist eine dokumentierte Annahme — rot = Risiko steigt mit dem Schock, blau = sinkt, weiß = kein Effekt. Auffällig: Hypotheken sind zinsgetrieben, Banken profitieren leicht von Zinsanstiegen (Zinsüberschuss), Staaten reagieren nicht über das Kreditbuch (separater Sovereign-Kanal).</w:t>
+        <w:t>Abb. 2: Sensitivitätsmatrix. Jede Zelle ist eine dokumentierte Annahme - rot = Risiko steigt mit dem Schock, blau = sinkt, weiß = kein Effekt. Auffällig: Hypotheken sind zinsgetrieben, Banken profitieren leicht von Zinsanstiegen (Zinsüberschuss), Staaten reagieren nicht über das Kreditbuch (separater Sovereign-Kanal).</w:t>
       </w:r>
     </w:p>
     <w:p>
@@ -3985,7 +3713,7 @@
                 <w:b w:val="0"/>
                 <w:sz w:val="17"/>
               </w:rPr>
-              <w:t>Wie Corporate, aber ≈2× stärker — KMU haben dünnere Puffer und weniger Preissetzungsmacht (ECB WP 2897).</w:t>
+              <w:t>Wie Corporate, aber ≈2× stärker - KMU haben dünnere Puffer und weniger Preissetzungsmacht (ECB WP 2897).</w:t>
             </w:r>
           </w:p>
         </w:tc>
@@ -4459,7 +4187,7 @@
                 <w:b w:val="0"/>
                 <w:sz w:val="17"/>
               </w:rPr>
-              <w:t>Im Kreditbuch bewusst inert — der Zins wirkt auf Staaten über den Marktwert-Kanal (Abschnitt 4), nicht über die PD.</w:t>
+              <w:t>Im Kreditbuch bewusst inert - der Zins wirkt auf Staaten über den Marktwert-Kanal (Abschnitt 4), nicht über die PD.</w:t>
             </w:r>
           </w:p>
         </w:tc>
@@ -4480,7 +4208,7 @@
           <w:i/>
           <w:sz w:val="19"/>
         </w:rPr>
-        <w:t>Quellen der Kalibrierung: EBA (2024) *2025 EU-wide Stress Test — Methodological Note* §2.4.2 (sektorale Sensitivitäten sind der aufsichtlich vorgesehene Ansatz); ECB WP 2897 (Unternehmens-PD auf Angebots-/Zinsschocks, KMU-Verstärkung ≈ 2–3×), ECB WP 3207 (Sektor-Heterogenität der Unternehmens-Ausfälle im Stress), ECB WP 3112 (Hypotheken-Defaults und Zins), ECB Financial Stability Review Mai 2024 (Haushalte); die relative Rangfolge der Klassen ist gegen EBA Results 2025, Fig. 22 (projizierte Verlustquoten je Portfolio) quervalidiert. Die β sind als belegte, per Regler übersteuerbare Defaults ausgewiesen — Konfidenzklasse [estimate]; ihre Wirkung auf das Endergebnis quantifiziert der ±50-%-Robustheitstest in Abschnitt 7.</w:t>
+        <w:t>Quellen der Kalibrierung: EBA (2024) *2025 EU-wide Stress Test - Methodological Note* §2.4.2 (sektorale Sensitivitäten sind der aufsichtlich vorgesehene Ansatz); ECB WP 2897 (Unternehmens-PD auf Angebots-/Zinsschocks, KMU-Verstärkung ≈ 2–3×), ECB WP 3207 (Sektor-Heterogenität der Unternehmens-Ausfälle im Stress), ECB WP 3112 (Hypotheken-Defaults und Zins), ECB Financial Stability Review Mai 2024 (Haushalte); die relative Rangfolge der Klassen ist gegen EBA Results 2025, Fig. 22 (projizierte Verlustquoten je Portfolio) quervalidiert. Die β sind als belegte, per Regler übersteuerbare Defaults ausgewiesen - Konfidenzklasse [estimate]; ihre Wirkung auf das Endergebnis quantifiziert der ±50-%-Robustheitstest in Abschnitt 7.</w:t>
       </w:r>
     </w:p>
     <w:p>
@@ -4513,7 +4241,7 @@
           <w:b/>
           <w:sz w:val="21"/>
         </w:rPr>
-        <w:t>Schritt 1 — PD-Transmission:</w:t>
+        <w:t>Schritt 1 - PD-Transmission:</w:t>
       </w:r>
       <w:r>
         <w:rPr>
@@ -4560,7 +4288,7 @@
           <w:b/>
           <w:sz w:val="21"/>
         </w:rPr>
-        <w:t>Schritt 2 — LGD-Transmission:</w:t>
+        <w:t>Schritt 2 - LGD-Transmission:</w:t>
       </w:r>
       <w:r>
         <w:rPr>
@@ -4607,7 +4335,7 @@
           <w:b/>
           <w:sz w:val="21"/>
         </w:rPr>
-        <w:t>Schritt 3 — Kapitalwirkung (IRB-Formel):</w:t>
+        <w:t>Schritt 3 - Kapitalwirkung (IRB-Formel):</w:t>
       </w:r>
       <w:r>
         <w:rPr>
@@ -4628,7 +4356,7 @@
           <w:b w:val="0"/>
           <w:sz w:val="21"/>
         </w:rPr>
-        <w:t xml:space="preserve">), die RWA-Dichte von 95,0 % auf 105,9 % — ein Anstieg um </w:t>
+        <w:t xml:space="preserve">), die RWA-Dichte von 95,0 % auf 105,9 % - ein Anstieg um </w:t>
       </w:r>
       <w:r>
         <w:rPr>
@@ -4663,7 +4391,7 @@
         <w:pStyle w:val="Heading1"/>
       </w:pPr>
       <w:r>
-        <w:t>4 · Kapitalrechnung und CET1-Bridge</w:t>
+        <w:t>4. Kapitalrechnung und CET1-Überleitung</w:t>
       </w:r>
     </w:p>
     <w:p>
@@ -4692,7 +4420,7 @@
           <w:i w:val="0"/>
           <w:sz w:val="21"/>
         </w:rPr>
-        <w:t xml:space="preserve"> (Vasicek/ASRF; BCBS 2017, §272–284) — bewusst der aufsichtliche Standard, keine Eigenkonstruktion:</w:t>
+        <w:t xml:space="preserve"> (Vasicek/ASRF; BCBS 2017, §272–284) - bewusst der aufsichtliche Standard, keine Eigenkonstruktion:</w:t>
       </w:r>
     </w:p>
     <w:p>
@@ -4747,23 +4475,7 @@
           <w:i w:val="0"/>
           <w:sz w:val="21"/>
         </w:rPr>
-        <w:t xml:space="preserve">Dabei ist ρ der regulatorische IRB-Klassenparameter nach CRR Art. 153/154, MA das Laufzeit-Adjustment und N die Standardnormalverteilung; ΔMtM_Sov ist bei Zinsanstieg negativ (Kurswertverlust) und umfasst nur den CET1-wirksamen FVOCI/FVTPL-Anteil. Das Kreditbuch wirkt also auf Zähler (−ΔEL) </w:t>
-      </w:r>
-      <w:r>
-        <w:rPr>
-          <w:b/>
-          <w:i w:val="0"/>
-          <w:sz w:val="21"/>
-        </w:rPr>
-        <w:t>und</w:t>
-      </w:r>
-      <w:r>
-        <w:rPr>
-          <w:b w:val="0"/>
-          <w:i w:val="0"/>
-          <w:sz w:val="21"/>
-        </w:rPr>
-        <w:t xml:space="preserve"> Nenner (+ΔRWA), der Sovereign-Kanal nur auf den Zähler. Die theoretische Fundierung des ASRF-Rahmens liefern Vasicek (1991, 2002) und Gordy (2003).</w:t>
+        <w:t>Dabei ist ρ der regulatorische IRB-Klassenparameter nach CRR Art. 153/154, MA das Laufzeit-Adjustment und N die Standardnormalverteilung; ΔMtM_Sov ist bei Zinsanstieg negativ (Kurswertverlust) und umfasst nur den CET1-wirksamen FVOCI/FVTPL-Anteil. Das Kreditbuch wirkt auf Zähler (−ΔEL) und Nenner (+ΔRWA), der Sovereign-Kanal nur auf den Zähler. Die theoretische Fundierung des ASRF-Rahmens liefern Vasicek (1991, 2002) und Gordy (2003).</w:t>
       </w:r>
     </w:p>
     <w:p>
@@ -4771,7 +4483,7 @@
         <w:pStyle w:val="Heading2"/>
       </w:pPr>
       <w:r>
-        <w:t>Die Formelstrecke im Detail</w:t>
+        <w:t>Die wichtigsten Formeln</w:t>
       </w:r>
     </w:p>
     <w:p>
@@ -4784,55 +4496,7 @@
           <w:i w:val="0"/>
           <w:sz w:val="21"/>
         </w:rPr>
-        <w:t xml:space="preserve">Für die kritische Evaluation sind vier Formeln zentral. Sie bilden die komplette Wirkungskette ab: zuerst werden die makroökonomischen Schocks in Risikoparameter übersetzt, danach werden diese Parameter in regulatorische Kapitalanforderungen und schließlich in die CET1-Quote überführt. Wichtig: Die Formeln trennen strikt zwischen </w:t>
-      </w:r>
-      <w:r>
-        <w:rPr>
-          <w:b/>
-          <w:i w:val="0"/>
-          <w:sz w:val="21"/>
-        </w:rPr>
-        <w:t>gemeldeten Größen</w:t>
-      </w:r>
-      <w:r>
-        <w:rPr>
-          <w:b w:val="0"/>
-          <w:i w:val="0"/>
-          <w:sz w:val="21"/>
-        </w:rPr>
-        <w:t xml:space="preserve"> (PD, LGD, EAD, CET1, RWA, IFRS-9-Split), </w:t>
-      </w:r>
-      <w:r>
-        <w:rPr>
-          <w:b/>
-          <w:i w:val="0"/>
-          <w:sz w:val="21"/>
-        </w:rPr>
-        <w:t>regulatorisch vorgegebenen Parametern</w:t>
-      </w:r>
-      <w:r>
-        <w:rPr>
-          <w:b w:val="0"/>
-          <w:i w:val="0"/>
-          <w:sz w:val="21"/>
-        </w:rPr>
-        <w:t xml:space="preserve"> (z. B. ρ, 99,9 %-Quantil, RWA-Faktor 12,5) und </w:t>
-      </w:r>
-      <w:r>
-        <w:rPr>
-          <w:b/>
-          <w:i w:val="0"/>
-          <w:sz w:val="21"/>
-        </w:rPr>
-        <w:t>Modellkonventionen</w:t>
-      </w:r>
-      <w:r>
-        <w:rPr>
-          <w:b w:val="0"/>
-          <w:i w:val="0"/>
-          <w:sz w:val="21"/>
-        </w:rPr>
-        <w:t xml:space="preserve"> (z. B. lineare β/γ-Transmission, konstante EAD unter Stress).</w:t>
+        <w:t>Für die kritische Evaluation sind vier Formeln zentral. Sie bilden die komplette Wirkungskette ab. Zuerst werden die makroökonomischen Schocks in Risikoparameter übersetzt, danach werden diese Parameter in regulatorische Kapitalanforderungen und schließlich in die CET1-Quote überführt. Wichtig: Die Formeln trennen strikt zwischen gemeldeten Größen (PD, LGD, EAD, CET1, RWA, IFRS-9-Split), regulatorisch vorgegebenen Parametern (z. B. ρ, 99,9 %-Quantil, RWA-Faktor 12,5) und Modellkonventionen (z. B. lineare β/γ-Transmission, konstante EAD unter Stress).</w:t>
       </w:r>
     </w:p>
     <w:p>
@@ -4845,7 +4509,7 @@
           <w:i w:val="0"/>
           <w:sz w:val="21"/>
         </w:rPr>
-        <w:t>1 · Stress-Transmission:</w:t>
+        <w:t>1. Stress-Transmission:</w:t>
       </w:r>
       <w:r>
         <w:rPr>
@@ -4866,7 +4530,7 @@
           <w:i w:val="0"/>
           <w:sz w:val="21"/>
         </w:rPr>
-        <w:t>2 · Erwarteter Verlust:</w:t>
+        <w:t>2. Erwarteter Verlust:</w:t>
       </w:r>
       <w:r>
         <w:rPr>
@@ -4887,7 +4551,7 @@
           <w:i w:val="0"/>
           <w:sz w:val="21"/>
         </w:rPr>
-        <w:t>3 · Unerwarteter Verlust / RWA:</w:t>
+        <w:t>3. Unerwarteter Verlust / RWA:</w:t>
       </w:r>
       <w:r>
         <w:rPr>
@@ -4908,7 +4572,7 @@
           <w:i w:val="0"/>
           <w:sz w:val="21"/>
         </w:rPr>
-        <w:t>4 · CET1-Bridge:</w:t>
+        <w:t>4. CET1-Überleitung:</w:t>
       </w:r>
       <w:r>
         <w:rPr>
@@ -4969,7 +4633,7 @@
           <w:i w:val="0"/>
           <w:sz w:val="21"/>
         </w:rPr>
-        <w:t xml:space="preserve"> gesetzt (Basel-Default; Pillar 3 legt keine Restlaufzeit je Klasse offen — konstant über alle Jahrgänge und damit zeitvergleichs-neutral), und die KMU-Größenanpassung nutzt einen repräsentativen Jahresumsatz </w:t>
+        <w:t xml:space="preserve"> gesetzt (Basel-Default; Pillar 3 legt keine Restlaufzeit je Klasse offen - konstant über alle Jahrgänge und damit zeitvergleichs-neutral), und die KMU-Größenanpassung nutzt einen repräsentativen Jahresumsatz </w:t>
       </w:r>
       <w:r>
         <w:rPr>
@@ -5006,7 +4670,7 @@
           <w:i w:val="0"/>
           <w:sz w:val="21"/>
         </w:rPr>
-        <w:t xml:space="preserve"> Die Stress-Wirkung wird sequentiell zerlegt — Stufe 1 stresst nur die PD (PD-Kanal), Stufe 2 zusätzlich die LGD (LGD-Kanal); beide Teilbeträge addieren sich exakt zu ΔRWA bzw. ΔEL. </w:t>
+        <w:t xml:space="preserve"> Die Stress-Wirkung wird sequentiell zerlegt - Stufe 1 stresst nur die PD (PD-Kanal), Stufe 2 zusätzlich die LGD (LGD-Kanal); beide Teilbeträge addieren sich exakt zu ΔRWA bzw. ΔEL. </w:t>
       </w:r>
       <w:r>
         <w:rPr>
@@ -5022,7 +4686,7 @@
           <w:i w:val="0"/>
           <w:sz w:val="21"/>
         </w:rPr>
-        <w:t xml:space="preserve"> ΔEL = Δ(PD · LGD · EAD) wird 1:1 vom CET1-Zähler abgezogen — als Proxy der stressbedingten Risikovorsorge. Die regulatorische EL-Shortfall-Mechanik (CRR Art. 36, 62) wird nicht separat modelliert — eine bewusste Vereinfachung auf der konservativen Seite.</w:t>
+        <w:t xml:space="preserve"> ΔEL = Δ(PD · LGD · EAD) wird 1:1 vom CET1-Zähler abgezogen - als Proxy der stressbedingten Risikovorsorge. Die regulatorische EL-Shortfall-Mechanik (CRR Art. 36, 62) wird nicht separat modelliert - eine bewusste Vereinfachung auf der konservativen Seite.</w:t>
       </w:r>
     </w:p>
     <w:p>
@@ -5043,7 +4707,7 @@
           <w:i w:val="0"/>
           <w:sz w:val="21"/>
         </w:rPr>
-        <w:t xml:space="preserve"> — regulatorisch fixiert (CRR Art. 153/154), keine Modellannahme:</w:t>
+        <w:t xml:space="preserve"> - regulatorisch fixiert (CRR Art. 153/154), keine Modellannahme:</w:t>
       </w:r>
     </w:p>
     <w:tbl>
@@ -5383,7 +5047,7 @@
           <w:i w:val="0"/>
           <w:sz w:val="21"/>
         </w:rPr>
-        <w:t xml:space="preserve">, summiert über die EBA-Laufzeit-Buckets je Bank. Die Modified Duration je Bucket ist eine Konvention über den Bucket-Mittelpunkt — 0,125 / 0,625 / 1,5 / 2,5 / 4,0 / 7,5 Jahre für die geschlossenen Buckets; der offene &gt;10Y-Bucket konservativ mit </w:t>
+        <w:t xml:space="preserve">, summiert über die EBA-Laufzeit-Buckets je Bank. Die Modified Duration je Bucket ist eine Konvention über den Bucket-Mittelpunkt - 0,125 / 0,625 / 1,5 / 2,5 / 4,0 / 7,5 Jahre für die geschlossenen Buckets; der offene &gt;10Y-Bucket konservativ mit </w:t>
       </w:r>
       <w:r>
         <w:rPr>
@@ -5399,7 +5063,7 @@
           <w:i w:val="0"/>
           <w:sz w:val="21"/>
         </w:rPr>
-        <w:t xml:space="preserve"> (angelehnt an das Basel-/EBA-Zeitband 10–15 J.; Slotting-Logik analog BCBS 368). CET1-wirksam ist nur der HfT/FVTPL/FVOCI-Anteil — dieser IFRS-9-Split ist </w:t>
+        <w:t xml:space="preserve"> (angelehnt an das Basel-/EBA-Zeitband 10–15 J.; Slotting-Logik analog BCBS 368). CET1-wirksam ist nur der HfT/FVTPL/FVOCI-Anteil - dieser IFRS-9-Split ist </w:t>
       </w:r>
       <w:r>
         <w:rPr>
@@ -5415,7 +5079,7 @@
           <w:i w:val="0"/>
           <w:sz w:val="21"/>
         </w:rPr>
-        <w:t>, keine Pauschal-Annahme; duration-gewichtet sind über die zehn Banken ≈ 51 % des Brutto-MtM CET1-wirksam. Konvexität ist vernachlässigt (linearer Duration-Ansatz — überzeichnet den Verlust bei großen Zinsanstiegen leicht, wirkt also konservativ). Der Kanal nutzt den EBA-Perimeter aller zehn Banken und ist unabhängig davon, ob eine Bank Staaten im IRB-Kreditbuch führt (Beispiel Santander: Standardansatz im Kreditbuch, vollständig im Sovereign-Kanal). Durationslogik nach Tuckman/Serrat (2012); die begleitenden Marktbuch-Analysen des Cockpits — Staaten-Banken-Verflechtung (Doom Loop) und latente Bewertungsverluste — stützen sich auf Brunnermeier et al. (2016), Acharya/Drechsler/Schnabl (2014) und Jiang et al. (2023).</w:t>
+        <w:t>, keine Pauschal-Annahme; duration-gewichtet sind über die zehn Banken ≈ 51 % des Brutto-MtM CET1-wirksam. Konvexität ist vernachlässigt (linearer Duration-Ansatz - überzeichnet den Verlust bei großen Zinsanstiegen leicht, wirkt also konservativ). Der Kanal nutzt den EBA-Perimeter aller zehn Banken und ist unabhängig davon, ob eine Bank Staaten im IRB-Kreditbuch führt (Beispiel Santander: Standardansatz im Kreditbuch, vollständig im Sovereign-Kanal). Durationslogik nach Tuckman/Serrat (2012); die begleitenden Marktbuch-Analysen des Cockpits - Staaten-Banken-Verflechtung (Doom Loop) und latente Bewertungsverluste - stützen sich auf Brunnermeier et al. (2016), Acharya/Drechsler/Schnabl (2014) und Jiang et al. (2023).</w:t>
       </w:r>
     </w:p>
     <w:p>
@@ -5469,7 +5133,7 @@
           <w:color w:val="6E6E6E"/>
           <w:sz w:val="17"/>
         </w:rPr>
-        <w:t>Abb. 3 · Die CET1-Bridge: Das Kreditbuch erhöht den Nenner (ΔRWA) und senkt über erwartete Verluste den Zähler (ΔEL); der Sovereign-Kanal senkt den Zähler zusätzlich (ΔMtM). Entlastende Gewinn-Effekte werden bewusst nicht angesetzt — die Quote unter Stress ist eine konservative Untergrenze.</w:t>
+        <w:t>Abb. 3: CET1-Überleitung. Das Kreditbuch erhöht den Nenner (ΔRWA) und senkt über erwartete Verluste den Zähler (ΔEL); der Sovereign-Kanal senkt den Zähler zusätzlich (ΔMtM). Entlastende Gewinn-Effekte werden bewusst nicht angesetzt - die Quote unter Stress ist eine konservative Untergrenze.</w:t>
       </w:r>
     </w:p>
     <w:p>
@@ -5477,7 +5141,7 @@
         <w:pStyle w:val="Heading1"/>
       </w:pPr>
       <w:r>
-        <w:t>5 · Datenbasis und Integritätssicherung</w:t>
+        <w:t>5. Datenbasis und Qualitätsprüfung</w:t>
       </w:r>
     </w:p>
     <w:p>
@@ -5498,7 +5162,7 @@
           <w:i w:val="0"/>
           <w:sz w:val="21"/>
         </w:rPr>
-        <w:t xml:space="preserve">Die zehn größten EU-Banken nach IRB-EAD — zusammen </w:t>
+        <w:t xml:space="preserve">Die zehn größten EU-Banken nach IRB-EAD - zusammen </w:t>
       </w:r>
       <w:r>
         <w:rPr>
@@ -6582,7 +6246,7 @@
           <w:i/>
           <w:sz w:val="17"/>
         </w:rPr>
-        <w:t xml:space="preserve"> (LEI F0HUI1NY1AZMJMD8LP67, CET1 18,8 %) — der Ebene des EBA-Transparency-Kapitalpanels. · * (+1) = eine zusätzliche quellenbelegte, aber modell-ausgeschlossene Audit-Zeile (`include_in_backtest = 0`, siehe unten). · ² inkl. der ING-spezifischen Zusatzklasse mortgage_sme; kein QRRE-/Sovereign-A-IRB im Meldeumfang. · ³ dünnster Meldeumfang (5 Klassen); enthält die einzige offene Zelle (corporate 2021). Summe genutzter Backtest-Zeilen: </w:t>
+        <w:t xml:space="preserve"> (LEI F0HUI1NY1AZMJMD8LP67, CET1 18,8 %) - der Ebene des EBA-Transparency-Kapitalpanels. * (+1) = eine zusätzliche quellenbelegte, aber modell-ausgeschlossene Audit-Zeile (`include_in_backtest = 0`, siehe unten). ² inkl. der ING-spezifischen Zusatzklasse mortgage_sme; kein QRRE-/Sovereign-A-IRB im Meldeumfang. ³ dünnster Meldeumfang (5 Klassen); enthält die einzige offene Zelle (corporate 2021). Summe genutzter Backtest-Zeilen: </w:t>
       </w:r>
       <w:r>
         <w:rPr>
@@ -6643,7 +6307,7 @@
           <w:i w:val="0"/>
           <w:sz w:val="21"/>
         </w:rPr>
-        <w:t>; 69 der 70 Zeilen tragen PD/LGD-Werte direkt aus dem EU-CR6-Sub-total des jeweiligen Pillar-3-Reports mit Seiten- und URL-Beleg (Konfidenzklasse [published]). Die 70. Zeile — Santander-Sovereign — ist ein dokumentierter Platzhalter ohne IRB-Parameter, weil Santander Staaten regulatorisch im Standardansatz führt (im Sovereign-MtM-Kanal, Abschnitt 4, ist Santander dennoch vollständig enthalten).</w:t>
+        <w:t>; 69 der 70 Zeilen tragen PD/LGD-Werte direkt aus dem EU-CR6-Sub-total des jeweiligen Pillar-3-Reports mit Seiten- und URL-Beleg (Konfidenzklasse [published]). Die 70. Zeile - Santander-Sovereign - ist ein dokumentierter Platzhalter ohne IRB-Parameter, weil Santander Staaten regulatorisch im Standardansatz führt (im Sovereign-MtM-Kanal, Abschnitt 4, ist Santander dennoch vollständig enthalten).</w:t>
       </w:r>
     </w:p>
     <w:p>
@@ -6696,7 +6360,7 @@
           <w:i w:val="0"/>
           <w:sz w:val="21"/>
         </w:rPr>
-        <w:t xml:space="preserve"> (255 von 256 gemeldeten Zellen) — Klassen, die eine Bank gar nicht im A-IRB führt, zählen nicht als Lücke. Davon sind </w:t>
+        <w:t xml:space="preserve"> (255 von 256 gemeldeten Zellen) - Klassen, die eine Bank gar nicht im A-IRB führt, zählen nicht als Lücke. Davon sind </w:t>
       </w:r>
       <w:r>
         <w:rPr>
@@ -6804,7 +6468,7 @@
         <w:pStyle w:val="Heading1"/>
       </w:pPr>
       <w:r>
-        <w:t>6 · Annahmen-Inventar (A-01 bis A-10)</w:t>
+        <w:t>6. Annahmenübersicht (A-01 bis A-10)</w:t>
       </w:r>
     </w:p>
     <w:p>
@@ -6833,7 +6497,7 @@
           <w:i w:val="0"/>
           <w:sz w:val="21"/>
         </w:rPr>
-        <w:t xml:space="preserve"> = veröffentlichte Messung · </w:t>
+        <w:t xml:space="preserve"> = veröffentlichte Messung; </w:t>
       </w:r>
       <w:r>
         <w:rPr>
@@ -6849,7 +6513,7 @@
           <w:i w:val="0"/>
           <w:sz w:val="21"/>
         </w:rPr>
-        <w:t xml:space="preserve"> = belegte Schätzung · </w:t>
+        <w:t xml:space="preserve"> = belegte Schätzung; </w:t>
       </w:r>
       <w:r>
         <w:rPr>
@@ -6865,7 +6529,7 @@
           <w:i w:val="0"/>
           <w:sz w:val="21"/>
         </w:rPr>
-        <w:t xml:space="preserve"> = strukturelle Vereinfachung · </w:t>
+        <w:t xml:space="preserve"> = strukturelle Vereinfachung; </w:t>
       </w:r>
       <w:r>
         <w:rPr>
@@ -6881,7 +6545,7 @@
           <w:i w:val="0"/>
           <w:sz w:val="21"/>
         </w:rPr>
-        <w:t xml:space="preserve"> = gesetzte Konvention. Die Tabelle gibt den Überblick; darunter wird jede Annahme einzeln begründet — inklusive der verworfenen Alternative und der Wirkung einer Fehlspezifikation.</w:t>
+        <w:t xml:space="preserve"> = gesetzte Konvention. Die Tabelle gibt den Überblick; darunter wird jede Annahme einzeln begründet - inklusive der verworfenen Alternative und der Wirkung einer Fehlspezifikation.</w:t>
       </w:r>
     </w:p>
     <w:p>
@@ -8209,7 +7873,7 @@
         <w:pStyle w:val="Heading3"/>
       </w:pPr>
       <w:r>
-        <w:t>A-01 · PD-Quelle: Pillar-3 EU-CR6 (31.12.2024)</w:t>
+        <w:t>A-01 - PD-Quelle: Pillar-3 EU-CR6 (31.12.2024)</w:t>
       </w:r>
     </w:p>
     <w:p>
@@ -8230,7 +7894,7 @@
           <w:i w:val="0"/>
           <w:sz w:val="19"/>
         </w:rPr>
-        <w:t xml:space="preserve"> Je Bank und Klasse die EAD-gewichtete Durchschnitts-PD aus dem EU-CR6-Sub-total — die regulatorische 1-Jahres-PD nach CRR Art. 180, inklusive des 100-%-Default-Bands. </w:t>
+        <w:t xml:space="preserve"> Je Bank und Klasse die EAD-gewichtete Durchschnitts-PD aus dem EU-CR6-Sub-total - die regulatorische 1-Jahres-PD nach CRR Art. 180, inklusive des 100-%-Default-Bands. </w:t>
       </w:r>
       <w:r>
         <w:rPr>
@@ -8278,7 +7942,7 @@
           <w:i w:val="0"/>
           <w:sz w:val="19"/>
         </w:rPr>
-        <w:t xml:space="preserve"> Das PD-Niveau skaliert den erwarteten Verlust nahezu proportional, die Kapitalanforderung unterproportional — eine Niveauverzerrung verschiebt also Ergebnisse, kippt aber keine Richtungsaussage.</w:t>
+        <w:t xml:space="preserve"> Das PD-Niveau skaliert den erwarteten Verlust nahezu proportional, die Kapitalanforderung unterproportional - eine Niveauverzerrung verschiebt also Ergebnisse, kippt aber keine Richtungsaussage.</w:t>
       </w:r>
     </w:p>
     <w:p>
@@ -8286,7 +7950,7 @@
         <w:pStyle w:val="Heading3"/>
       </w:pPr>
       <w:r>
-        <w:t>A-02 · LGD-Quelle: Pillar-3 EU-CR6 (31.12.2024)</w:t>
+        <w:t>A-02 - LGD-Quelle: Pillar-3 EU-CR6 (31.12.2024)</w:t>
       </w:r>
     </w:p>
     <w:p>
@@ -8339,7 +8003,7 @@
           <w:i w:val="0"/>
           <w:sz w:val="19"/>
         </w:rPr>
-        <w:t xml:space="preserve"> die pauschale F-IRB-Aufsichts-LGD von 45 % — sie würde besicherte Portfolien (v. a. Hypotheken) massiv überzeichnen. </w:t>
+        <w:t xml:space="preserve"> die pauschale F-IRB-Aufsichts-LGD von 45 % - sie würde besicherte Portfolien (v. a. Hypotheken) massiv überzeichnen. </w:t>
       </w:r>
       <w:r>
         <w:rPr>
@@ -8355,7 +8019,7 @@
           <w:i w:val="0"/>
           <w:sz w:val="19"/>
         </w:rPr>
-        <w:t xml:space="preserve"> LGD wirkt linear auf erwarteten Verlust und fast linear auf die Kapitalanforderung — der direkteste Hebel unter den Parametern.</w:t>
+        <w:t xml:space="preserve"> LGD wirkt linear auf erwarteten Verlust und fast linear auf die Kapitalanforderung - der direkteste Hebel unter den Parametern.</w:t>
       </w:r>
     </w:p>
     <w:p>
@@ -8363,7 +8027,7 @@
         <w:pStyle w:val="Heading3"/>
       </w:pPr>
       <w:r>
-        <w:t>A-02c · Backtest-Zeitreihe (nur Pillar-3, no-look-ahead)</w:t>
+        <w:t>A-02c - Backtest-Zeitreihe (nur Pillar-3, no-look-ahead)</w:t>
       </w:r>
     </w:p>
     <w:p>
@@ -8384,7 +8048,7 @@
           <w:i w:val="0"/>
           <w:sz w:val="19"/>
         </w:rPr>
-        <w:t xml:space="preserve"> Eigene Roh-Reihe über 10 Banken × FY2021–FY2024 (255 quellenbelegte Zeilen, davon 253 modellfähig); ein Quartal im Jahr Y nutzt ausschließlich den Stichtag 31.12.(Y−1) — den jüngsten, der damals publiziert war. </w:t>
+        <w:t xml:space="preserve"> Eigene Roh-Reihe über 10 Banken × FY2021–FY2024 (255 quellenbelegte Zeilen, davon 253 modellfähig); ein Quartal im Jahr Y nutzt ausschließlich den Stichtag 31.12.(Y−1) - den jüngsten, der damals publiziert war. </w:t>
       </w:r>
       <w:r>
         <w:rPr>
@@ -8440,7 +8104,7 @@
         <w:pStyle w:val="Heading3"/>
       </w:pPr>
       <w:r>
-        <w:t>A-03 · EAD: EBA Transparency, post-CCF</w:t>
+        <w:t>A-03 - EAD: EBA Transparency, post-CCF</w:t>
       </w:r>
     </w:p>
     <w:p>
@@ -8493,7 +8157,7 @@
           <w:i w:val="0"/>
           <w:sz w:val="19"/>
         </w:rPr>
-        <w:t xml:space="preserve"> Original Exposure — überzeichnet nicht gezogene Kreditlinien. </w:t>
+        <w:t xml:space="preserve"> Original Exposure - überzeichnet nicht gezogene Kreditlinien. </w:t>
       </w:r>
       <w:r>
         <w:rPr>
@@ -8517,7 +8181,7 @@
         <w:pStyle w:val="Heading3"/>
       </w:pPr>
       <w:r>
-        <w:t>A-04 · 2-Faktor-Transmission (β/γ je Klasse)</w:t>
+        <w:t>A-04 - 2-Faktor-Transmission (β/γ je Klasse)</w:t>
       </w:r>
     </w:p>
     <w:p>
@@ -8586,7 +8250,7 @@
           <w:i w:val="0"/>
           <w:sz w:val="19"/>
         </w:rPr>
-        <w:t xml:space="preserve"> Die β sind der größte Unsicherheitsträger des Modells — deshalb Konfidenzklasse [estimate] und Sichtbarkeit als eigene Matrix; ein Fehler skaliert die Stress-Wirkung in etwa proportional.</w:t>
+        <w:t xml:space="preserve"> Die β sind der größte Unsicherheitsträger des Modells - deshalb Konfidenzklasse [estimate] und Sichtbarkeit als eigene Matrix; ein Fehler skaliert die Stress-Wirkung in etwa proportional.</w:t>
       </w:r>
     </w:p>
     <w:p>
@@ -8594,7 +8258,7 @@
         <w:pStyle w:val="Heading3"/>
       </w:pPr>
       <w:r>
-        <w:t>A-05 · IRB-Kapitalformel (Basel III / ASRF)</w:t>
+        <w:t>A-05 - IRB-Kapitalformel (Basel III / ASRF)</w:t>
       </w:r>
     </w:p>
     <w:p>
@@ -8647,7 +8311,7 @@
           <w:i w:val="0"/>
           <w:sz w:val="19"/>
         </w:rPr>
-        <w:t xml:space="preserve"> interne Portfoliomodelle (z. B. Migrationsmatrizen) — nicht gegen die CET1-Meldung abgleichbar. </w:t>
+        <w:t xml:space="preserve"> interne Portfoliomodelle (z. B. Migrationsmatrizen) - nicht gegen die CET1-Meldung abgleichbar. </w:t>
       </w:r>
       <w:r>
         <w:rPr>
@@ -8671,7 +8335,7 @@
         <w:pStyle w:val="Heading3"/>
       </w:pPr>
       <w:r>
-        <w:t>A-06 · Sovereign-Kanal (Duration-MtM, IFRS-9-Split)</w:t>
+        <w:t>A-06 - Sovereign-Kanal (Duration-MtM, IFRS-9-Split)</w:t>
       </w:r>
     </w:p>
     <w:p>
@@ -8708,7 +8372,7 @@
           <w:i w:val="0"/>
           <w:sz w:val="19"/>
         </w:rPr>
-        <w:t xml:space="preserve"> Das folgt der IFRS-9-Bewertungslogik — zu fortgeführten Anschaffungskosten (AC) gehaltene Bestände berühren die CET1-Quote laufend nicht. </w:t>
+        <w:t xml:space="preserve"> Das folgt der IFRS-9-Bewertungslogik - zu fortgeführten Anschaffungskosten (AC) gehaltene Bestände berühren die CET1-Quote laufend nicht. </w:t>
       </w:r>
       <w:r>
         <w:rPr>
@@ -8740,7 +8404,7 @@
           <w:i w:val="0"/>
           <w:sz w:val="19"/>
         </w:rPr>
-        <w:t xml:space="preserve"> Latente AC-Verluste bleiben unsichtbar — eine bewusste Untererfassung, die das Cockpit als separate Analyse ausweist (SVB-Lektion, Jiang et al. 2023).</w:t>
+        <w:t xml:space="preserve"> Latente AC-Verluste bleiben unsichtbar - eine bewusste Untererfassung, die das Cockpit als separate Analyse ausweist (SVB-Lektion, Jiang et al. 2023).</w:t>
       </w:r>
     </w:p>
     <w:p>
@@ -8748,7 +8412,7 @@
         <w:pStyle w:val="Heading3"/>
       </w:pPr>
       <w:r>
-        <w:t>A-07 · Kein Trading-Book-Kanal</w:t>
+        <w:t>A-07 - Kein Trading-Book-Kanal</w:t>
       </w:r>
     </w:p>
     <w:p>
@@ -8785,7 +8449,7 @@
           <w:i w:val="0"/>
           <w:sz w:val="19"/>
         </w:rPr>
-        <w:t xml:space="preserve"> Die Handelsbücher der zehn Banken sind relativ klein, und eine belastbare öffentliche FRTB-Kalibrierung existiert nicht — ein pauschaler Multiplikator wäre Scheingenauigkeit. </w:t>
+        <w:t xml:space="preserve"> Die Handelsbücher der zehn Banken sind relativ klein, und eine belastbare öffentliche FRTB-Kalibrierung existiert nicht - ein pauschaler Multiplikator wäre Scheingenauigkeit. </w:t>
       </w:r>
       <w:r>
         <w:rPr>
@@ -8825,7 +8489,7 @@
         <w:pStyle w:val="Heading3"/>
       </w:pPr>
       <w:r>
-        <w:t>A-08 · Universum: die 10 größten EU-IRB-Banken</w:t>
+        <w:t>A-08 - Universum: die 10 größten EU-IRB-Banken</w:t>
       </w:r>
     </w:p>
     <w:p>
@@ -8894,7 +8558,7 @@
           <w:i w:val="0"/>
           <w:sz w:val="19"/>
         </w:rPr>
-        <w:t xml:space="preserve"> Aussagen gelten für diese Gruppe — nicht für den gesamten EU-Bankenmarkt.</w:t>
+        <w:t xml:space="preserve"> Aussagen gelten für diese Gruppe - nicht für den gesamten EU-Bankenmarkt.</w:t>
       </w:r>
     </w:p>
     <w:p>
@@ -8902,7 +8566,7 @@
         <w:pStyle w:val="Heading3"/>
       </w:pPr>
       <w:r>
-        <w:t>A-09 · Klassen-Raster: 7 IRB-Klassen</w:t>
+        <w:t>A-09 - Klassen-Raster: 7 IRB-Klassen</w:t>
       </w:r>
     </w:p>
     <w:p>
@@ -8923,7 +8587,7 @@
           <w:i w:val="0"/>
           <w:sz w:val="19"/>
         </w:rPr>
-        <w:t xml:space="preserve"> corporate, sme_corporate, mortgage, qrre, other_retail, bank, sovereign — das EU-CR6-Raster. </w:t>
+        <w:t xml:space="preserve"> corporate, sme_corporate, mortgage, qrre, other_retail, bank, sovereign - das EU-CR6-Raster. </w:t>
       </w:r>
       <w:r>
         <w:rPr>
@@ -8955,7 +8619,7 @@
           <w:i w:val="0"/>
           <w:sz w:val="19"/>
         </w:rPr>
-        <w:t xml:space="preserve"> feinere Branchenraster (NACE) — öffentlich nicht flächendeckend verfügbar. </w:t>
+        <w:t xml:space="preserve"> feinere Branchenraster (NACE) - öffentlich nicht flächendeckend verfügbar. </w:t>
       </w:r>
       <w:r>
         <w:rPr>
@@ -8979,7 +8643,7 @@
         <w:pStyle w:val="Heading3"/>
       </w:pPr>
       <w:r>
-        <w:t>A-10 · Faktor-Unabhängigkeit (kein Kreuzterm)</w:t>
+        <w:t>A-10 - Faktor-Unabhängigkeit (kein Kreuzterm)</w:t>
       </w:r>
     </w:p>
     <w:p>
@@ -9032,7 +8696,7 @@
           <w:i w:val="0"/>
           <w:sz w:val="19"/>
         </w:rPr>
-        <w:t xml:space="preserve"> Copula- oder Interaktionsmodelle — ohne empirischen Träger nur zusätzliche Komplexität. </w:t>
+        <w:t xml:space="preserve"> Copula- oder Interaktionsmodelle - ohne empirischen Träger nur zusätzliche Komplexität. </w:t>
       </w:r>
       <w:r>
         <w:rPr>
@@ -9056,7 +8720,7 @@
         <w:pStyle w:val="Heading1"/>
       </w:pPr>
       <w:r>
-        <w:t>7 · Validierung: der CET1-Walk-Forward-Backtest</w:t>
+        <w:t>7. Validierung: CET1-Walk-Forward-Backtest</w:t>
       </w:r>
     </w:p>
     <w:p>
@@ -9085,7 +8749,7 @@
           <w:i w:val="0"/>
           <w:sz w:val="21"/>
         </w:rPr>
-        <w:t>: Für jedes Jahr wird das Portfolio mit den damals bekannten Pillar-3-Parametern des Vorjahres eingefroren, der tatsächlich eingetretene Öl-/Zins-Schock des Jahres eingespeist und die prognostizierte CET1-Quote mit der später gemeldeten verglichen — ohne jeden Blick in die Zukunft.</w:t>
+        <w:t>: Für jedes Jahr wird das Portfolio mit den damals bekannten Pillar-3-Parametern des Vorjahres eingefroren, der tatsächlich eingetretene Öl-/Zins-Schock des Jahres eingespeist und die prognostizierte CET1-Quote mit der später gemeldeten verglichen - ohne jeden Blick in die Zukunft.</w:t>
       </w:r>
     </w:p>
     <w:p>
@@ -9139,7 +8803,7 @@
           <w:color w:val="6E6E6E"/>
           <w:sz w:val="17"/>
         </w:rPr>
-        <w:t>Abb. 4 · No-Look-Ahead-Prinzip: einfrieren (31.12. des Vorjahres) → realen Schock einspeisen → gegen die gemeldete CET1-Quote halten → ein Jahr weiterrollen.</w:t>
+        <w:t>Abb. 4: No-Look-Ahead-Prinzip. Einfrieren (31.12. des Vorjahres) → realen Schock einspeisen → gegen die gemeldete CET1-Quote halten → ein Jahr weiterrollen.</w:t>
       </w:r>
     </w:p>
     <w:p>
@@ -9147,7 +8811,7 @@
         <w:pStyle w:val="Heading2"/>
       </w:pPr>
       <w:r>
-        <w:t>Ergebnis (30 Bank-Jahre, 2022–2024 — vollständiges Panel)</w:t>
+        <w:t>Ergebnis (30 Bank-Jahre, 2022-2024, vollständiges Panel)</w:t>
       </w:r>
     </w:p>
     <w:tbl>
@@ -9348,7 +9012,7 @@
                 <w:b w:val="0"/>
                 <w:sz w:val="18"/>
               </w:rPr>
-              <w:t>Prognose ≤ gemeldete Quote — das Modell irrt auf der sicheren Seite</w:t>
+              <w:t>Prognose ≤ gemeldete Quote - das Modell irrt auf der sicheren Seite</w:t>
             </w:r>
           </w:p>
         </w:tc>
@@ -9416,7 +9080,7 @@
           <w:i w:val="0"/>
           <w:sz w:val="19"/>
         </w:rPr>
-        <w:t>Alle 10 Banken sind in allen drei Backtest-Jahren vertreten (30 von 30 möglichen Bank-Jahren). Im Zinsschock-Jahr 2022 liegt das Modell bei allen 10 Banken auf der konservativen Seite (Ø -2,49 pp — der bewusst nicht angesetzte NII-Gegeneffekt); in den ruhigeren Jahren 2023/2024 beträgt der mittlere Fehler 0,48 bzw. 0,81 pp.</w:t>
+        <w:t>Alle 10 Banken sind in allen drei Backtest-Jahren vertreten (30 von 30 möglichen Bank-Jahren). Im Zinsschock-Jahr 2022 liegt das Modell bei allen 10 Banken auf der konservativen Seite (Ø -2,49 pp - der bewusst nicht angesetzte NII-Gegeneffekt); in den ruhigeren Jahren 2023/2024 beträgt der mittlere Fehler 0,48 bzw. 0,81 pp.</w:t>
       </w:r>
     </w:p>
     <w:p>
@@ -9716,7 +9380,7 @@
         <w:pStyle w:val="Heading2"/>
       </w:pPr>
       <w:r>
-        <w:t>Ehrliche Grenze: Point-in-Time vs. Through-the-Cycle</w:t>
+        <w:t>Einordnung: Point-in-Time vs. Through-the-Cycle</w:t>
       </w:r>
     </w:p>
     <w:p>
@@ -9745,7 +9409,7 @@
           <w:i w:val="0"/>
           <w:sz w:val="21"/>
         </w:rPr>
-        <w:t xml:space="preserve"> — und zwar aus einem dokumentierten Daten-Grund, nicht wegen eines Modellfehlers: Das Modell rechnet </w:t>
+        <w:t xml:space="preserve"> - und zwar aus einem dokumentierten Daten-Grund, nicht wegen eines Modellfehlers: Das Modell rechnet </w:t>
       </w:r>
       <w:r>
         <w:rPr>
@@ -9777,7 +9441,7 @@
           <w:i w:val="0"/>
           <w:sz w:val="21"/>
         </w:rPr>
-        <w:t xml:space="preserve"> — regulatorisch geglättet und antizyklisch (CRR Art. 180) sowie durch Portfoliosteuerung überlagert. Beleg 2022: Zins +2,8 pp → Modell-PD +0,5 pp, gemeldete PD −0,1 pp (ungewichteter Durchschnitt über Bank-Klassen-Paare; EAD-gewichtet +0,6 vs. −0,2 pp). Validiert ist das Modell deshalb als </w:t>
+        <w:t xml:space="preserve"> - regulatorisch geglättet und antizyklisch (CRR Art. 180) sowie durch Portfoliosteuerung überlagert. Beleg 2022: Zins +2,8 pp → Modell-PD +0,5 pp, gemeldete PD −0,1 pp (ungewichteter Durchschnitt über Bank-Klassen-Paare; EAD-gewichtet +0,6 vs. −0,2 pp). Validiert ist das Modell deshalb als </w:t>
       </w:r>
       <w:r>
         <w:rPr>
@@ -9793,7 +9457,7 @@
           <w:i w:val="0"/>
           <w:sz w:val="21"/>
         </w:rPr>
-        <w:t xml:space="preserve"> (im CET1-Niveau nah und auf der sicheren Seite) — nicht als Prognose einzelner Meldegrößen.</w:t>
+        <w:t xml:space="preserve"> (im CET1-Niveau nah und auf der sicheren Seite) - nicht als Prognose einzelner Meldegrößen.</w:t>
       </w:r>
     </w:p>
     <w:p>
@@ -9801,7 +9465,7 @@
         <w:pStyle w:val="Heading1"/>
       </w:pPr>
       <w:r>
-        <w:t>8 · Bewusste Scope-Grenzen</w:t>
+        <w:t>8. Bewusste Modellgrenzen</w:t>
       </w:r>
     </w:p>
     <w:p>
@@ -9814,7 +9478,7 @@
           <w:i w:val="0"/>
           <w:sz w:val="21"/>
         </w:rPr>
-        <w:t>Die Grenzen des Modells sind nicht nachträgliche Schwächen, sondern bewusst gesetzte Abgrenzungen gegen Scheingenauigkeit. Entscheidend ist jeweils, ob ein Effekt öffentlich, bankindividuell und konsistent über alle zehn Banken rekonstruierbar ist. Wo das nicht der Fall ist, wird der Effekt nicht modelliert oder nur als separate Analyse ausgewiesen.</w:t>
+        <w:t>Die Grenzen des Modells sind keine nachträglichen Einschränkungen, sondern klare Abgrenzungen gegen Scheingenauigkeit. Entscheidend ist jeweils, ob ein Effekt öffentlich, bankindividuell und konsistent über alle zehn Banken rekonstruierbar ist. Wo das nicht der Fall ist, wird der Effekt nicht modelliert oder nur als separate Analyse ausgewiesen.</w:t>
       </w:r>
     </w:p>
     <w:tbl>
@@ -10295,7 +9959,7 @@
         <w:pStyle w:val="Heading1"/>
       </w:pPr>
       <w:r>
-        <w:t>9 · Bibliographie</w:t>
+        <w:t>9. Bibliographie</w:t>
       </w:r>
     </w:p>
     <w:p>
@@ -10308,7 +9972,7 @@
           <w:i w:val="0"/>
           <w:sz w:val="21"/>
         </w:rPr>
-        <w:t>Vollständige Liste aller im Modell verwendeten Quellen — gegliedert nach Regulatorik, wissenschaftlicher Literatur und Datenquellen. Jede Quelle ist an der Stelle ihrer Verwendung im Dokument bzw. im Modell-Code referenziert.</w:t>
+        <w:t>Vollständige Liste aller im Modell verwendeten Quellen - gegliedert nach Regulatorik, wissenschaftlicher Literatur und Datenquellen. Jede Quelle ist an der Stelle ihrer Verwendung im Dokument bzw. im Modell-Code referenziert.</w:t>
       </w:r>
     </w:p>
     <w:p>
@@ -10352,7 +10016,7 @@
           <w:b w:val="0"/>
           <w:sz w:val="21"/>
         </w:rPr>
-        <w:t>EBA (2020). ITS/2020/04 — Implementing Technical Standards on public disclosures (EU-CR6-Template, Pillar-3-Datenbasis).</w:t>
+        <w:t>EBA (2020). ITS/2020/04 - Implementing Technical Standards on public disclosures (EU-CR6-Template, Pillar-3-Datenbasis).</w:t>
       </w:r>
     </w:p>
     <w:p>
@@ -10364,7 +10028,7 @@
           <w:b w:val="0"/>
           <w:sz w:val="21"/>
         </w:rPr>
-        <w:t>EBA (2024). 2025 EU-wide Stress Test — Methodological Note, §2.4.2 (sektorale Sensitivitäten als aufsichtlicher Projektionsansatz).</w:t>
+        <w:t>EBA (2024). 2025 EU-wide Stress Test - Methodological Note, §2.4.2 (sektorale Sensitivitäten als aufsichtlicher Projektionsansatz).</w:t>
       </w:r>
     </w:p>
     <w:p>
@@ -10376,7 +10040,7 @@
           <w:b w:val="0"/>
           <w:sz w:val="21"/>
         </w:rPr>
-        <w:t>EBA/ESRB (2025). 2025 EU-wide Stress Test — Macro-financial Scenario, §4.1.6 (adverse Zinspfade als Plausibilitätsanker).</w:t>
+        <w:t>EBA/ESRB (2025). 2025 EU-wide Stress Test - Macro-financial Scenario, §4.1.6 (adverse Zinspfade als Plausibilitätsanker).</w:t>
       </w:r>
     </w:p>
     <w:p>
@@ -10388,7 +10052,7 @@
           <w:b w:val="0"/>
           <w:sz w:val="21"/>
         </w:rPr>
-        <w:t>EBA (2025). 2025 EU-wide Stress Test — Results, Fig. 22 (relative Verlustquoten je Portfolio als Quervalidierung der β-Struktur).</w:t>
+        <w:t>EBA (2025). 2025 EU-wide Stress Test - Results, Fig. 22 (relative Verlustquoten je Portfolio als Quervalidierung der β-Struktur).</w:t>
       </w:r>
     </w:p>
     <w:p>
@@ -10424,7 +10088,7 @@
           <w:b w:val="0"/>
           <w:sz w:val="21"/>
         </w:rPr>
-        <w:t>Verordnung (EU) Nr. 575/2013 (CRR) — insb. Art. 153/154 (IRB-Risikogewichte), Art. 180/181 (PD-/LGD-Schätzung, TTC-Charakter), Art. 431–455 (Offenlegung).</w:t>
+        <w:t>Verordnung (EU) Nr. 575/2013 (CRR) - insb. Art. 153/154 (IRB-Risikogewichte), Art. 180/181 (PD-/LGD-Schätzung, TTC-Charakter), Art. 431–455 (Offenlegung).</w:t>
       </w:r>
     </w:p>
     <w:p>
@@ -10632,7 +10296,7 @@
           <w:b w:val="0"/>
           <w:sz w:val="21"/>
         </w:rPr>
-        <w:t>Pillar-3-Berichte (EU CR6) der zehn Banken, FY2021–FY2024 — Risikoparameter PD/LGD/EAD (je Zeile mit Seiten-/URL-Beleg).</w:t>
+        <w:t>Pillar-3-Berichte (EU CR6) der zehn Banken, FY2021–FY2024 - Risikoparameter PD/LGD/EAD (je Zeile mit Seiten-/URL-Beleg).</w:t>
       </w:r>
     </w:p>
     <w:p>
@@ -10644,7 +10308,7 @@
           <w:b w:val="0"/>
           <w:sz w:val="21"/>
         </w:rPr>
-        <w:t>EBA EU-wide Transparency Exercise (Vintages 2020–2025) — realisierte CET1- und RWA-Werte, IFRS-9-Split der Staatsanleihen.</w:t>
+        <w:t>EBA EU-wide Transparency Exercise (Vintages 2020–2025) - realisierte CET1- und RWA-Werte, IFRS-9-Split der Staatsanleihen.</w:t>
       </w:r>
     </w:p>
     <w:p>
@@ -10656,7 +10320,7 @@
           <w:b w:val="0"/>
           <w:sz w:val="21"/>
         </w:rPr>
-        <w:t>ICE Brent Crude (täglich) — Ölpreis-Faktor.</w:t>
+        <w:t>ICE Brent Crude (täglich) - Ölpreis-Faktor.</w:t>
       </w:r>
     </w:p>
     <w:p>
@@ -10668,7 +10332,7 @@
           <w:b w:val="0"/>
           <w:sz w:val="21"/>
         </w:rPr>
-        <w:t>Deutsche Bundesbank — täglich geschätzte Svensson-Parameter der Zinsstrukturkurve (10-Jahres-Zins-Faktor).</w:t>
+        <w:t>Deutsche Bundesbank - täglich geschätzte Svensson-Parameter der Zinsstrukturkurve (10-Jahres-Zins-Faktor).</w:t>
       </w:r>
     </w:p>
     <w:sectPr>
@@ -10695,7 +10359,7 @@
         <w:color w:val="6E6E6E"/>
         <w:sz w:val="16"/>
       </w:rPr>
-      <w:t xml:space="preserve">Modellannahmen · EU Banking Credit Stress Cockpit · Seite </w:t>
+      <w:t xml:space="preserve">Modellannahmen | EU Banking Credit Stress Cockpit | Seite </w:t>
     </w:r>
     <w:fldSimple w:instr="PAGE"/>
   </w:p>

</xml_diff>